<commit_message>
Compact Word resumes to fit 2 pages: smaller margins, 9pt body, tighter spacing
</commit_message>
<xml_diff>
--- a/Resume/Resume_Vladislav_Orekhov-Miller_EN.docx
+++ b/Resume/Resume_Vladislav_Orekhov-Miller_EN.docx
@@ -4,39 +4,41 @@
   <w:body>
     <w:p>
       <w:pPr>
-        <w:pStyle w:val="Title"/>
+        <w:spacing w:after="20" w:before="0"/>
         <w:jc w:val="center"/>
       </w:pPr>
       <w:r>
         <w:rPr>
           <w:rFonts w:ascii="Calibri" w:hAnsi="Calibri"/>
+          <w:b/>
           <w:color w:val="1F4E79"/>
+          <w:sz w:val="28"/>
         </w:rPr>
         <w:t>VLADISLAV OREKHOV-MILLER</w:t>
       </w:r>
     </w:p>
     <w:p>
       <w:pPr>
-        <w:spacing w:after="40"/>
+        <w:spacing w:after="20" w:before="0"/>
         <w:jc w:val="center"/>
       </w:pPr>
       <w:r>
         <w:rPr>
           <w:rFonts w:ascii="Calibri" w:hAnsi="Calibri"/>
-          <w:sz w:val="20"/>
+          <w:sz w:val="18"/>
         </w:rPr>
         <w:t>+7 (925) 472-90-54 | vladislav.miller2000@gmail.com | Moscow, Russia</w:t>
       </w:r>
     </w:p>
     <w:p>
       <w:pPr>
-        <w:spacing w:after="120"/>
+        <w:spacing w:after="40" w:before="0"/>
         <w:jc w:val="center"/>
       </w:pPr>
       <w:r>
         <w:rPr>
           <w:rFonts w:ascii="Calibri" w:hAnsi="Calibri"/>
-          <w:sz w:val="20"/>
+          <w:sz w:val="18"/>
         </w:rPr>
         <w:t xml:space="preserve">GitHub: </w:t>
       </w:r>
@@ -46,7 +48,7 @@
             <w:color w:val="0563C1"/>
             <w:u w:val="single"/>
             <w:rFonts w:ascii="Calibri" w:hAnsi="Calibri"/>
-            <w:sz w:val="22"/>
+            <w:sz w:val="18"/>
           </w:rPr>
           <w:t>github.com/vladislavmiller2000-bit/System-Analysis</w:t>
         </w:r>
@@ -54,88 +56,103 @@
     </w:p>
     <w:p>
       <w:pPr>
-        <w:pStyle w:val="Heading1"/>
+        <w:spacing w:before="120" w:after="40"/>
+        <w:pBdr>
+          <w:bottom w:val="single" w:sz="4" w:space="1" w:color="1F4E79"/>
+        </w:pBdr>
       </w:pPr>
       <w:r>
         <w:rPr>
           <w:rFonts w:ascii="Calibri" w:hAnsi="Calibri"/>
+          <w:b/>
           <w:color w:val="1F4E79"/>
+          <w:sz w:val="20"/>
         </w:rPr>
         <w:t>OBJECTIVE</w:t>
       </w:r>
     </w:p>
     <w:p>
       <w:pPr>
-        <w:spacing w:after="80" w:before="0"/>
+        <w:spacing w:after="20" w:before="0" w:line="220" w:lineRule="exact"/>
       </w:pPr>
       <w:r>
         <w:rPr>
           <w:rFonts w:ascii="Calibri" w:hAnsi="Calibri"/>
           <w:b/>
-          <w:sz w:val="20"/>
+          <w:sz w:val="18"/>
         </w:rPr>
         <w:t>Junior System Analyst / Junior Business Analyst</w:t>
       </w:r>
     </w:p>
     <w:p>
       <w:pPr>
-        <w:spacing w:after="80" w:before="0"/>
+        <w:spacing w:after="20" w:before="0" w:line="220" w:lineRule="exact"/>
       </w:pPr>
       <w:r>
         <w:rPr>
           <w:rFonts w:ascii="Calibri" w:hAnsi="Calibri"/>
           <w:b w:val="0"/>
-          <w:sz w:val="20"/>
+          <w:sz w:val="18"/>
         </w:rPr>
         <w:t>Seeking a system or business analyst position with opportunities for professional growth. Open to internships or entry-level roles with mentorship.</w:t>
       </w:r>
     </w:p>
     <w:p>
       <w:pPr>
-        <w:pStyle w:val="Heading1"/>
+        <w:spacing w:before="120" w:after="40"/>
+        <w:pBdr>
+          <w:bottom w:val="single" w:sz="4" w:space="1" w:color="1F4E79"/>
+        </w:pBdr>
       </w:pPr>
       <w:r>
         <w:rPr>
           <w:rFonts w:ascii="Calibri" w:hAnsi="Calibri"/>
+          <w:b/>
           <w:color w:val="1F4E79"/>
+          <w:sz w:val="20"/>
         </w:rPr>
         <w:t>SUMMARY</w:t>
       </w:r>
     </w:p>
     <w:p>
       <w:pPr>
-        <w:spacing w:after="80" w:before="0"/>
+        <w:spacing w:after="20" w:before="0" w:line="220" w:lineRule="exact"/>
       </w:pPr>
       <w:r>
         <w:rPr>
           <w:rFonts w:ascii="Calibri" w:hAnsi="Calibri"/>
           <w:b w:val="0"/>
-          <w:sz w:val="20"/>
+          <w:sz w:val="18"/>
         </w:rPr>
         <w:t>Systems analyst with hands-on experience in business process modeling, database design, and analytical SQL. Completed portfolio projects covering the full analyst workflow — from requirements gathering and diagramming (BPMN, UML, ERD) to data normalization and KPI analysis. Additional commercial experience with sales analytics, forecasting, and data visualization at Burger King and Knight Frank.</w:t>
       </w:r>
     </w:p>
     <w:p>
       <w:pPr>
-        <w:spacing w:after="80" w:before="0"/>
+        <w:spacing w:after="20" w:before="0" w:line="220" w:lineRule="exact"/>
       </w:pPr>
       <w:r>
         <w:rPr>
           <w:rFonts w:ascii="Calibri" w:hAnsi="Calibri"/>
           <w:b w:val="0"/>
-          <w:sz w:val="20"/>
+          <w:sz w:val="18"/>
         </w:rPr>
         <w:t>Fluent in Russian and English, experienced working in international teams across Israel and Russia. Structured thinker, results-oriented, quick to learn new domains.</w:t>
       </w:r>
     </w:p>
     <w:p>
       <w:pPr>
-        <w:pStyle w:val="Heading1"/>
+        <w:spacing w:before="120" w:after="40"/>
+        <w:pBdr>
+          <w:bottom w:val="single" w:sz="4" w:space="1" w:color="1F4E79"/>
+        </w:pBdr>
       </w:pPr>
       <w:r>
         <w:rPr>
           <w:rFonts w:ascii="Calibri" w:hAnsi="Calibri"/>
+          <w:b/>
           <w:color w:val="1F4E79"/>
+          <w:sz w:val="20"/>
         </w:rPr>
         <w:t>KEY SKILLS</w:t>
       </w:r>
@@ -147,20 +164,23 @@
         <w:tblLook w:firstColumn="1" w:firstRow="1" w:lastColumn="0" w:lastRow="0" w:noHBand="0" w:noVBand="1" w:val="04A0"/>
       </w:tblPr>
       <w:tblGrid>
-        <w:gridCol w:w="4986"/>
-        <w:gridCol w:w="4986"/>
+        <w:gridCol w:w="5270"/>
+        <w:gridCol w:w="5270"/>
       </w:tblGrid>
       <w:tr>
         <w:tc>
           <w:tcPr>
-            <w:tcW w:type="dxa" w:w="4986"/>
+            <w:tcW w:type="dxa" w:w="5270"/>
           </w:tcPr>
           <w:p>
+            <w:pPr>
+              <w:spacing w:after="0" w:before="0"/>
+            </w:pPr>
             <w:r>
               <w:rPr>
                 <w:rFonts w:ascii="Calibri" w:hAnsi="Calibri"/>
                 <w:b/>
-                <w:sz w:val="18"/>
+                <w:sz w:val="16"/>
               </w:rPr>
               <w:t>Area</w:t>
             </w:r>
@@ -168,14 +188,17 @@
         </w:tc>
         <w:tc>
           <w:tcPr>
-            <w:tcW w:type="dxa" w:w="4986"/>
+            <w:tcW w:type="dxa" w:w="5270"/>
           </w:tcPr>
           <w:p>
+            <w:pPr>
+              <w:spacing w:after="0" w:before="0"/>
+            </w:pPr>
             <w:r>
               <w:rPr>
                 <w:rFonts w:ascii="Calibri" w:hAnsi="Calibri"/>
                 <w:b/>
-                <w:sz w:val="18"/>
+                <w:sz w:val="16"/>
               </w:rPr>
               <w:t>Skills</w:t>
             </w:r>
@@ -185,13 +208,16 @@
       <w:tr>
         <w:tc>
           <w:tcPr>
-            <w:tcW w:type="dxa" w:w="4986"/>
+            <w:tcW w:type="dxa" w:w="5270"/>
           </w:tcPr>
           <w:p>
+            <w:pPr>
+              <w:spacing w:after="0" w:before="0"/>
+            </w:pPr>
             <w:r>
               <w:rPr>
                 <w:rFonts w:ascii="Calibri" w:hAnsi="Calibri"/>
-                <w:sz w:val="18"/>
+                <w:sz w:val="16"/>
               </w:rPr>
               <w:t>Analysis &amp; Modeling</w:t>
             </w:r>
@@ -199,13 +225,16 @@
         </w:tc>
         <w:tc>
           <w:tcPr>
-            <w:tcW w:type="dxa" w:w="4986"/>
+            <w:tcW w:type="dxa" w:w="5270"/>
           </w:tcPr>
           <w:p>
+            <w:pPr>
+              <w:spacing w:after="0" w:before="0"/>
+            </w:pPr>
             <w:r>
               <w:rPr>
                 <w:rFonts w:ascii="Calibri" w:hAnsi="Calibri"/>
-                <w:sz w:val="18"/>
+                <w:sz w:val="16"/>
               </w:rPr>
               <w:t>BPMN 2.0, UML (Use Case, State Machine, Activity), ERD (Chen, Crow's Foot)</w:t>
             </w:r>
@@ -215,13 +244,16 @@
       <w:tr>
         <w:tc>
           <w:tcPr>
-            <w:tcW w:type="dxa" w:w="4986"/>
+            <w:tcW w:type="dxa" w:w="5270"/>
           </w:tcPr>
           <w:p>
+            <w:pPr>
+              <w:spacing w:after="0" w:before="0"/>
+            </w:pPr>
             <w:r>
               <w:rPr>
                 <w:rFonts w:ascii="Calibri" w:hAnsi="Calibri"/>
-                <w:sz w:val="18"/>
+                <w:sz w:val="16"/>
               </w:rPr>
               <w:t>Data &amp; SQL</w:t>
             </w:r>
@@ -229,13 +261,16 @@
         </w:tc>
         <w:tc>
           <w:tcPr>
-            <w:tcW w:type="dxa" w:w="4986"/>
+            <w:tcW w:type="dxa" w:w="5270"/>
           </w:tcPr>
           <w:p>
+            <w:pPr>
+              <w:spacing w:after="0" w:before="0"/>
+            </w:pPr>
             <w:r>
               <w:rPr>
                 <w:rFonts w:ascii="Calibri" w:hAnsi="Calibri"/>
-                <w:sz w:val="18"/>
+                <w:sz w:val="16"/>
               </w:rPr>
               <w:t>SQL (JOIN, subqueries, CTEs, window functions, aggregation), normalization (1NF-3NF)</w:t>
             </w:r>
@@ -245,13 +280,16 @@
       <w:tr>
         <w:tc>
           <w:tcPr>
-            <w:tcW w:type="dxa" w:w="4986"/>
+            <w:tcW w:type="dxa" w:w="5270"/>
           </w:tcPr>
           <w:p>
+            <w:pPr>
+              <w:spacing w:after="0" w:before="0"/>
+            </w:pPr>
             <w:r>
               <w:rPr>
                 <w:rFonts w:ascii="Calibri" w:hAnsi="Calibri"/>
-                <w:sz w:val="18"/>
+                <w:sz w:val="16"/>
               </w:rPr>
               <w:t>Tools</w:t>
             </w:r>
@@ -259,13 +297,16 @@
         </w:tc>
         <w:tc>
           <w:tcPr>
-            <w:tcW w:type="dxa" w:w="4986"/>
+            <w:tcW w:type="dxa" w:w="5270"/>
           </w:tcPr>
           <w:p>
+            <w:pPr>
+              <w:spacing w:after="0" w:before="0"/>
+            </w:pPr>
             <w:r>
               <w:rPr>
                 <w:rFonts w:ascii="Calibri" w:hAnsi="Calibri"/>
-                <w:sz w:val="18"/>
+                <w:sz w:val="16"/>
               </w:rPr>
               <w:t>Power BI, MS Excel (pivot tables, formulas, charts), Miro, Draw.io, Figma</w:t>
             </w:r>
@@ -275,13 +316,16 @@
       <w:tr>
         <w:tc>
           <w:tcPr>
-            <w:tcW w:type="dxa" w:w="4986"/>
+            <w:tcW w:type="dxa" w:w="5270"/>
           </w:tcPr>
           <w:p>
+            <w:pPr>
+              <w:spacing w:after="0" w:before="0"/>
+            </w:pPr>
             <w:r>
               <w:rPr>
                 <w:rFonts w:ascii="Calibri" w:hAnsi="Calibri"/>
-                <w:sz w:val="18"/>
+                <w:sz w:val="16"/>
               </w:rPr>
               <w:t>Documentation</w:t>
             </w:r>
@@ -289,13 +333,16 @@
         </w:tc>
         <w:tc>
           <w:tcPr>
-            <w:tcW w:type="dxa" w:w="4986"/>
+            <w:tcW w:type="dxa" w:w="5270"/>
           </w:tcPr>
           <w:p>
+            <w:pPr>
+              <w:spacing w:after="0" w:before="0"/>
+            </w:pPr>
             <w:r>
               <w:rPr>
                 <w:rFonts w:ascii="Calibri" w:hAnsi="Calibri"/>
-                <w:sz w:val="18"/>
+                <w:sz w:val="16"/>
               </w:rPr>
               <w:t>Requirements gathering &amp; documentation, SRS, data dictionary, Use Case specifications</w:t>
             </w:r>
@@ -305,13 +352,16 @@
       <w:tr>
         <w:tc>
           <w:tcPr>
-            <w:tcW w:type="dxa" w:w="4986"/>
+            <w:tcW w:type="dxa" w:w="5270"/>
           </w:tcPr>
           <w:p>
+            <w:pPr>
+              <w:spacing w:after="0" w:before="0"/>
+            </w:pPr>
             <w:r>
               <w:rPr>
                 <w:rFonts w:ascii="Calibri" w:hAnsi="Calibri"/>
-                <w:sz w:val="18"/>
+                <w:sz w:val="16"/>
               </w:rPr>
               <w:t>Methodologies</w:t>
             </w:r>
@@ -319,13 +369,16 @@
         </w:tc>
         <w:tc>
           <w:tcPr>
-            <w:tcW w:type="dxa" w:w="4986"/>
+            <w:tcW w:type="dxa" w:w="5270"/>
           </w:tcPr>
           <w:p>
+            <w:pPr>
+              <w:spacing w:after="0" w:before="0"/>
+            </w:pPr>
             <w:r>
               <w:rPr>
                 <w:rFonts w:ascii="Calibri" w:hAnsi="Calibri"/>
-                <w:sz w:val="18"/>
+                <w:sz w:val="16"/>
               </w:rPr>
               <w:t>Agile/Scrum (fundamentals), Waterfall, AS-IS/TO-BE analysis</w:t>
             </w:r>
@@ -335,25 +388,30 @@
     </w:tbl>
     <w:p>
       <w:pPr>
-        <w:pStyle w:val="Heading1"/>
+        <w:spacing w:before="120" w:after="40"/>
+        <w:pBdr>
+          <w:bottom w:val="single" w:sz="4" w:space="1" w:color="1F4E79"/>
+        </w:pBdr>
       </w:pPr>
       <w:r>
         <w:rPr>
           <w:rFonts w:ascii="Calibri" w:hAnsi="Calibri"/>
+          <w:b/>
           <w:color w:val="1F4E79"/>
+          <w:sz w:val="20"/>
         </w:rPr>
         <w:t>PROJECTS &amp; PORTFOLIO</w:t>
       </w:r>
     </w:p>
     <w:p>
       <w:pPr>
-        <w:spacing w:after="80" w:before="0"/>
+        <w:spacing w:after="40" w:before="0" w:line="220" w:lineRule="exact"/>
       </w:pPr>
       <w:r>
         <w:rPr>
           <w:rFonts w:ascii="Calibri" w:hAnsi="Calibri"/>
           <w:b w:val="0"/>
-          <w:sz w:val="20"/>
+          <w:sz w:val="18"/>
         </w:rPr>
         <w:t xml:space="preserve">GitHub: </w:t>
       </w:r>
@@ -363,7 +421,7 @@
             <w:color w:val="0563C1"/>
             <w:u w:val="single"/>
             <w:rFonts w:ascii="Calibri" w:hAnsi="Calibri"/>
-            <w:sz w:val="22"/>
+            <w:sz w:val="18"/>
           </w:rPr>
           <w:t>github.com/vladislavmiller2000-bit/System-Analysis</w:t>
         </w:r>
@@ -371,13 +429,13 @@
     </w:p>
     <w:p>
       <w:pPr>
-        <w:spacing w:after="80" w:before="0"/>
+        <w:spacing w:after="20" w:before="40" w:line="220" w:lineRule="exact"/>
       </w:pPr>
       <w:r>
         <w:rPr>
           <w:rFonts w:ascii="Calibri" w:hAnsi="Calibri"/>
           <w:b/>
-          <w:sz w:val="20"/>
+          <w:sz w:val="18"/>
         </w:rPr>
         <w:t>Vita Clinic — Medical Clinic Business Process Analysis</w:t>
       </w:r>
@@ -385,12 +443,12 @@
     <w:p>
       <w:pPr>
         <w:pStyle w:val="ListBullet"/>
-        <w:spacing w:after="40" w:before="0"/>
+        <w:spacing w:after="10" w:before="0" w:line="220" w:lineRule="exact"/>
       </w:pPr>
       <w:r>
         <w:rPr>
           <w:rFonts w:ascii="Calibri" w:hAnsi="Calibri"/>
-          <w:sz w:val="20"/>
+          <w:sz w:val="18"/>
         </w:rPr>
         <w:t>Conducted AS-IS analysis of patient appointment workflow, identified 4 bottlenecks and proposed automation solutions</w:t>
       </w:r>
@@ -398,12 +456,12 @@
     <w:p>
       <w:pPr>
         <w:pStyle w:val="ListBullet"/>
-        <w:spacing w:after="40" w:before="0"/>
+        <w:spacing w:after="10" w:before="0" w:line="220" w:lineRule="exact"/>
       </w:pPr>
       <w:r>
         <w:rPr>
           <w:rFonts w:ascii="Calibri" w:hAnsi="Calibri"/>
-          <w:sz w:val="20"/>
+          <w:sz w:val="18"/>
         </w:rPr>
         <w:t>Designed TO-BE model — reduced processing chain from 5 to 2 steps</w:t>
       </w:r>
@@ -411,12 +469,12 @@
     <w:p>
       <w:pPr>
         <w:pStyle w:val="ListBullet"/>
-        <w:spacing w:after="40" w:before="0"/>
+        <w:spacing w:after="10" w:before="0" w:line="220" w:lineRule="exact"/>
       </w:pPr>
       <w:r>
         <w:rPr>
           <w:rFonts w:ascii="Calibri" w:hAnsi="Calibri"/>
-          <w:sz w:val="20"/>
+          <w:sz w:val="18"/>
         </w:rPr>
         <w:t>Created BPMN 2.0 diagrams (AS-IS and TO-BE) and UML State Machine for appointment lifecycle</w:t>
       </w:r>
@@ -424,12 +482,12 @@
     <w:p>
       <w:pPr>
         <w:pStyle w:val="ListBullet"/>
-        <w:spacing w:after="40" w:before="0"/>
+        <w:spacing w:after="10" w:before="0" w:line="220" w:lineRule="exact"/>
       </w:pPr>
       <w:r>
         <w:rPr>
           <w:rFonts w:ascii="Calibri" w:hAnsi="Calibri"/>
-          <w:sz w:val="20"/>
+          <w:sz w:val="18"/>
         </w:rPr>
         <w:t>Built interactive mobile app prototype (12 screens) in Figma</w:t>
       </w:r>
@@ -437,25 +495,25 @@
     <w:p>
       <w:pPr>
         <w:pStyle w:val="ListBullet"/>
-        <w:spacing w:after="40" w:before="0"/>
+        <w:spacing w:after="10" w:before="0" w:line="220" w:lineRule="exact"/>
       </w:pPr>
       <w:r>
         <w:rPr>
           <w:rFonts w:ascii="Calibri" w:hAnsi="Calibri"/>
-          <w:sz w:val="20"/>
+          <w:sz w:val="18"/>
         </w:rPr>
         <w:t>Defined 17 functional and 4 non-functional requirements, documented Use Case specification</w:t>
       </w:r>
     </w:p>
     <w:p>
       <w:pPr>
-        <w:spacing w:after="80" w:before="0"/>
+        <w:spacing w:after="20" w:before="40" w:line="220" w:lineRule="exact"/>
       </w:pPr>
       <w:r>
         <w:rPr>
           <w:rFonts w:ascii="Calibri" w:hAnsi="Calibri"/>
           <w:b/>
-          <w:sz w:val="20"/>
+          <w:sz w:val="18"/>
         </w:rPr>
         <w:t>Nakarabine — E-Commerce Database Design</w:t>
       </w:r>
@@ -463,12 +521,12 @@
     <w:p>
       <w:pPr>
         <w:pStyle w:val="ListBullet"/>
-        <w:spacing w:after="40" w:before="0"/>
+        <w:spacing w:after="10" w:before="0" w:line="220" w:lineRule="exact"/>
       </w:pPr>
       <w:r>
         <w:rPr>
           <w:rFonts w:ascii="Calibri" w:hAnsi="Calibri"/>
-          <w:sz w:val="20"/>
+          <w:sz w:val="18"/>
         </w:rPr>
         <w:t>Designed logical data model (PK, FK, UNIQUE, NOT NULL, CHECK constraints)</w:t>
       </w:r>
@@ -476,12 +534,12 @@
     <w:p>
       <w:pPr>
         <w:pStyle w:val="ListBullet"/>
-        <w:spacing w:after="40" w:before="0"/>
+        <w:spacing w:after="10" w:before="0" w:line="220" w:lineRule="exact"/>
       </w:pPr>
       <w:r>
         <w:rPr>
           <w:rFonts w:ascii="Calibri" w:hAnsi="Calibri"/>
-          <w:sz w:val="20"/>
+          <w:sz w:val="18"/>
         </w:rPr>
         <w:t>Built ERD in Chen and Crow's Foot notations, performed normalization (1NF through 3NF)</w:t>
       </w:r>
@@ -489,25 +547,25 @@
     <w:p>
       <w:pPr>
         <w:pStyle w:val="ListBullet"/>
-        <w:spacing w:after="40" w:before="0"/>
+        <w:spacing w:after="10" w:before="0" w:line="220" w:lineRule="exact"/>
       </w:pPr>
       <w:r>
         <w:rPr>
           <w:rFonts w:ascii="Calibri" w:hAnsi="Calibri"/>
-          <w:sz w:val="20"/>
+          <w:sz w:val="18"/>
         </w:rPr>
         <w:t>Developed data dictionary and terminology glossary for team alignment</w:t>
       </w:r>
     </w:p>
     <w:p>
       <w:pPr>
-        <w:spacing w:after="80" w:before="0"/>
+        <w:spacing w:after="20" w:before="40" w:line="220" w:lineRule="exact"/>
       </w:pPr>
       <w:r>
         <w:rPr>
           <w:rFonts w:ascii="Calibri" w:hAnsi="Calibri"/>
           <w:b/>
-          <w:sz w:val="20"/>
+          <w:sz w:val="18"/>
         </w:rPr>
         <w:t>Restaurant Sales Analysis — SQL Project</w:t>
       </w:r>
@@ -515,12 +573,12 @@
     <w:p>
       <w:pPr>
         <w:pStyle w:val="ListBullet"/>
-        <w:spacing w:after="40" w:before="0"/>
+        <w:spacing w:after="10" w:before="0" w:line="220" w:lineRule="exact"/>
       </w:pPr>
       <w:r>
         <w:rPr>
           <w:rFonts w:ascii="Calibri" w:hAnsi="Calibri"/>
-          <w:sz w:val="20"/>
+          <w:sz w:val="18"/>
         </w:rPr>
         <w:t>Designed relational schema (DDL) and populated with test data (50 orders, 20 menu items)</w:t>
       </w:r>
@@ -528,12 +586,12 @@
     <w:p>
       <w:pPr>
         <w:pStyle w:val="ListBullet"/>
-        <w:spacing w:after="40" w:before="0"/>
+        <w:spacing w:after="10" w:before="0" w:line="220" w:lineRule="exact"/>
       </w:pPr>
       <w:r>
         <w:rPr>
           <w:rFonts w:ascii="Calibri" w:hAnsi="Calibri"/>
-          <w:sz w:val="20"/>
+          <w:sz w:val="18"/>
         </w:rPr>
         <w:t>Wrote 20+ analytical queries: revenue by period, profit margins, menu ABC analysis</w:t>
       </w:r>
@@ -541,50 +599,55 @@
     <w:p>
       <w:pPr>
         <w:pStyle w:val="ListBullet"/>
-        <w:spacing w:after="40" w:before="0"/>
+        <w:spacing w:after="10" w:before="0" w:line="220" w:lineRule="exact"/>
       </w:pPr>
       <w:r>
         <w:rPr>
           <w:rFonts w:ascii="Calibri" w:hAnsi="Calibri"/>
-          <w:sz w:val="20"/>
+          <w:sz w:val="18"/>
         </w:rPr>
         <w:t>Applied JOIN, CTEs, window functions (LAG, RANK, ROW_NUMBER), subqueries, CASE expressions</w:t>
       </w:r>
     </w:p>
     <w:p>
       <w:pPr>
-        <w:pStyle w:val="Heading1"/>
+        <w:spacing w:before="120" w:after="40"/>
+        <w:pBdr>
+          <w:bottom w:val="single" w:sz="4" w:space="1" w:color="1F4E79"/>
+        </w:pBdr>
       </w:pPr>
       <w:r>
         <w:rPr>
           <w:rFonts w:ascii="Calibri" w:hAnsi="Calibri"/>
+          <w:b/>
           <w:color w:val="1F4E79"/>
+          <w:sz w:val="20"/>
         </w:rPr>
         <w:t>WORK EXPERIENCE</w:t>
       </w:r>
     </w:p>
     <w:p>
       <w:pPr>
-        <w:spacing w:after="80" w:before="0"/>
+        <w:spacing w:after="0" w:before="0" w:line="220" w:lineRule="exact"/>
       </w:pPr>
       <w:r>
         <w:rPr>
           <w:rFonts w:ascii="Calibri" w:hAnsi="Calibri"/>
           <w:b/>
-          <w:sz w:val="20"/>
+          <w:sz w:val="18"/>
         </w:rPr>
         <w:t>KFC Cinema City — Rishon LeTsiyon, Israel</w:t>
       </w:r>
     </w:p>
     <w:p>
       <w:pPr>
-        <w:spacing w:after="80" w:before="0"/>
+        <w:spacing w:after="20" w:before="0" w:line="220" w:lineRule="exact"/>
       </w:pPr>
       <w:r>
         <w:rPr>
           <w:rFonts w:ascii="Calibri" w:hAnsi="Calibri"/>
           <w:b w:val="0"/>
-          <w:sz w:val="20"/>
+          <w:sz w:val="18"/>
         </w:rPr>
         <w:t>Deputy Director | April 2024 – April 2025</w:t>
       </w:r>
@@ -592,12 +655,12 @@
     <w:p>
       <w:pPr>
         <w:pStyle w:val="ListBullet"/>
-        <w:spacing w:after="40" w:before="0"/>
+        <w:spacing w:after="10" w:before="0" w:line="220" w:lineRule="exact"/>
       </w:pPr>
       <w:r>
         <w:rPr>
           <w:rFonts w:ascii="Calibri" w:hAnsi="Calibri"/>
-          <w:sz w:val="20"/>
+          <w:sz w:val="18"/>
         </w:rPr>
         <w:t>Built daily analytics system (900+ receipts/day): identified lunch-peak underperformance, reallocated resources — 10% profit increase</w:t>
       </w:r>
@@ -605,12 +668,12 @@
     <w:p>
       <w:pPr>
         <w:pStyle w:val="ListBullet"/>
-        <w:spacing w:after="40" w:before="0"/>
+        <w:spacing w:after="10" w:before="0" w:line="220" w:lineRule="exact"/>
       </w:pPr>
       <w:r>
         <w:rPr>
           <w:rFonts w:ascii="Calibri" w:hAnsi="Calibri"/>
-          <w:sz w:val="20"/>
+          <w:sz w:val="18"/>
         </w:rPr>
         <w:t>Implemented data-driven inventory management — reduced supply costs by 15%</w:t>
       </w:r>
@@ -618,25 +681,25 @@
     <w:p>
       <w:pPr>
         <w:pStyle w:val="ListBullet"/>
-        <w:spacing w:after="40" w:before="0"/>
+        <w:spacing w:after="10" w:before="0" w:line="220" w:lineRule="exact"/>
       </w:pPr>
       <w:r>
         <w:rPr>
           <w:rFonts w:ascii="Calibri" w:hAnsi="Calibri"/>
-          <w:sz w:val="20"/>
+          <w:sz w:val="18"/>
         </w:rPr>
         <w:t>Coordinated 20+ employees, standardized operational procedures</w:t>
       </w:r>
     </w:p>
     <w:p>
       <w:pPr>
-        <w:spacing w:after="80" w:before="0"/>
+        <w:spacing w:after="20" w:before="40" w:line="220" w:lineRule="exact"/>
       </w:pPr>
       <w:r>
         <w:rPr>
           <w:rFonts w:ascii="Calibri" w:hAnsi="Calibri"/>
           <w:b w:val="0"/>
-          <w:sz w:val="20"/>
+          <w:sz w:val="18"/>
         </w:rPr>
         <w:t>Shift Manager | November 2023 – April 2024</w:t>
       </w:r>
@@ -644,38 +707,38 @@
     <w:p>
       <w:pPr>
         <w:pStyle w:val="ListBullet"/>
-        <w:spacing w:after="40" w:before="0"/>
+        <w:spacing w:after="10" w:before="0" w:line="220" w:lineRule="exact"/>
       </w:pPr>
       <w:r>
         <w:rPr>
           <w:rFonts w:ascii="Calibri" w:hAnsi="Calibri"/>
-          <w:sz w:val="20"/>
+          <w:sz w:val="18"/>
         </w:rPr>
         <w:t>Managed shift operations (15 employees): SLA control, quality metrics monitoring, incident resolution</w:t>
       </w:r>
     </w:p>
     <w:p>
       <w:pPr>
-        <w:spacing w:after="80" w:before="0"/>
+        <w:spacing w:after="0" w:before="60" w:line="220" w:lineRule="exact"/>
       </w:pPr>
       <w:r>
         <w:rPr>
           <w:rFonts w:ascii="Calibri" w:hAnsi="Calibri"/>
           <w:b/>
-          <w:sz w:val="20"/>
+          <w:sz w:val="18"/>
         </w:rPr>
         <w:t>Intern — Burger King Corporation, Moscow</w:t>
       </w:r>
     </w:p>
     <w:p>
       <w:pPr>
-        <w:spacing w:after="80" w:before="0"/>
+        <w:spacing w:after="20" w:before="0" w:line="220" w:lineRule="exact"/>
       </w:pPr>
       <w:r>
         <w:rPr>
           <w:rFonts w:ascii="Calibri" w:hAnsi="Calibri"/>
           <w:b w:val="0"/>
-          <w:sz w:val="20"/>
+          <w:sz w:val="18"/>
         </w:rPr>
         <w:t>Marketing Research Department | Summer 2022</w:t>
       </w:r>
@@ -683,12 +746,12 @@
     <w:p>
       <w:pPr>
         <w:pStyle w:val="ListBullet"/>
-        <w:spacing w:after="40" w:before="0"/>
+        <w:spacing w:after="10" w:before="0" w:line="220" w:lineRule="exact"/>
       </w:pPr>
       <w:r>
         <w:rPr>
           <w:rFonts w:ascii="Calibri" w:hAnsi="Calibri"/>
-          <w:sz w:val="20"/>
+          <w:sz w:val="18"/>
         </w:rPr>
         <w:t>Built sales analytics dashboards for 50+ restaurants in Excel</w:t>
       </w:r>
@@ -696,12 +759,12 @@
     <w:p>
       <w:pPr>
         <w:pStyle w:val="ListBullet"/>
-        <w:spacing w:after="40" w:before="0"/>
+        <w:spacing w:after="10" w:before="0" w:line="220" w:lineRule="exact"/>
       </w:pPr>
       <w:r>
         <w:rPr>
           <w:rFonts w:ascii="Calibri" w:hAnsi="Calibri"/>
-          <w:sz w:val="20"/>
+          <w:sz w:val="18"/>
         </w:rPr>
         <w:t>Automated categorization of 10,000+ receipts — identified 5 growth opportunities for regional managers</w:t>
       </w:r>
@@ -709,25 +772,25 @@
     <w:p>
       <w:pPr>
         <w:pStyle w:val="ListBullet"/>
-        <w:spacing w:after="40" w:before="0"/>
+        <w:spacing w:after="10" w:before="0" w:line="220" w:lineRule="exact"/>
       </w:pPr>
       <w:r>
         <w:rPr>
           <w:rFonts w:ascii="Calibri" w:hAnsi="Calibri"/>
-          <w:sz w:val="20"/>
+          <w:sz w:val="18"/>
         </w:rPr>
         <w:t>Prepared KPI visualizations for weekly management presentations</w:t>
       </w:r>
     </w:p>
     <w:p>
       <w:pPr>
-        <w:spacing w:after="80" w:before="0"/>
+        <w:spacing w:after="20" w:before="40" w:line="220" w:lineRule="exact"/>
       </w:pPr>
       <w:r>
         <w:rPr>
           <w:rFonts w:ascii="Calibri" w:hAnsi="Calibri"/>
           <w:b w:val="0"/>
-          <w:sz w:val="20"/>
+          <w:sz w:val="18"/>
         </w:rPr>
         <w:t>Business Analytics Department | Summer 2019</w:t>
       </w:r>
@@ -735,12 +798,12 @@
     <w:p>
       <w:pPr>
         <w:pStyle w:val="ListBullet"/>
-        <w:spacing w:after="40" w:before="0"/>
+        <w:spacing w:after="10" w:before="0" w:line="220" w:lineRule="exact"/>
       </w:pPr>
       <w:r>
         <w:rPr>
           <w:rFonts w:ascii="Calibri" w:hAnsi="Calibri"/>
-          <w:sz w:val="20"/>
+          <w:sz w:val="18"/>
         </w:rPr>
         <w:t>Collected and structured financial data from multiple sources, prepared pivot tables for quarterly reports</w:t>
       </w:r>
@@ -748,38 +811,38 @@
     <w:p>
       <w:pPr>
         <w:pStyle w:val="ListBullet"/>
-        <w:spacing w:after="40" w:before="0"/>
+        <w:spacing w:after="10" w:before="0" w:line="220" w:lineRule="exact"/>
       </w:pPr>
       <w:r>
         <w:rPr>
           <w:rFonts w:ascii="Calibri" w:hAnsi="Calibri"/>
-          <w:sz w:val="20"/>
+          <w:sz w:val="18"/>
         </w:rPr>
         <w:t>Assisted in building sales forecast models based on historical data</w:t>
       </w:r>
     </w:p>
     <w:p>
       <w:pPr>
-        <w:spacing w:after="80" w:before="0"/>
+        <w:spacing w:after="0" w:before="60" w:line="220" w:lineRule="exact"/>
       </w:pPr>
       <w:r>
         <w:rPr>
           <w:rFonts w:ascii="Calibri" w:hAnsi="Calibri"/>
           <w:b/>
-          <w:sz w:val="20"/>
+          <w:sz w:val="18"/>
         </w:rPr>
         <w:t>Intern — Knight Frank, Moscow</w:t>
       </w:r>
     </w:p>
     <w:p>
       <w:pPr>
-        <w:spacing w:after="80" w:before="0"/>
+        <w:spacing w:after="20" w:before="0" w:line="220" w:lineRule="exact"/>
       </w:pPr>
       <w:r>
         <w:rPr>
           <w:rFonts w:ascii="Calibri" w:hAnsi="Calibri"/>
           <w:b w:val="0"/>
-          <w:sz w:val="20"/>
+          <w:sz w:val="18"/>
         </w:rPr>
         <w:t>Residential Real Estate Marketing Department | Spring 2022</w:t>
       </w:r>
@@ -787,12 +850,12 @@
     <w:p>
       <w:pPr>
         <w:pStyle w:val="ListBullet"/>
-        <w:spacing w:after="40" w:before="0"/>
+        <w:spacing w:after="10" w:before="0" w:line="220" w:lineRule="exact"/>
       </w:pPr>
       <w:r>
         <w:rPr>
           <w:rFonts w:ascii="Calibri" w:hAnsi="Calibri"/>
-          <w:sz w:val="20"/>
+          <w:sz w:val="18"/>
         </w:rPr>
         <w:t>Conducted competitive analysis of 30+ premium residential properties — prepared comparative report</w:t>
       </w:r>
@@ -800,120 +863,135 @@
     <w:p>
       <w:pPr>
         <w:pStyle w:val="ListBullet"/>
-        <w:spacing w:after="40" w:before="0"/>
+        <w:spacing w:after="10" w:before="0" w:line="220" w:lineRule="exact"/>
       </w:pPr>
       <w:r>
         <w:rPr>
           <w:rFonts w:ascii="Calibri" w:hAnsi="Calibri"/>
-          <w:sz w:val="20"/>
+          <w:sz w:val="18"/>
         </w:rPr>
         <w:t>Participated in property valuation using comparative approach</w:t>
       </w:r>
     </w:p>
     <w:p>
       <w:pPr>
-        <w:pStyle w:val="Heading1"/>
+        <w:spacing w:before="120" w:after="40"/>
+        <w:pBdr>
+          <w:bottom w:val="single" w:sz="4" w:space="1" w:color="1F4E79"/>
+        </w:pBdr>
       </w:pPr>
       <w:r>
         <w:rPr>
           <w:rFonts w:ascii="Calibri" w:hAnsi="Calibri"/>
+          <w:b/>
           <w:color w:val="1F4E79"/>
+          <w:sz w:val="20"/>
         </w:rPr>
         <w:t>EDUCATION</w:t>
       </w:r>
     </w:p>
     <w:p>
       <w:pPr>
-        <w:spacing w:after="80" w:before="0"/>
+        <w:spacing w:after="0" w:before="0" w:line="220" w:lineRule="exact"/>
       </w:pPr>
       <w:r>
         <w:rPr>
           <w:rFonts w:ascii="Calibri" w:hAnsi="Calibri"/>
           <w:b/>
-          <w:sz w:val="20"/>
+          <w:sz w:val="18"/>
         </w:rPr>
         <w:t>Financial University under the Government of the Russian Federation, Moscow | 2018 – 2022</w:t>
       </w:r>
     </w:p>
     <w:p>
       <w:pPr>
-        <w:spacing w:after="80" w:before="0"/>
+        <w:spacing w:after="20" w:before="0" w:line="220" w:lineRule="exact"/>
       </w:pPr>
       <w:r>
         <w:rPr>
           <w:rFonts w:ascii="Calibri" w:hAnsi="Calibri"/>
           <w:b w:val="0"/>
-          <w:sz w:val="20"/>
+          <w:sz w:val="18"/>
         </w:rPr>
         <w:t>Bachelor of Economics, International Finance</w:t>
       </w:r>
     </w:p>
     <w:p>
       <w:pPr>
-        <w:pStyle w:val="Heading1"/>
+        <w:spacing w:before="120" w:after="40"/>
+        <w:pBdr>
+          <w:bottom w:val="single" w:sz="4" w:space="1" w:color="1F4E79"/>
+        </w:pBdr>
       </w:pPr>
       <w:r>
         <w:rPr>
           <w:rFonts w:ascii="Calibri" w:hAnsi="Calibri"/>
+          <w:b/>
           <w:color w:val="1F4E79"/>
+          <w:sz w:val="20"/>
         </w:rPr>
         <w:t>PROFESSIONAL DEVELOPMENT</w:t>
       </w:r>
     </w:p>
     <w:p>
       <w:pPr>
-        <w:spacing w:after="80" w:before="0"/>
+        <w:spacing w:after="0" w:before="0" w:line="220" w:lineRule="exact"/>
       </w:pPr>
       <w:r>
         <w:rPr>
           <w:rFonts w:ascii="Calibri" w:hAnsi="Calibri"/>
           <w:b/>
-          <w:sz w:val="20"/>
+          <w:sz w:val="18"/>
         </w:rPr>
         <w:t>Yandex Practicum — Systems Analyst | 2025 – 2026</w:t>
       </w:r>
     </w:p>
     <w:p>
       <w:pPr>
-        <w:spacing w:after="80" w:before="0"/>
+        <w:spacing w:after="20" w:before="0" w:line="220" w:lineRule="exact"/>
       </w:pPr>
       <w:r>
         <w:rPr>
           <w:rFonts w:ascii="Calibri" w:hAnsi="Calibri"/>
           <w:b w:val="0"/>
-          <w:sz w:val="20"/>
+          <w:sz w:val="18"/>
         </w:rPr>
         <w:t>Requirements analysis, UML, BPMN, data modeling, SQL, Power BI, collaboration with development and QA teams.</w:t>
       </w:r>
     </w:p>
     <w:p>
       <w:pPr>
-        <w:pStyle w:val="Heading1"/>
+        <w:spacing w:before="120" w:after="40"/>
+        <w:pBdr>
+          <w:bottom w:val="single" w:sz="4" w:space="1" w:color="1F4E79"/>
+        </w:pBdr>
       </w:pPr>
       <w:r>
         <w:rPr>
           <w:rFonts w:ascii="Calibri" w:hAnsi="Calibri"/>
+          <w:b/>
           <w:color w:val="1F4E79"/>
+          <w:sz w:val="20"/>
         </w:rPr>
         <w:t>LANGUAGES</w:t>
       </w:r>
     </w:p>
     <w:p>
       <w:pPr>
-        <w:spacing w:after="80" w:before="0"/>
+        <w:spacing w:after="20" w:before="0" w:line="220" w:lineRule="exact"/>
       </w:pPr>
       <w:r>
         <w:rPr>
           <w:rFonts w:ascii="Calibri" w:hAnsi="Calibri"/>
           <w:b w:val="0"/>
-          <w:sz w:val="20"/>
+          <w:sz w:val="18"/>
         </w:rPr>
         <w:t>Russian (native) | English (fluent) | Spanish (basic) | Hebrew (basic)</w:t>
       </w:r>
     </w:p>
     <w:sectPr>
       <w:pgSz w:w="12240" w:h="15840"/>
-      <w:pgMar w:top="850" w:right="1134" w:bottom="850" w:left="1134" w:header="720" w:footer="720" w:gutter="0"/>
+      <w:pgMar w:top="567" w:right="850" w:bottom="567" w:left="850" w:header="720" w:footer="720" w:gutter="0"/>
       <w:cols w:space="720"/>
       <w:docGrid w:linePitch="360"/>
     </w:sectPr>
@@ -1284,9 +1362,12 @@
     <w:name w:val="Normal"/>
     <w:qFormat/>
     <w:rsid w:val="00FC693F"/>
+    <w:pPr>
+      <w:spacing w:after="20" w:before="0"/>
+    </w:pPr>
     <w:rPr>
       <w:rFonts w:ascii="Calibri" w:hAnsi="Calibri"/>
-      <w:sz w:val="20"/>
+      <w:sz w:val="18"/>
     </w:rPr>
   </w:style>
   <w:style w:type="paragraph" w:styleId="Header">

</xml_diff>

<commit_message>
Redesign Word resumes: beautiful formatting within 2 pages, full content restored
</commit_message>
<xml_diff>
--- a/Resume/Resume_Vladislav_Orekhov-Miller_EN.docx
+++ b/Resume/Resume_Vladislav_Orekhov-Miller_EN.docx
@@ -4,7 +4,7 @@
   <w:body>
     <w:p>
       <w:pPr>
-        <w:spacing w:after="20" w:before="0"/>
+        <w:spacing w:after="40" w:before="0"/>
         <w:jc w:val="center"/>
       </w:pPr>
       <w:r>
@@ -19,7 +19,7 @@
     </w:p>
     <w:p>
       <w:pPr>
-        <w:spacing w:after="20" w:before="0"/>
+        <w:spacing w:after="20"/>
         <w:jc w:val="center"/>
       </w:pPr>
       <w:r>
@@ -32,7 +32,7 @@
     </w:p>
     <w:p>
       <w:pPr>
-        <w:spacing w:after="40" w:before="0"/>
+        <w:spacing w:after="0"/>
         <w:jc w:val="center"/>
       </w:pPr>
       <w:r>
@@ -56,9 +56,9 @@
     </w:p>
     <w:p>
       <w:pPr>
-        <w:spacing w:before="120" w:after="40"/>
+        <w:spacing w:before="160" w:after="80" w:line="240" w:lineRule="exact"/>
         <w:pBdr>
-          <w:bottom w:val="single" w:sz="4" w:space="1" w:color="1F4E79"/>
+          <w:bottom w:val="single" w:sz="6" w:space="1" w:color="1F4E79"/>
         </w:pBdr>
       </w:pPr>
       <w:r>
@@ -66,14 +66,14 @@
           <w:rFonts w:ascii="Calibri" w:hAnsi="Calibri"/>
           <w:b/>
           <w:color w:val="1F4E79"/>
-          <w:sz w:val="20"/>
+          <w:sz w:val="21"/>
         </w:rPr>
         <w:t>OBJECTIVE</w:t>
       </w:r>
     </w:p>
     <w:p>
       <w:pPr>
-        <w:spacing w:after="20" w:before="0" w:line="220" w:lineRule="exact"/>
+        <w:spacing w:after="20" w:before="0" w:line="230" w:lineRule="exact"/>
       </w:pPr>
       <w:r>
         <w:rPr>
@@ -86,7 +86,7 @@
     </w:p>
     <w:p>
       <w:pPr>
-        <w:spacing w:after="20" w:before="0" w:line="220" w:lineRule="exact"/>
+        <w:spacing w:after="40" w:before="0" w:line="230" w:lineRule="exact"/>
       </w:pPr>
       <w:r>
         <w:rPr>
@@ -99,9 +99,9 @@
     </w:p>
     <w:p>
       <w:pPr>
-        <w:spacing w:before="120" w:after="40"/>
+        <w:spacing w:before="160" w:after="80" w:line="240" w:lineRule="exact"/>
         <w:pBdr>
-          <w:bottom w:val="single" w:sz="4" w:space="1" w:color="1F4E79"/>
+          <w:bottom w:val="single" w:sz="6" w:space="1" w:color="1F4E79"/>
         </w:pBdr>
       </w:pPr>
       <w:r>
@@ -109,14 +109,14 @@
           <w:rFonts w:ascii="Calibri" w:hAnsi="Calibri"/>
           <w:b/>
           <w:color w:val="1F4E79"/>
-          <w:sz w:val="20"/>
+          <w:sz w:val="21"/>
         </w:rPr>
         <w:t>SUMMARY</w:t>
       </w:r>
     </w:p>
     <w:p>
       <w:pPr>
-        <w:spacing w:after="20" w:before="0" w:line="220" w:lineRule="exact"/>
+        <w:spacing w:after="40" w:before="0" w:line="230" w:lineRule="exact"/>
       </w:pPr>
       <w:r>
         <w:rPr>
@@ -129,7 +129,7 @@
     </w:p>
     <w:p>
       <w:pPr>
-        <w:spacing w:after="20" w:before="0" w:line="220" w:lineRule="exact"/>
+        <w:spacing w:after="40" w:before="0" w:line="230" w:lineRule="exact"/>
       </w:pPr>
       <w:r>
         <w:rPr>
@@ -142,9 +142,9 @@
     </w:p>
     <w:p>
       <w:pPr>
-        <w:spacing w:before="120" w:after="40"/>
+        <w:spacing w:before="160" w:after="80" w:line="240" w:lineRule="exact"/>
         <w:pBdr>
-          <w:bottom w:val="single" w:sz="4" w:space="1" w:color="1F4E79"/>
+          <w:bottom w:val="single" w:sz="6" w:space="1" w:color="1F4E79"/>
         </w:pBdr>
       </w:pPr>
       <w:r>
@@ -152,7 +152,7 @@
           <w:rFonts w:ascii="Calibri" w:hAnsi="Calibri"/>
           <w:b/>
           <w:color w:val="1F4E79"/>
-          <w:sz w:val="20"/>
+          <w:sz w:val="21"/>
         </w:rPr>
         <w:t>KEY SKILLS</w:t>
       </w:r>
@@ -174,13 +174,13 @@
           </w:tcPr>
           <w:p>
             <w:pPr>
-              <w:spacing w:after="0" w:before="0"/>
+              <w:spacing w:after="20" w:before="20"/>
             </w:pPr>
             <w:r>
               <w:rPr>
                 <w:rFonts w:ascii="Calibri" w:hAnsi="Calibri"/>
                 <w:b/>
-                <w:sz w:val="16"/>
+                <w:sz w:val="17"/>
               </w:rPr>
               <w:t>Area</w:t>
             </w:r>
@@ -192,13 +192,13 @@
           </w:tcPr>
           <w:p>
             <w:pPr>
-              <w:spacing w:after="0" w:before="0"/>
+              <w:spacing w:after="20" w:before="20"/>
             </w:pPr>
             <w:r>
               <w:rPr>
                 <w:rFonts w:ascii="Calibri" w:hAnsi="Calibri"/>
                 <w:b/>
-                <w:sz w:val="16"/>
+                <w:sz w:val="17"/>
               </w:rPr>
               <w:t>Skills</w:t>
             </w:r>
@@ -212,12 +212,12 @@
           </w:tcPr>
           <w:p>
             <w:pPr>
-              <w:spacing w:after="0" w:before="0"/>
+              <w:spacing w:after="20" w:before="20"/>
             </w:pPr>
             <w:r>
               <w:rPr>
                 <w:rFonts w:ascii="Calibri" w:hAnsi="Calibri"/>
-                <w:sz w:val="16"/>
+                <w:sz w:val="17"/>
               </w:rPr>
               <w:t>Analysis &amp; Modeling</w:t>
             </w:r>
@@ -229,12 +229,12 @@
           </w:tcPr>
           <w:p>
             <w:pPr>
-              <w:spacing w:after="0" w:before="0"/>
+              <w:spacing w:after="20" w:before="20"/>
             </w:pPr>
             <w:r>
               <w:rPr>
                 <w:rFonts w:ascii="Calibri" w:hAnsi="Calibri"/>
-                <w:sz w:val="16"/>
+                <w:sz w:val="17"/>
               </w:rPr>
               <w:t>BPMN 2.0, UML (Use Case, State Machine, Activity), ERD (Chen, Crow's Foot)</w:t>
             </w:r>
@@ -248,12 +248,12 @@
           </w:tcPr>
           <w:p>
             <w:pPr>
-              <w:spacing w:after="0" w:before="0"/>
+              <w:spacing w:after="20" w:before="20"/>
             </w:pPr>
             <w:r>
               <w:rPr>
                 <w:rFonts w:ascii="Calibri" w:hAnsi="Calibri"/>
-                <w:sz w:val="16"/>
+                <w:sz w:val="17"/>
               </w:rPr>
               <w:t>Data &amp; SQL</w:t>
             </w:r>
@@ -265,12 +265,12 @@
           </w:tcPr>
           <w:p>
             <w:pPr>
-              <w:spacing w:after="0" w:before="0"/>
+              <w:spacing w:after="20" w:before="20"/>
             </w:pPr>
             <w:r>
               <w:rPr>
                 <w:rFonts w:ascii="Calibri" w:hAnsi="Calibri"/>
-                <w:sz w:val="16"/>
+                <w:sz w:val="17"/>
               </w:rPr>
               <w:t>SQL (JOIN, subqueries, CTEs, window functions, aggregation), normalization (1NF-3NF)</w:t>
             </w:r>
@@ -284,12 +284,12 @@
           </w:tcPr>
           <w:p>
             <w:pPr>
-              <w:spacing w:after="0" w:before="0"/>
+              <w:spacing w:after="20" w:before="20"/>
             </w:pPr>
             <w:r>
               <w:rPr>
                 <w:rFonts w:ascii="Calibri" w:hAnsi="Calibri"/>
-                <w:sz w:val="16"/>
+                <w:sz w:val="17"/>
               </w:rPr>
               <w:t>Tools</w:t>
             </w:r>
@@ -301,12 +301,12 @@
           </w:tcPr>
           <w:p>
             <w:pPr>
-              <w:spacing w:after="0" w:before="0"/>
+              <w:spacing w:after="20" w:before="20"/>
             </w:pPr>
             <w:r>
               <w:rPr>
                 <w:rFonts w:ascii="Calibri" w:hAnsi="Calibri"/>
-                <w:sz w:val="16"/>
+                <w:sz w:val="17"/>
               </w:rPr>
               <w:t>Power BI, MS Excel (pivot tables, formulas, charts), Miro, Draw.io, Figma</w:t>
             </w:r>
@@ -320,12 +320,12 @@
           </w:tcPr>
           <w:p>
             <w:pPr>
-              <w:spacing w:after="0" w:before="0"/>
+              <w:spacing w:after="20" w:before="20"/>
             </w:pPr>
             <w:r>
               <w:rPr>
                 <w:rFonts w:ascii="Calibri" w:hAnsi="Calibri"/>
-                <w:sz w:val="16"/>
+                <w:sz w:val="17"/>
               </w:rPr>
               <w:t>Documentation</w:t>
             </w:r>
@@ -337,14 +337,14 @@
           </w:tcPr>
           <w:p>
             <w:pPr>
-              <w:spacing w:after="0" w:before="0"/>
+              <w:spacing w:after="20" w:before="20"/>
             </w:pPr>
             <w:r>
               <w:rPr>
                 <w:rFonts w:ascii="Calibri" w:hAnsi="Calibri"/>
-                <w:sz w:val="16"/>
+                <w:sz w:val="17"/>
               </w:rPr>
-              <w:t>Requirements gathering &amp; documentation, SRS, data dictionary, Use Case specifications</w:t>
+              <w:t>Requirements gathering &amp; documentation, SRS, data dictionary, Use Case specs</w:t>
             </w:r>
           </w:p>
         </w:tc>
@@ -356,12 +356,12 @@
           </w:tcPr>
           <w:p>
             <w:pPr>
-              <w:spacing w:after="0" w:before="0"/>
+              <w:spacing w:after="20" w:before="20"/>
             </w:pPr>
             <w:r>
               <w:rPr>
                 <w:rFonts w:ascii="Calibri" w:hAnsi="Calibri"/>
-                <w:sz w:val="16"/>
+                <w:sz w:val="17"/>
               </w:rPr>
               <w:t>Methodologies</w:t>
             </w:r>
@@ -373,12 +373,12 @@
           </w:tcPr>
           <w:p>
             <w:pPr>
-              <w:spacing w:after="0" w:before="0"/>
+              <w:spacing w:after="20" w:before="20"/>
             </w:pPr>
             <w:r>
               <w:rPr>
                 <w:rFonts w:ascii="Calibri" w:hAnsi="Calibri"/>
-                <w:sz w:val="16"/>
+                <w:sz w:val="17"/>
               </w:rPr>
               <w:t>Agile/Scrum (fundamentals), Waterfall, AS-IS/TO-BE analysis</w:t>
             </w:r>
@@ -388,9 +388,9 @@
     </w:tbl>
     <w:p>
       <w:pPr>
-        <w:spacing w:before="120" w:after="40"/>
+        <w:spacing w:before="160" w:after="80" w:line="240" w:lineRule="exact"/>
         <w:pBdr>
-          <w:bottom w:val="single" w:sz="4" w:space="1" w:color="1F4E79"/>
+          <w:bottom w:val="single" w:sz="6" w:space="1" w:color="1F4E79"/>
         </w:pBdr>
       </w:pPr>
       <w:r>
@@ -398,14 +398,14 @@
           <w:rFonts w:ascii="Calibri" w:hAnsi="Calibri"/>
           <w:b/>
           <w:color w:val="1F4E79"/>
-          <w:sz w:val="20"/>
+          <w:sz w:val="21"/>
         </w:rPr>
         <w:t>PROJECTS &amp; PORTFOLIO</w:t>
       </w:r>
     </w:p>
     <w:p>
       <w:pPr>
-        <w:spacing w:after="40" w:before="0" w:line="220" w:lineRule="exact"/>
+        <w:spacing w:after="40" w:before="0" w:line="230" w:lineRule="exact"/>
       </w:pPr>
       <w:r>
         <w:rPr>
@@ -429,13 +429,13 @@
     </w:p>
     <w:p>
       <w:pPr>
-        <w:spacing w:after="20" w:before="40" w:line="220" w:lineRule="exact"/>
+        <w:spacing w:after="40" w:before="120" w:line="230" w:lineRule="exact"/>
       </w:pPr>
       <w:r>
         <w:rPr>
           <w:rFonts w:ascii="Calibri" w:hAnsi="Calibri"/>
           <w:b/>
-          <w:sz w:val="18"/>
+          <w:sz w:val="19"/>
         </w:rPr>
         <w:t>Vita Clinic — Medical Clinic Business Process Analysis</w:t>
       </w:r>
@@ -443,33 +443,33 @@
     <w:p>
       <w:pPr>
         <w:pStyle w:val="ListBullet"/>
-        <w:spacing w:after="10" w:before="0" w:line="220" w:lineRule="exact"/>
+        <w:spacing w:after="20" w:before="0" w:line="230" w:lineRule="exact"/>
       </w:pPr>
       <w:r>
         <w:rPr>
           <w:rFonts w:ascii="Calibri" w:hAnsi="Calibri"/>
           <w:sz w:val="18"/>
         </w:rPr>
-        <w:t>Conducted AS-IS analysis of patient appointment workflow, identified 4 bottlenecks and proposed automation solutions</w:t>
+        <w:t>Conducted AS-IS analysis of patient appointment workflow, identified 4 bottlenecks (data duplication, manual routing, missing validation, receptionist dependency) and proposed solutions based on automation best practices</w:t>
       </w:r>
     </w:p>
     <w:p>
       <w:pPr>
         <w:pStyle w:val="ListBullet"/>
-        <w:spacing w:after="10" w:before="0" w:line="220" w:lineRule="exact"/>
+        <w:spacing w:after="20" w:before="0" w:line="230" w:lineRule="exact"/>
       </w:pPr>
       <w:r>
         <w:rPr>
           <w:rFonts w:ascii="Calibri" w:hAnsi="Calibri"/>
           <w:sz w:val="18"/>
         </w:rPr>
-        <w:t>Designed TO-BE model — reduced processing chain from 5 to 2 steps</w:t>
+        <w:t>Designed TO-BE model with automated scheduling — reduced processing chain from 5 to 2 steps by eliminating manual receptionist stage and accelerating initial data processing</w:t>
       </w:r>
     </w:p>
     <w:p>
       <w:pPr>
         <w:pStyle w:val="ListBullet"/>
-        <w:spacing w:after="10" w:before="0" w:line="220" w:lineRule="exact"/>
+        <w:spacing w:after="20" w:before="0" w:line="230" w:lineRule="exact"/>
       </w:pPr>
       <w:r>
         <w:rPr>
@@ -482,20 +482,20 @@
     <w:p>
       <w:pPr>
         <w:pStyle w:val="ListBullet"/>
-        <w:spacing w:after="10" w:before="0" w:line="220" w:lineRule="exact"/>
+        <w:spacing w:after="20" w:before="0" w:line="230" w:lineRule="exact"/>
       </w:pPr>
       <w:r>
         <w:rPr>
           <w:rFonts w:ascii="Calibri" w:hAnsi="Calibri"/>
           <w:sz w:val="18"/>
         </w:rPr>
-        <w:t>Built interactive mobile app prototype (12 screens) in Figma</w:t>
+        <w:t>Built interactive mobile app prototype (12 screens) in Figma, designed user journey from authorization to appointment confirmation</w:t>
       </w:r>
     </w:p>
     <w:p>
       <w:pPr>
         <w:pStyle w:val="ListBullet"/>
-        <w:spacing w:after="10" w:before="0" w:line="220" w:lineRule="exact"/>
+        <w:spacing w:after="20" w:before="0" w:line="230" w:lineRule="exact"/>
       </w:pPr>
       <w:r>
         <w:rPr>
@@ -507,13 +507,13 @@
     </w:p>
     <w:p>
       <w:pPr>
-        <w:spacing w:after="20" w:before="40" w:line="220" w:lineRule="exact"/>
+        <w:spacing w:after="40" w:before="120" w:line="230" w:lineRule="exact"/>
       </w:pPr>
       <w:r>
         <w:rPr>
           <w:rFonts w:ascii="Calibri" w:hAnsi="Calibri"/>
           <w:b/>
-          <w:sz w:val="18"/>
+          <w:sz w:val="19"/>
         </w:rPr>
         <w:t>Nakarabine — E-Commerce Database Design</w:t>
       </w:r>
@@ -521,51 +521,51 @@
     <w:p>
       <w:pPr>
         <w:pStyle w:val="ListBullet"/>
-        <w:spacing w:after="10" w:before="0" w:line="220" w:lineRule="exact"/>
+        <w:spacing w:after="20" w:before="0" w:line="230" w:lineRule="exact"/>
       </w:pPr>
       <w:r>
         <w:rPr>
           <w:rFonts w:ascii="Calibri" w:hAnsi="Calibri"/>
           <w:sz w:val="18"/>
         </w:rPr>
-        <w:t>Designed logical data model (PK, FK, UNIQUE, NOT NULL, CHECK constraints)</w:t>
+        <w:t>Designed logical data model (PK, FK, UNIQUE, NOT NULL, CHECK constraints), defined relationship cardinalities and ensured referential integrity</w:t>
       </w:r>
     </w:p>
     <w:p>
       <w:pPr>
         <w:pStyle w:val="ListBullet"/>
-        <w:spacing w:after="10" w:before="0" w:line="220" w:lineRule="exact"/>
+        <w:spacing w:after="20" w:before="0" w:line="230" w:lineRule="exact"/>
       </w:pPr>
       <w:r>
         <w:rPr>
           <w:rFonts w:ascii="Calibri" w:hAnsi="Calibri"/>
           <w:sz w:val="18"/>
         </w:rPr>
-        <w:t>Built ERD in Chen and Crow's Foot notations, performed normalization (1NF through 3NF)</w:t>
+        <w:t>Built ERD diagrams in Chen and Crow's Foot notations, performed normalization (1NF through 3NF)</w:t>
       </w:r>
     </w:p>
     <w:p>
       <w:pPr>
         <w:pStyle w:val="ListBullet"/>
-        <w:spacing w:after="10" w:before="0" w:line="220" w:lineRule="exact"/>
+        <w:spacing w:after="20" w:before="0" w:line="230" w:lineRule="exact"/>
       </w:pPr>
       <w:r>
         <w:rPr>
           <w:rFonts w:ascii="Calibri" w:hAnsi="Calibri"/>
           <w:sz w:val="18"/>
         </w:rPr>
-        <w:t>Developed data dictionary and terminology glossary for team alignment</w:t>
+        <w:t>Developed data dictionary and terminology glossary for team alignment: attribute descriptions, data types, business rules, allowed values</w:t>
       </w:r>
     </w:p>
     <w:p>
       <w:pPr>
-        <w:spacing w:after="20" w:before="40" w:line="220" w:lineRule="exact"/>
+        <w:spacing w:after="40" w:before="120" w:line="230" w:lineRule="exact"/>
       </w:pPr>
       <w:r>
         <w:rPr>
           <w:rFonts w:ascii="Calibri" w:hAnsi="Calibri"/>
           <w:b/>
-          <w:sz w:val="18"/>
+          <w:sz w:val="19"/>
         </w:rPr>
         <w:t>Restaurant Sales Analysis — SQL Project</w:t>
       </w:r>
@@ -573,20 +573,20 @@
     <w:p>
       <w:pPr>
         <w:pStyle w:val="ListBullet"/>
-        <w:spacing w:after="10" w:before="0" w:line="220" w:lineRule="exact"/>
+        <w:spacing w:after="20" w:before="0" w:line="230" w:lineRule="exact"/>
       </w:pPr>
       <w:r>
         <w:rPr>
           <w:rFonts w:ascii="Calibri" w:hAnsi="Calibri"/>
           <w:sz w:val="18"/>
         </w:rPr>
-        <w:t>Designed relational schema (DDL) and populated with test data (50 orders, 20 menu items)</w:t>
+        <w:t>Designed relational schema (DDL: CREATE TABLE, PRIMARY KEY, FOREIGN KEY, constraints) and populated with test data (50 orders, 20 menu items)</w:t>
       </w:r>
     </w:p>
     <w:p>
       <w:pPr>
         <w:pStyle w:val="ListBullet"/>
-        <w:spacing w:after="10" w:before="0" w:line="220" w:lineRule="exact"/>
+        <w:spacing w:after="20" w:before="0" w:line="230" w:lineRule="exact"/>
       </w:pPr>
       <w:r>
         <w:rPr>
@@ -599,7 +599,7 @@
     <w:p>
       <w:pPr>
         <w:pStyle w:val="ListBullet"/>
-        <w:spacing w:after="10" w:before="0" w:line="220" w:lineRule="exact"/>
+        <w:spacing w:after="20" w:before="0" w:line="230" w:lineRule="exact"/>
       </w:pPr>
       <w:r>
         <w:rPr>
@@ -611,9 +611,9 @@
     </w:p>
     <w:p>
       <w:pPr>
-        <w:spacing w:before="120" w:after="40"/>
+        <w:spacing w:before="160" w:after="80" w:line="240" w:lineRule="exact"/>
         <w:pBdr>
-          <w:bottom w:val="single" w:sz="4" w:space="1" w:color="1F4E79"/>
+          <w:bottom w:val="single" w:sz="6" w:space="1" w:color="1F4E79"/>
         </w:pBdr>
       </w:pPr>
       <w:r>
@@ -621,27 +621,27 @@
           <w:rFonts w:ascii="Calibri" w:hAnsi="Calibri"/>
           <w:b/>
           <w:color w:val="1F4E79"/>
-          <w:sz w:val="20"/>
+          <w:sz w:val="21"/>
         </w:rPr>
         <w:t>WORK EXPERIENCE</w:t>
       </w:r>
     </w:p>
     <w:p>
       <w:pPr>
-        <w:spacing w:after="0" w:before="0" w:line="220" w:lineRule="exact"/>
+        <w:spacing w:after="40" w:before="120" w:line="230" w:lineRule="exact"/>
       </w:pPr>
       <w:r>
         <w:rPr>
           <w:rFonts w:ascii="Calibri" w:hAnsi="Calibri"/>
           <w:b/>
-          <w:sz w:val="18"/>
+          <w:sz w:val="19"/>
         </w:rPr>
         <w:t>KFC Cinema City — Rishon LeTsiyon, Israel</w:t>
       </w:r>
     </w:p>
     <w:p>
       <w:pPr>
-        <w:spacing w:after="20" w:before="0" w:line="220" w:lineRule="exact"/>
+        <w:spacing w:after="40" w:before="0" w:line="230" w:lineRule="exact"/>
       </w:pPr>
       <w:r>
         <w:rPr>
@@ -655,45 +655,45 @@
     <w:p>
       <w:pPr>
         <w:pStyle w:val="ListBullet"/>
-        <w:spacing w:after="10" w:before="0" w:line="220" w:lineRule="exact"/>
+        <w:spacing w:after="20" w:before="0" w:line="230" w:lineRule="exact"/>
       </w:pPr>
       <w:r>
         <w:rPr>
           <w:rFonts w:ascii="Calibri" w:hAnsi="Calibri"/>
           <w:sz w:val="18"/>
         </w:rPr>
-        <w:t>Built daily analytics system (900+ receipts/day): identified lunch-peak underperformance, reallocated resources — 10% profit increase</w:t>
+        <w:t>Built daily analytics system for the restaurant (900+ receipts/day): tracked revenue, average check, hourly load, output — identified lunch-peak underperformance, reallocated resources, contributing to 10% profit increase</w:t>
       </w:r>
     </w:p>
     <w:p>
       <w:pPr>
         <w:pStyle w:val="ListBullet"/>
-        <w:spacing w:after="10" w:before="0" w:line="220" w:lineRule="exact"/>
+        <w:spacing w:after="20" w:before="0" w:line="230" w:lineRule="exact"/>
       </w:pPr>
       <w:r>
         <w:rPr>
           <w:rFonts w:ascii="Calibri" w:hAnsi="Calibri"/>
           <w:sz w:val="18"/>
         </w:rPr>
-        <w:t>Implemented data-driven inventory management — reduced supply costs by 15%</w:t>
+        <w:t>Implemented data-driven inventory management: analyzed consumption by category, adjusted procurement volumes — reduced supply costs by 15%</w:t>
       </w:r>
     </w:p>
     <w:p>
       <w:pPr>
         <w:pStyle w:val="ListBullet"/>
-        <w:spacing w:after="10" w:before="0" w:line="220" w:lineRule="exact"/>
+        <w:spacing w:after="20" w:before="0" w:line="230" w:lineRule="exact"/>
       </w:pPr>
       <w:r>
         <w:rPr>
           <w:rFonts w:ascii="Calibri" w:hAnsi="Calibri"/>
           <w:sz w:val="18"/>
         </w:rPr>
-        <w:t>Coordinated 20+ employees, standardized operational procedures</w:t>
+        <w:t>Coordinated a team of 20+ employees, standardized operational procedures and developed quality control checklists</w:t>
       </w:r>
     </w:p>
     <w:p>
       <w:pPr>
-        <w:spacing w:after="20" w:before="40" w:line="220" w:lineRule="exact"/>
+        <w:spacing w:after="40" w:before="0" w:line="230" w:lineRule="exact"/>
       </w:pPr>
       <w:r>
         <w:rPr>
@@ -707,32 +707,32 @@
     <w:p>
       <w:pPr>
         <w:pStyle w:val="ListBullet"/>
-        <w:spacing w:after="10" w:before="0" w:line="220" w:lineRule="exact"/>
+        <w:spacing w:after="20" w:before="0" w:line="230" w:lineRule="exact"/>
       </w:pPr>
       <w:r>
         <w:rPr>
           <w:rFonts w:ascii="Calibri" w:hAnsi="Calibri"/>
           <w:sz w:val="18"/>
         </w:rPr>
-        <w:t>Managed shift operations (15 employees): SLA control, quality metrics monitoring, incident resolution</w:t>
+        <w:t>Managed shift operations (15 employees): SLA control for service speed, quality metrics monitoring, real-time incident resolution</w:t>
       </w:r>
     </w:p>
     <w:p>
       <w:pPr>
-        <w:spacing w:after="0" w:before="60" w:line="220" w:lineRule="exact"/>
+        <w:spacing w:after="40" w:before="120" w:line="230" w:lineRule="exact"/>
       </w:pPr>
       <w:r>
         <w:rPr>
           <w:rFonts w:ascii="Calibri" w:hAnsi="Calibri"/>
           <w:b/>
-          <w:sz w:val="18"/>
+          <w:sz w:val="19"/>
         </w:rPr>
         <w:t>Intern — Burger King Corporation, Moscow</w:t>
       </w:r>
     </w:p>
     <w:p>
       <w:pPr>
-        <w:spacing w:after="20" w:before="0" w:line="220" w:lineRule="exact"/>
+        <w:spacing w:after="40" w:before="0" w:line="230" w:lineRule="exact"/>
       </w:pPr>
       <w:r>
         <w:rPr>
@@ -746,45 +746,45 @@
     <w:p>
       <w:pPr>
         <w:pStyle w:val="ListBullet"/>
-        <w:spacing w:after="10" w:before="0" w:line="220" w:lineRule="exact"/>
+        <w:spacing w:after="20" w:before="0" w:line="230" w:lineRule="exact"/>
       </w:pPr>
       <w:r>
         <w:rPr>
           <w:rFonts w:ascii="Calibri" w:hAnsi="Calibri"/>
           <w:sz w:val="18"/>
         </w:rPr>
-        <w:t>Built sales analytics dashboards for 50+ restaurants in Excel</w:t>
+        <w:t>Built sales analytics dashboards for 50+ restaurants in Excel (pivot tables, INDEX/MATCH, conditional formatting)</w:t>
       </w:r>
     </w:p>
     <w:p>
       <w:pPr>
         <w:pStyle w:val="ListBullet"/>
-        <w:spacing w:after="10" w:before="0" w:line="220" w:lineRule="exact"/>
+        <w:spacing w:after="20" w:before="0" w:line="230" w:lineRule="exact"/>
       </w:pPr>
       <w:r>
         <w:rPr>
           <w:rFonts w:ascii="Calibri" w:hAnsi="Calibri"/>
           <w:sz w:val="18"/>
         </w:rPr>
-        <w:t>Automated categorization of 10,000+ receipts — identified 5 growth opportunities for regional managers</w:t>
+        <w:t>Automated categorization of 10,000+ receipts and compiled restaurant revenue rankings — identified 5 growth opportunities for regional managers</w:t>
       </w:r>
     </w:p>
     <w:p>
       <w:pPr>
         <w:pStyle w:val="ListBullet"/>
-        <w:spacing w:after="10" w:before="0" w:line="220" w:lineRule="exact"/>
+        <w:spacing w:after="20" w:before="0" w:line="230" w:lineRule="exact"/>
       </w:pPr>
       <w:r>
         <w:rPr>
           <w:rFonts w:ascii="Calibri" w:hAnsi="Calibri"/>
           <w:sz w:val="18"/>
         </w:rPr>
-        <w:t>Prepared KPI visualizations for weekly management presentations</w:t>
+        <w:t>Prepared KPI visualizations (conversion, average check, trends) for weekly management presentations</w:t>
       </w:r>
     </w:p>
     <w:p>
       <w:pPr>
-        <w:spacing w:after="20" w:before="40" w:line="220" w:lineRule="exact"/>
+        <w:spacing w:after="40" w:before="0" w:line="230" w:lineRule="exact"/>
       </w:pPr>
       <w:r>
         <w:rPr>
@@ -798,7 +798,7 @@
     <w:p>
       <w:pPr>
         <w:pStyle w:val="ListBullet"/>
-        <w:spacing w:after="10" w:before="0" w:line="220" w:lineRule="exact"/>
+        <w:spacing w:after="20" w:before="0" w:line="230" w:lineRule="exact"/>
       </w:pPr>
       <w:r>
         <w:rPr>
@@ -811,7 +811,7 @@
     <w:p>
       <w:pPr>
         <w:pStyle w:val="ListBullet"/>
-        <w:spacing w:after="10" w:before="0" w:line="220" w:lineRule="exact"/>
+        <w:spacing w:after="20" w:before="0" w:line="230" w:lineRule="exact"/>
       </w:pPr>
       <w:r>
         <w:rPr>
@@ -823,20 +823,20 @@
     </w:p>
     <w:p>
       <w:pPr>
-        <w:spacing w:after="0" w:before="60" w:line="220" w:lineRule="exact"/>
+        <w:spacing w:after="40" w:before="120" w:line="230" w:lineRule="exact"/>
       </w:pPr>
       <w:r>
         <w:rPr>
           <w:rFonts w:ascii="Calibri" w:hAnsi="Calibri"/>
           <w:b/>
-          <w:sz w:val="18"/>
+          <w:sz w:val="19"/>
         </w:rPr>
         <w:t>Intern — Knight Frank, Moscow</w:t>
       </w:r>
     </w:p>
     <w:p>
       <w:pPr>
-        <w:spacing w:after="20" w:before="0" w:line="220" w:lineRule="exact"/>
+        <w:spacing w:after="40" w:before="0" w:line="230" w:lineRule="exact"/>
       </w:pPr>
       <w:r>
         <w:rPr>
@@ -850,34 +850,34 @@
     <w:p>
       <w:pPr>
         <w:pStyle w:val="ListBullet"/>
-        <w:spacing w:after="10" w:before="0" w:line="220" w:lineRule="exact"/>
+        <w:spacing w:after="20" w:before="0" w:line="230" w:lineRule="exact"/>
       </w:pPr>
       <w:r>
         <w:rPr>
           <w:rFonts w:ascii="Calibri" w:hAnsi="Calibri"/>
           <w:sz w:val="18"/>
         </w:rPr>
-        <w:t>Conducted competitive analysis of 30+ premium residential properties — prepared comparative report</w:t>
+        <w:t>Conducted competitive analysis of 30+ premium residential properties: price per m², location, infrastructure — prepared comparative report for investment decision-making</w:t>
       </w:r>
     </w:p>
     <w:p>
       <w:pPr>
         <w:pStyle w:val="ListBullet"/>
-        <w:spacing w:after="10" w:before="0" w:line="220" w:lineRule="exact"/>
+        <w:spacing w:after="20" w:before="0" w:line="230" w:lineRule="exact"/>
       </w:pPr>
       <w:r>
         <w:rPr>
           <w:rFonts w:ascii="Calibri" w:hAnsi="Calibri"/>
           <w:sz w:val="18"/>
         </w:rPr>
-        <w:t>Participated in property valuation using comparative approach</w:t>
+        <w:t>Participated in property valuation using comparative approach, prepared analytical briefs for the international office</w:t>
       </w:r>
     </w:p>
     <w:p>
       <w:pPr>
-        <w:spacing w:before="120" w:after="40"/>
+        <w:spacing w:before="160" w:after="80" w:line="240" w:lineRule="exact"/>
         <w:pBdr>
-          <w:bottom w:val="single" w:sz="4" w:space="1" w:color="1F4E79"/>
+          <w:bottom w:val="single" w:sz="6" w:space="1" w:color="1F4E79"/>
         </w:pBdr>
       </w:pPr>
       <w:r>
@@ -885,14 +885,14 @@
           <w:rFonts w:ascii="Calibri" w:hAnsi="Calibri"/>
           <w:b/>
           <w:color w:val="1F4E79"/>
-          <w:sz w:val="20"/>
+          <w:sz w:val="21"/>
         </w:rPr>
         <w:t>EDUCATION</w:t>
       </w:r>
     </w:p>
     <w:p>
       <w:pPr>
-        <w:spacing w:after="0" w:before="0" w:line="220" w:lineRule="exact"/>
+        <w:spacing w:after="20" w:before="0" w:line="230" w:lineRule="exact"/>
       </w:pPr>
       <w:r>
         <w:rPr>
@@ -905,7 +905,7 @@
     </w:p>
     <w:p>
       <w:pPr>
-        <w:spacing w:after="20" w:before="0" w:line="220" w:lineRule="exact"/>
+        <w:spacing w:after="40" w:before="0" w:line="230" w:lineRule="exact"/>
       </w:pPr>
       <w:r>
         <w:rPr>
@@ -918,9 +918,9 @@
     </w:p>
     <w:p>
       <w:pPr>
-        <w:spacing w:before="120" w:after="40"/>
+        <w:spacing w:before="160" w:after="80" w:line="240" w:lineRule="exact"/>
         <w:pBdr>
-          <w:bottom w:val="single" w:sz="4" w:space="1" w:color="1F4E79"/>
+          <w:bottom w:val="single" w:sz="6" w:space="1" w:color="1F4E79"/>
         </w:pBdr>
       </w:pPr>
       <w:r>
@@ -928,14 +928,14 @@
           <w:rFonts w:ascii="Calibri" w:hAnsi="Calibri"/>
           <w:b/>
           <w:color w:val="1F4E79"/>
-          <w:sz w:val="20"/>
+          <w:sz w:val="21"/>
         </w:rPr>
         <w:t>PROFESSIONAL DEVELOPMENT</w:t>
       </w:r>
     </w:p>
     <w:p>
       <w:pPr>
-        <w:spacing w:after="0" w:before="0" w:line="220" w:lineRule="exact"/>
+        <w:spacing w:after="20" w:before="0" w:line="230" w:lineRule="exact"/>
       </w:pPr>
       <w:r>
         <w:rPr>
@@ -948,7 +948,7 @@
     </w:p>
     <w:p>
       <w:pPr>
-        <w:spacing w:after="20" w:before="0" w:line="220" w:lineRule="exact"/>
+        <w:spacing w:after="40" w:before="0" w:line="230" w:lineRule="exact"/>
       </w:pPr>
       <w:r>
         <w:rPr>
@@ -961,9 +961,9 @@
     </w:p>
     <w:p>
       <w:pPr>
-        <w:spacing w:before="120" w:after="40"/>
+        <w:spacing w:before="160" w:after="80" w:line="240" w:lineRule="exact"/>
         <w:pBdr>
-          <w:bottom w:val="single" w:sz="4" w:space="1" w:color="1F4E79"/>
+          <w:bottom w:val="single" w:sz="6" w:space="1" w:color="1F4E79"/>
         </w:pBdr>
       </w:pPr>
       <w:r>
@@ -971,14 +971,14 @@
           <w:rFonts w:ascii="Calibri" w:hAnsi="Calibri"/>
           <w:b/>
           <w:color w:val="1F4E79"/>
-          <w:sz w:val="20"/>
+          <w:sz w:val="21"/>
         </w:rPr>
         <w:t>LANGUAGES</w:t>
       </w:r>
     </w:p>
     <w:p>
       <w:pPr>
-        <w:spacing w:after="20" w:before="0" w:line="220" w:lineRule="exact"/>
+        <w:spacing w:after="40" w:before="0" w:line="230" w:lineRule="exact"/>
       </w:pPr>
       <w:r>
         <w:rPr>
@@ -991,7 +991,7 @@
     </w:p>
     <w:sectPr>
       <w:pgSz w:w="12240" w:h="15840"/>
-      <w:pgMar w:top="567" w:right="850" w:bottom="567" w:left="850" w:header="720" w:footer="720" w:gutter="0"/>
+      <w:pgMar w:top="680" w:right="850" w:bottom="567" w:left="850" w:header="720" w:footer="720" w:gutter="0"/>
       <w:cols w:space="720"/>
       <w:docGrid w:linePitch="360"/>
     </w:sectPr>
@@ -1363,7 +1363,7 @@
     <w:qFormat/>
     <w:rsid w:val="00FC693F"/>
     <w:pPr>
-      <w:spacing w:after="20" w:before="0"/>
+      <w:spacing w:after="0" w:before="0"/>
     </w:pPr>
     <w:rPr>
       <w:rFonts w:ascii="Calibri" w:hAnsi="Calibri"/>

</xml_diff>

<commit_message>
Update education to Touro University NY, add Senior Honors Project diploma
</commit_message>
<xml_diff>
--- a/Resume/Resume_Vladislav_Orekhov-Miller_EN.docx
+++ b/Resume/Resume_Vladislav_Orekhov-Miller_EN.docx
@@ -4,7 +4,7 @@
   <w:body>
     <w:p>
       <w:pPr>
-        <w:spacing w:after="40" w:before="0"/>
+        <w:spacing w:after="40"/>
         <w:jc w:val="center"/>
       </w:pPr>
       <w:r>
@@ -900,7 +900,7 @@
           <w:b/>
           <w:sz w:val="18"/>
         </w:rPr>
-        <w:t>Financial University under the Government of the Russian Federation, Moscow | 2018 – 2022</w:t>
+        <w:t>Touro University New York | 2018 – 2023</w:t>
       </w:r>
     </w:p>
     <w:p>
@@ -913,7 +913,20 @@
           <w:b w:val="0"/>
           <w:sz w:val="18"/>
         </w:rPr>
-        <w:t>Bachelor of Economics, International Finance</w:t>
+        <w:t>Bachelor of Science, Business Management</w:t>
+      </w:r>
+    </w:p>
+    <w:p>
+      <w:pPr>
+        <w:spacing w:after="40" w:before="20" w:line="230" w:lineRule="exact"/>
+      </w:pPr>
+      <w:r>
+        <w:rPr>
+          <w:rFonts w:ascii="Calibri" w:hAnsi="Calibri"/>
+          <w:b w:val="0"/>
+          <w:sz w:val="17"/>
+        </w:rPr>
+        <w:t>Senior Honors Project: Case Study of Virgin Galactic within the Aerospace Industry</w:t>
       </w:r>
     </w:p>
     <w:p>

</xml_diff>

<commit_message>
Fix Word resumes: fit exactly 2 pages (tighter margins/spacing, same font sizes)
</commit_message>
<xml_diff>
--- a/Resume/Resume_Vladislav_Orekhov-Miller_EN.docx
+++ b/Resume/Resume_Vladislav_Orekhov-Miller_EN.docx
@@ -56,7 +56,7 @@
     </w:p>
     <w:p>
       <w:pPr>
-        <w:spacing w:before="160" w:after="80" w:line="240" w:lineRule="exact"/>
+        <w:spacing w:before="120" w:after="60" w:line="240" w:lineRule="exact"/>
         <w:pBdr>
           <w:bottom w:val="single" w:sz="6" w:space="1" w:color="1F4E79"/>
         </w:pBdr>
@@ -99,7 +99,7 @@
     </w:p>
     <w:p>
       <w:pPr>
-        <w:spacing w:before="160" w:after="80" w:line="240" w:lineRule="exact"/>
+        <w:spacing w:before="120" w:after="60" w:line="240" w:lineRule="exact"/>
         <w:pBdr>
           <w:bottom w:val="single" w:sz="6" w:space="1" w:color="1F4E79"/>
         </w:pBdr>
@@ -142,7 +142,7 @@
     </w:p>
     <w:p>
       <w:pPr>
-        <w:spacing w:before="160" w:after="80" w:line="240" w:lineRule="exact"/>
+        <w:spacing w:before="120" w:after="60" w:line="240" w:lineRule="exact"/>
         <w:pBdr>
           <w:bottom w:val="single" w:sz="6" w:space="1" w:color="1F4E79"/>
         </w:pBdr>
@@ -388,7 +388,7 @@
     </w:tbl>
     <w:p>
       <w:pPr>
-        <w:spacing w:before="160" w:after="80" w:line="240" w:lineRule="exact"/>
+        <w:spacing w:before="120" w:after="60" w:line="240" w:lineRule="exact"/>
         <w:pBdr>
           <w:bottom w:val="single" w:sz="6" w:space="1" w:color="1F4E79"/>
         </w:pBdr>
@@ -429,7 +429,7 @@
     </w:p>
     <w:p>
       <w:pPr>
-        <w:spacing w:after="40" w:before="120" w:line="230" w:lineRule="exact"/>
+        <w:spacing w:after="40" w:before="80" w:line="230" w:lineRule="exact"/>
       </w:pPr>
       <w:r>
         <w:rPr>
@@ -443,7 +443,7 @@
     <w:p>
       <w:pPr>
         <w:pStyle w:val="ListBullet"/>
-        <w:spacing w:after="20" w:before="0" w:line="230" w:lineRule="exact"/>
+        <w:spacing w:after="10" w:before="0" w:line="230" w:lineRule="exact"/>
       </w:pPr>
       <w:r>
         <w:rPr>
@@ -456,7 +456,7 @@
     <w:p>
       <w:pPr>
         <w:pStyle w:val="ListBullet"/>
-        <w:spacing w:after="20" w:before="0" w:line="230" w:lineRule="exact"/>
+        <w:spacing w:after="10" w:before="0" w:line="230" w:lineRule="exact"/>
       </w:pPr>
       <w:r>
         <w:rPr>
@@ -469,7 +469,7 @@
     <w:p>
       <w:pPr>
         <w:pStyle w:val="ListBullet"/>
-        <w:spacing w:after="20" w:before="0" w:line="230" w:lineRule="exact"/>
+        <w:spacing w:after="10" w:before="0" w:line="230" w:lineRule="exact"/>
       </w:pPr>
       <w:r>
         <w:rPr>
@@ -482,7 +482,7 @@
     <w:p>
       <w:pPr>
         <w:pStyle w:val="ListBullet"/>
-        <w:spacing w:after="20" w:before="0" w:line="230" w:lineRule="exact"/>
+        <w:spacing w:after="10" w:before="0" w:line="230" w:lineRule="exact"/>
       </w:pPr>
       <w:r>
         <w:rPr>
@@ -495,7 +495,7 @@
     <w:p>
       <w:pPr>
         <w:pStyle w:val="ListBullet"/>
-        <w:spacing w:after="20" w:before="0" w:line="230" w:lineRule="exact"/>
+        <w:spacing w:after="10" w:before="0" w:line="230" w:lineRule="exact"/>
       </w:pPr>
       <w:r>
         <w:rPr>
@@ -507,7 +507,7 @@
     </w:p>
     <w:p>
       <w:pPr>
-        <w:spacing w:after="40" w:before="120" w:line="230" w:lineRule="exact"/>
+        <w:spacing w:after="40" w:before="80" w:line="230" w:lineRule="exact"/>
       </w:pPr>
       <w:r>
         <w:rPr>
@@ -521,7 +521,7 @@
     <w:p>
       <w:pPr>
         <w:pStyle w:val="ListBullet"/>
-        <w:spacing w:after="20" w:before="0" w:line="230" w:lineRule="exact"/>
+        <w:spacing w:after="10" w:before="0" w:line="230" w:lineRule="exact"/>
       </w:pPr>
       <w:r>
         <w:rPr>
@@ -534,7 +534,7 @@
     <w:p>
       <w:pPr>
         <w:pStyle w:val="ListBullet"/>
-        <w:spacing w:after="20" w:before="0" w:line="230" w:lineRule="exact"/>
+        <w:spacing w:after="10" w:before="0" w:line="230" w:lineRule="exact"/>
       </w:pPr>
       <w:r>
         <w:rPr>
@@ -547,7 +547,7 @@
     <w:p>
       <w:pPr>
         <w:pStyle w:val="ListBullet"/>
-        <w:spacing w:after="20" w:before="0" w:line="230" w:lineRule="exact"/>
+        <w:spacing w:after="10" w:before="0" w:line="230" w:lineRule="exact"/>
       </w:pPr>
       <w:r>
         <w:rPr>
@@ -559,7 +559,7 @@
     </w:p>
     <w:p>
       <w:pPr>
-        <w:spacing w:after="40" w:before="120" w:line="230" w:lineRule="exact"/>
+        <w:spacing w:after="40" w:before="80" w:line="230" w:lineRule="exact"/>
       </w:pPr>
       <w:r>
         <w:rPr>
@@ -573,7 +573,7 @@
     <w:p>
       <w:pPr>
         <w:pStyle w:val="ListBullet"/>
-        <w:spacing w:after="20" w:before="0" w:line="230" w:lineRule="exact"/>
+        <w:spacing w:after="10" w:before="0" w:line="230" w:lineRule="exact"/>
       </w:pPr>
       <w:r>
         <w:rPr>
@@ -586,7 +586,7 @@
     <w:p>
       <w:pPr>
         <w:pStyle w:val="ListBullet"/>
-        <w:spacing w:after="20" w:before="0" w:line="230" w:lineRule="exact"/>
+        <w:spacing w:after="10" w:before="0" w:line="230" w:lineRule="exact"/>
       </w:pPr>
       <w:r>
         <w:rPr>
@@ -599,7 +599,7 @@
     <w:p>
       <w:pPr>
         <w:pStyle w:val="ListBullet"/>
-        <w:spacing w:after="20" w:before="0" w:line="230" w:lineRule="exact"/>
+        <w:spacing w:after="10" w:before="0" w:line="230" w:lineRule="exact"/>
       </w:pPr>
       <w:r>
         <w:rPr>
@@ -611,7 +611,7 @@
     </w:p>
     <w:p>
       <w:pPr>
-        <w:spacing w:before="160" w:after="80" w:line="240" w:lineRule="exact"/>
+        <w:spacing w:before="120" w:after="60" w:line="240" w:lineRule="exact"/>
         <w:pBdr>
           <w:bottom w:val="single" w:sz="6" w:space="1" w:color="1F4E79"/>
         </w:pBdr>
@@ -628,7 +628,7 @@
     </w:p>
     <w:p>
       <w:pPr>
-        <w:spacing w:after="40" w:before="120" w:line="230" w:lineRule="exact"/>
+        <w:spacing w:after="40" w:before="80" w:line="230" w:lineRule="exact"/>
       </w:pPr>
       <w:r>
         <w:rPr>
@@ -641,7 +641,7 @@
     </w:p>
     <w:p>
       <w:pPr>
-        <w:spacing w:after="40" w:before="0" w:line="230" w:lineRule="exact"/>
+        <w:spacing w:after="20" w:before="0" w:line="230" w:lineRule="exact"/>
       </w:pPr>
       <w:r>
         <w:rPr>
@@ -655,7 +655,7 @@
     <w:p>
       <w:pPr>
         <w:pStyle w:val="ListBullet"/>
-        <w:spacing w:after="20" w:before="0" w:line="230" w:lineRule="exact"/>
+        <w:spacing w:after="10" w:before="0" w:line="230" w:lineRule="exact"/>
       </w:pPr>
       <w:r>
         <w:rPr>
@@ -668,7 +668,7 @@
     <w:p>
       <w:pPr>
         <w:pStyle w:val="ListBullet"/>
-        <w:spacing w:after="20" w:before="0" w:line="230" w:lineRule="exact"/>
+        <w:spacing w:after="10" w:before="0" w:line="230" w:lineRule="exact"/>
       </w:pPr>
       <w:r>
         <w:rPr>
@@ -681,7 +681,7 @@
     <w:p>
       <w:pPr>
         <w:pStyle w:val="ListBullet"/>
-        <w:spacing w:after="20" w:before="0" w:line="230" w:lineRule="exact"/>
+        <w:spacing w:after="10" w:before="0" w:line="230" w:lineRule="exact"/>
       </w:pPr>
       <w:r>
         <w:rPr>
@@ -693,7 +693,7 @@
     </w:p>
     <w:p>
       <w:pPr>
-        <w:spacing w:after="40" w:before="0" w:line="230" w:lineRule="exact"/>
+        <w:spacing w:after="20" w:before="0" w:line="230" w:lineRule="exact"/>
       </w:pPr>
       <w:r>
         <w:rPr>
@@ -707,7 +707,7 @@
     <w:p>
       <w:pPr>
         <w:pStyle w:val="ListBullet"/>
-        <w:spacing w:after="20" w:before="0" w:line="230" w:lineRule="exact"/>
+        <w:spacing w:after="10" w:before="0" w:line="230" w:lineRule="exact"/>
       </w:pPr>
       <w:r>
         <w:rPr>
@@ -719,7 +719,7 @@
     </w:p>
     <w:p>
       <w:pPr>
-        <w:spacing w:after="40" w:before="120" w:line="230" w:lineRule="exact"/>
+        <w:spacing w:after="40" w:before="80" w:line="230" w:lineRule="exact"/>
       </w:pPr>
       <w:r>
         <w:rPr>
@@ -732,7 +732,7 @@
     </w:p>
     <w:p>
       <w:pPr>
-        <w:spacing w:after="40" w:before="0" w:line="230" w:lineRule="exact"/>
+        <w:spacing w:after="20" w:before="0" w:line="230" w:lineRule="exact"/>
       </w:pPr>
       <w:r>
         <w:rPr>
@@ -746,7 +746,7 @@
     <w:p>
       <w:pPr>
         <w:pStyle w:val="ListBullet"/>
-        <w:spacing w:after="20" w:before="0" w:line="230" w:lineRule="exact"/>
+        <w:spacing w:after="10" w:before="0" w:line="230" w:lineRule="exact"/>
       </w:pPr>
       <w:r>
         <w:rPr>
@@ -759,7 +759,7 @@
     <w:p>
       <w:pPr>
         <w:pStyle w:val="ListBullet"/>
-        <w:spacing w:after="20" w:before="0" w:line="230" w:lineRule="exact"/>
+        <w:spacing w:after="10" w:before="0" w:line="230" w:lineRule="exact"/>
       </w:pPr>
       <w:r>
         <w:rPr>
@@ -772,7 +772,7 @@
     <w:p>
       <w:pPr>
         <w:pStyle w:val="ListBullet"/>
-        <w:spacing w:after="20" w:before="0" w:line="230" w:lineRule="exact"/>
+        <w:spacing w:after="10" w:before="0" w:line="230" w:lineRule="exact"/>
       </w:pPr>
       <w:r>
         <w:rPr>
@@ -784,7 +784,7 @@
     </w:p>
     <w:p>
       <w:pPr>
-        <w:spacing w:after="40" w:before="0" w:line="230" w:lineRule="exact"/>
+        <w:spacing w:after="20" w:before="0" w:line="230" w:lineRule="exact"/>
       </w:pPr>
       <w:r>
         <w:rPr>
@@ -798,7 +798,7 @@
     <w:p>
       <w:pPr>
         <w:pStyle w:val="ListBullet"/>
-        <w:spacing w:after="20" w:before="0" w:line="230" w:lineRule="exact"/>
+        <w:spacing w:after="10" w:before="0" w:line="230" w:lineRule="exact"/>
       </w:pPr>
       <w:r>
         <w:rPr>
@@ -811,7 +811,7 @@
     <w:p>
       <w:pPr>
         <w:pStyle w:val="ListBullet"/>
-        <w:spacing w:after="20" w:before="0" w:line="230" w:lineRule="exact"/>
+        <w:spacing w:after="10" w:before="0" w:line="230" w:lineRule="exact"/>
       </w:pPr>
       <w:r>
         <w:rPr>
@@ -823,7 +823,7 @@
     </w:p>
     <w:p>
       <w:pPr>
-        <w:spacing w:after="40" w:before="120" w:line="230" w:lineRule="exact"/>
+        <w:spacing w:after="40" w:before="80" w:line="230" w:lineRule="exact"/>
       </w:pPr>
       <w:r>
         <w:rPr>
@@ -836,7 +836,7 @@
     </w:p>
     <w:p>
       <w:pPr>
-        <w:spacing w:after="40" w:before="0" w:line="230" w:lineRule="exact"/>
+        <w:spacing w:after="20" w:before="0" w:line="230" w:lineRule="exact"/>
       </w:pPr>
       <w:r>
         <w:rPr>
@@ -850,7 +850,7 @@
     <w:p>
       <w:pPr>
         <w:pStyle w:val="ListBullet"/>
-        <w:spacing w:after="20" w:before="0" w:line="230" w:lineRule="exact"/>
+        <w:spacing w:after="10" w:before="0" w:line="230" w:lineRule="exact"/>
       </w:pPr>
       <w:r>
         <w:rPr>
@@ -863,7 +863,7 @@
     <w:p>
       <w:pPr>
         <w:pStyle w:val="ListBullet"/>
-        <w:spacing w:after="20" w:before="0" w:line="230" w:lineRule="exact"/>
+        <w:spacing w:after="10" w:before="0" w:line="230" w:lineRule="exact"/>
       </w:pPr>
       <w:r>
         <w:rPr>
@@ -875,7 +875,7 @@
     </w:p>
     <w:p>
       <w:pPr>
-        <w:spacing w:before="160" w:after="80" w:line="240" w:lineRule="exact"/>
+        <w:spacing w:before="120" w:after="60" w:line="240" w:lineRule="exact"/>
         <w:pBdr>
           <w:bottom w:val="single" w:sz="6" w:space="1" w:color="1F4E79"/>
         </w:pBdr>
@@ -931,7 +931,7 @@
     </w:p>
     <w:p>
       <w:pPr>
-        <w:spacing w:before="160" w:after="80" w:line="240" w:lineRule="exact"/>
+        <w:spacing w:before="120" w:after="60" w:line="240" w:lineRule="exact"/>
         <w:pBdr>
           <w:bottom w:val="single" w:sz="6" w:space="1" w:color="1F4E79"/>
         </w:pBdr>
@@ -974,7 +974,7 @@
     </w:p>
     <w:p>
       <w:pPr>
-        <w:spacing w:before="160" w:after="80" w:line="240" w:lineRule="exact"/>
+        <w:spacing w:before="120" w:after="60" w:line="240" w:lineRule="exact"/>
         <w:pBdr>
           <w:bottom w:val="single" w:sz="6" w:space="1" w:color="1F4E79"/>
         </w:pBdr>
@@ -1004,7 +1004,7 @@
     </w:p>
     <w:sectPr>
       <w:pgSz w:w="12240" w:h="15840"/>
-      <w:pgMar w:top="680" w:right="850" w:bottom="567" w:left="850" w:header="720" w:footer="720" w:gutter="0"/>
+      <w:pgMar w:top="567" w:right="850" w:bottom="482" w:left="850" w:header="720" w:footer="720" w:gutter="0"/>
       <w:cols w:space="720"/>
       <w:docGrid w:linePitch="360"/>
     </w:sectPr>

</xml_diff>

<commit_message>
Restyle Word resumes: Times New Roman 12pt, italic roles, fit 2 pages
</commit_message>
<xml_diff>
--- a/Resume/Resume_Vladislav_Orekhov-Miller_EN.docx
+++ b/Resume/Resume_Vladislav_Orekhov-Miller_EN.docx
@@ -4,14 +4,14 @@
   <w:body>
     <w:p>
       <w:pPr>
-        <w:spacing w:after="40"/>
+        <w:spacing w:before="0" w:after="0" w:line="240" w:lineRule="auto"/>
         <w:jc w:val="center"/>
       </w:pPr>
       <w:r>
         <w:rPr>
-          <w:rFonts w:ascii="Calibri" w:hAnsi="Calibri"/>
+          <w:rFonts w:ascii="Times New Roman" w:hAnsi="Times New Roman"/>
           <w:b/>
-          <w:color w:val="1F4E79"/>
+          <w:i w:val="0"/>
           <w:sz w:val="28"/>
         </w:rPr>
         <w:t>VLADISLAV OREKHOV-MILLER</w:t>
@@ -19,423 +19,244 @@
     </w:p>
     <w:p>
       <w:pPr>
-        <w:spacing w:after="20"/>
+        <w:spacing w:before="0" w:after="0" w:line="240" w:lineRule="auto"/>
         <w:jc w:val="center"/>
       </w:pPr>
       <w:r>
         <w:rPr>
-          <w:rFonts w:ascii="Calibri" w:hAnsi="Calibri"/>
-          <w:sz w:val="18"/>
+          <w:rFonts w:ascii="Times New Roman" w:hAnsi="Times New Roman"/>
+          <w:b w:val="0"/>
+          <w:i w:val="0"/>
+          <w:sz w:val="24"/>
         </w:rPr>
         <w:t>+7 (925) 472-90-54 | vladislav.miller2000@gmail.com | Moscow, Russia</w:t>
       </w:r>
     </w:p>
     <w:p>
       <w:pPr>
-        <w:spacing w:after="0"/>
+        <w:spacing w:before="0" w:after="0" w:line="240" w:lineRule="auto"/>
         <w:jc w:val="center"/>
       </w:pPr>
       <w:r>
         <w:rPr>
-          <w:rFonts w:ascii="Calibri" w:hAnsi="Calibri"/>
-          <w:sz w:val="18"/>
+          <w:rFonts w:ascii="Times New Roman" w:hAnsi="Times New Roman"/>
+          <w:b w:val="0"/>
+          <w:i w:val="0"/>
+          <w:sz w:val="24"/>
         </w:rPr>
-        <w:t xml:space="preserve">GitHub: </w:t>
+        <w:t>GitHub: github.com/vladislavmiller2000-bit/System-Analysis</w:t>
       </w:r>
-      <w:hyperlink r:id="rId9">
-        <w:r>
-          <w:rPr>
-            <w:color w:val="0563C1"/>
-            <w:u w:val="single"/>
-            <w:rFonts w:ascii="Calibri" w:hAnsi="Calibri"/>
-            <w:sz w:val="18"/>
-          </w:rPr>
-          <w:t>github.com/vladislavmiller2000-bit/System-Analysis</w:t>
-        </w:r>
-      </w:hyperlink>
     </w:p>
     <w:p>
       <w:pPr>
-        <w:spacing w:before="120" w:after="60" w:line="240" w:lineRule="exact"/>
-        <w:pBdr>
-          <w:bottom w:val="single" w:sz="6" w:space="1" w:color="1F4E79"/>
-        </w:pBdr>
+        <w:spacing w:before="0" w:after="0" w:line="240" w:lineRule="auto"/>
       </w:pPr>
       <w:r>
         <w:rPr>
-          <w:rFonts w:ascii="Calibri" w:hAnsi="Calibri"/>
+          <w:rFonts w:ascii="Times New Roman" w:hAnsi="Times New Roman"/>
           <w:b/>
-          <w:color w:val="1F4E79"/>
-          <w:sz w:val="21"/>
+          <w:i w:val="0"/>
+          <w:sz w:val="24"/>
+          <w:u w:val="single"/>
         </w:rPr>
         <w:t>OBJECTIVE</w:t>
       </w:r>
     </w:p>
     <w:p>
       <w:pPr>
-        <w:spacing w:after="20" w:before="0" w:line="230" w:lineRule="exact"/>
+        <w:spacing w:before="0" w:after="0" w:line="240" w:lineRule="auto"/>
       </w:pPr>
       <w:r>
         <w:rPr>
-          <w:rFonts w:ascii="Calibri" w:hAnsi="Calibri"/>
+          <w:rFonts w:ascii="Times New Roman" w:hAnsi="Times New Roman"/>
           <w:b/>
-          <w:sz w:val="18"/>
+          <w:i w:val="0"/>
+          <w:sz w:val="24"/>
         </w:rPr>
         <w:t>Junior System Analyst / Junior Business Analyst</w:t>
       </w:r>
     </w:p>
     <w:p>
       <w:pPr>
-        <w:spacing w:after="40" w:before="0" w:line="230" w:lineRule="exact"/>
+        <w:spacing w:before="0" w:after="0" w:line="240" w:lineRule="auto"/>
       </w:pPr>
       <w:r>
         <w:rPr>
-          <w:rFonts w:ascii="Calibri" w:hAnsi="Calibri"/>
+          <w:rFonts w:ascii="Times New Roman" w:hAnsi="Times New Roman"/>
           <w:b w:val="0"/>
-          <w:sz w:val="18"/>
+          <w:i w:val="0"/>
+          <w:sz w:val="24"/>
         </w:rPr>
         <w:t>Seeking a system or business analyst position with opportunities for professional growth. Open to internships or entry-level roles with mentorship.</w:t>
       </w:r>
     </w:p>
     <w:p>
       <w:pPr>
-        <w:spacing w:before="120" w:after="60" w:line="240" w:lineRule="exact"/>
-        <w:pBdr>
-          <w:bottom w:val="single" w:sz="6" w:space="1" w:color="1F4E79"/>
-        </w:pBdr>
+        <w:spacing w:before="0" w:after="0" w:line="240" w:lineRule="auto"/>
       </w:pPr>
       <w:r>
         <w:rPr>
-          <w:rFonts w:ascii="Calibri" w:hAnsi="Calibri"/>
+          <w:rFonts w:ascii="Times New Roman" w:hAnsi="Times New Roman"/>
           <w:b/>
-          <w:color w:val="1F4E79"/>
-          <w:sz w:val="21"/>
+          <w:i w:val="0"/>
+          <w:sz w:val="24"/>
+          <w:u w:val="single"/>
         </w:rPr>
         <w:t>SUMMARY</w:t>
       </w:r>
     </w:p>
     <w:p>
       <w:pPr>
-        <w:spacing w:after="40" w:before="0" w:line="230" w:lineRule="exact"/>
+        <w:spacing w:before="0" w:after="0" w:line="240" w:lineRule="auto"/>
       </w:pPr>
       <w:r>
         <w:rPr>
-          <w:rFonts w:ascii="Calibri" w:hAnsi="Calibri"/>
+          <w:rFonts w:ascii="Times New Roman" w:hAnsi="Times New Roman"/>
           <w:b w:val="0"/>
-          <w:sz w:val="18"/>
+          <w:i w:val="0"/>
+          <w:sz w:val="24"/>
         </w:rPr>
         <w:t>Systems analyst with hands-on experience in business process modeling, database design, and analytical SQL. Completed portfolio projects covering the full analyst workflow — from requirements gathering and diagramming (BPMN, UML, ERD) to data normalization and KPI analysis. Additional commercial experience with sales analytics, forecasting, and data visualization at Burger King and Knight Frank.</w:t>
       </w:r>
     </w:p>
     <w:p>
       <w:pPr>
-        <w:spacing w:after="40" w:before="0" w:line="230" w:lineRule="exact"/>
+        <w:spacing w:before="0" w:after="0" w:line="240" w:lineRule="auto"/>
       </w:pPr>
       <w:r>
         <w:rPr>
-          <w:rFonts w:ascii="Calibri" w:hAnsi="Calibri"/>
+          <w:rFonts w:ascii="Times New Roman" w:hAnsi="Times New Roman"/>
           <w:b w:val="0"/>
-          <w:sz w:val="18"/>
+          <w:i w:val="0"/>
+          <w:sz w:val="24"/>
         </w:rPr>
         <w:t>Fluent in Russian and English, experienced working in international teams across Israel and Russia. Structured thinker, results-oriented, quick to learn new domains.</w:t>
       </w:r>
     </w:p>
     <w:p>
       <w:pPr>
-        <w:spacing w:before="120" w:after="60" w:line="240" w:lineRule="exact"/>
-        <w:pBdr>
-          <w:bottom w:val="single" w:sz="6" w:space="1" w:color="1F4E79"/>
-        </w:pBdr>
+        <w:spacing w:before="0" w:after="0" w:line="240" w:lineRule="auto"/>
       </w:pPr>
       <w:r>
         <w:rPr>
-          <w:rFonts w:ascii="Calibri" w:hAnsi="Calibri"/>
+          <w:rFonts w:ascii="Times New Roman" w:hAnsi="Times New Roman"/>
           <w:b/>
-          <w:color w:val="1F4E79"/>
-          <w:sz w:val="21"/>
+          <w:i w:val="0"/>
+          <w:sz w:val="24"/>
+          <w:u w:val="single"/>
         </w:rPr>
         <w:t>KEY SKILLS</w:t>
       </w:r>
     </w:p>
-    <w:tbl>
-      <w:tblPr>
-        <w:tblW w:type="auto" w:w="0"/>
-        <w:jc w:val="center"/>
-        <w:tblLook w:firstColumn="1" w:firstRow="1" w:lastColumn="0" w:lastRow="0" w:noHBand="0" w:noVBand="1" w:val="04A0"/>
-      </w:tblPr>
-      <w:tblGrid>
-        <w:gridCol w:w="5270"/>
-        <w:gridCol w:w="5270"/>
-      </w:tblGrid>
-      <w:tr>
-        <w:tc>
-          <w:tcPr>
-            <w:tcW w:type="dxa" w:w="5270"/>
-          </w:tcPr>
-          <w:p>
-            <w:pPr>
-              <w:spacing w:after="20" w:before="20"/>
-            </w:pPr>
-            <w:r>
-              <w:rPr>
-                <w:rFonts w:ascii="Calibri" w:hAnsi="Calibri"/>
-                <w:b/>
-                <w:sz w:val="17"/>
-              </w:rPr>
-              <w:t>Area</w:t>
-            </w:r>
-          </w:p>
-        </w:tc>
-        <w:tc>
-          <w:tcPr>
-            <w:tcW w:type="dxa" w:w="5270"/>
-          </w:tcPr>
-          <w:p>
-            <w:pPr>
-              <w:spacing w:after="20" w:before="20"/>
-            </w:pPr>
-            <w:r>
-              <w:rPr>
-                <w:rFonts w:ascii="Calibri" w:hAnsi="Calibri"/>
-                <w:b/>
-                <w:sz w:val="17"/>
-              </w:rPr>
-              <w:t>Skills</w:t>
-            </w:r>
-          </w:p>
-        </w:tc>
-      </w:tr>
-      <w:tr>
-        <w:tc>
-          <w:tcPr>
-            <w:tcW w:type="dxa" w:w="5270"/>
-          </w:tcPr>
-          <w:p>
-            <w:pPr>
-              <w:spacing w:after="20" w:before="20"/>
-            </w:pPr>
-            <w:r>
-              <w:rPr>
-                <w:rFonts w:ascii="Calibri" w:hAnsi="Calibri"/>
-                <w:sz w:val="17"/>
-              </w:rPr>
-              <w:t>Analysis &amp; Modeling</w:t>
-            </w:r>
-          </w:p>
-        </w:tc>
-        <w:tc>
-          <w:tcPr>
-            <w:tcW w:type="dxa" w:w="5270"/>
-          </w:tcPr>
-          <w:p>
-            <w:pPr>
-              <w:spacing w:after="20" w:before="20"/>
-            </w:pPr>
-            <w:r>
-              <w:rPr>
-                <w:rFonts w:ascii="Calibri" w:hAnsi="Calibri"/>
-                <w:sz w:val="17"/>
-              </w:rPr>
-              <w:t>BPMN 2.0, UML (Use Case, State Machine, Activity), ERD (Chen, Crow's Foot)</w:t>
-            </w:r>
-          </w:p>
-        </w:tc>
-      </w:tr>
-      <w:tr>
-        <w:tc>
-          <w:tcPr>
-            <w:tcW w:type="dxa" w:w="5270"/>
-          </w:tcPr>
-          <w:p>
-            <w:pPr>
-              <w:spacing w:after="20" w:before="20"/>
-            </w:pPr>
-            <w:r>
-              <w:rPr>
-                <w:rFonts w:ascii="Calibri" w:hAnsi="Calibri"/>
-                <w:sz w:val="17"/>
-              </w:rPr>
-              <w:t>Data &amp; SQL</w:t>
-            </w:r>
-          </w:p>
-        </w:tc>
-        <w:tc>
-          <w:tcPr>
-            <w:tcW w:type="dxa" w:w="5270"/>
-          </w:tcPr>
-          <w:p>
-            <w:pPr>
-              <w:spacing w:after="20" w:before="20"/>
-            </w:pPr>
-            <w:r>
-              <w:rPr>
-                <w:rFonts w:ascii="Calibri" w:hAnsi="Calibri"/>
-                <w:sz w:val="17"/>
-              </w:rPr>
-              <w:t>SQL (JOIN, subqueries, CTEs, window functions, aggregation), normalization (1NF-3NF)</w:t>
-            </w:r>
-          </w:p>
-        </w:tc>
-      </w:tr>
-      <w:tr>
-        <w:tc>
-          <w:tcPr>
-            <w:tcW w:type="dxa" w:w="5270"/>
-          </w:tcPr>
-          <w:p>
-            <w:pPr>
-              <w:spacing w:after="20" w:before="20"/>
-            </w:pPr>
-            <w:r>
-              <w:rPr>
-                <w:rFonts w:ascii="Calibri" w:hAnsi="Calibri"/>
-                <w:sz w:val="17"/>
-              </w:rPr>
-              <w:t>Tools</w:t>
-            </w:r>
-          </w:p>
-        </w:tc>
-        <w:tc>
-          <w:tcPr>
-            <w:tcW w:type="dxa" w:w="5270"/>
-          </w:tcPr>
-          <w:p>
-            <w:pPr>
-              <w:spacing w:after="20" w:before="20"/>
-            </w:pPr>
-            <w:r>
-              <w:rPr>
-                <w:rFonts w:ascii="Calibri" w:hAnsi="Calibri"/>
-                <w:sz w:val="17"/>
-              </w:rPr>
-              <w:t>Power BI, MS Excel (pivot tables, formulas, charts), Miro, Draw.io, Figma</w:t>
-            </w:r>
-          </w:p>
-        </w:tc>
-      </w:tr>
-      <w:tr>
-        <w:tc>
-          <w:tcPr>
-            <w:tcW w:type="dxa" w:w="5270"/>
-          </w:tcPr>
-          <w:p>
-            <w:pPr>
-              <w:spacing w:after="20" w:before="20"/>
-            </w:pPr>
-            <w:r>
-              <w:rPr>
-                <w:rFonts w:ascii="Calibri" w:hAnsi="Calibri"/>
-                <w:sz w:val="17"/>
-              </w:rPr>
-              <w:t>Documentation</w:t>
-            </w:r>
-          </w:p>
-        </w:tc>
-        <w:tc>
-          <w:tcPr>
-            <w:tcW w:type="dxa" w:w="5270"/>
-          </w:tcPr>
-          <w:p>
-            <w:pPr>
-              <w:spacing w:after="20" w:before="20"/>
-            </w:pPr>
-            <w:r>
-              <w:rPr>
-                <w:rFonts w:ascii="Calibri" w:hAnsi="Calibri"/>
-                <w:sz w:val="17"/>
-              </w:rPr>
-              <w:t>Requirements gathering &amp; documentation, SRS, data dictionary, Use Case specs</w:t>
-            </w:r>
-          </w:p>
-        </w:tc>
-      </w:tr>
-      <w:tr>
-        <w:tc>
-          <w:tcPr>
-            <w:tcW w:type="dxa" w:w="5270"/>
-          </w:tcPr>
-          <w:p>
-            <w:pPr>
-              <w:spacing w:after="20" w:before="20"/>
-            </w:pPr>
-            <w:r>
-              <w:rPr>
-                <w:rFonts w:ascii="Calibri" w:hAnsi="Calibri"/>
-                <w:sz w:val="17"/>
-              </w:rPr>
-              <w:t>Methodologies</w:t>
-            </w:r>
-          </w:p>
-        </w:tc>
-        <w:tc>
-          <w:tcPr>
-            <w:tcW w:type="dxa" w:w="5270"/>
-          </w:tcPr>
-          <w:p>
-            <w:pPr>
-              <w:spacing w:after="20" w:before="20"/>
-            </w:pPr>
-            <w:r>
-              <w:rPr>
-                <w:rFonts w:ascii="Calibri" w:hAnsi="Calibri"/>
-                <w:sz w:val="17"/>
-              </w:rPr>
-              <w:t>Agile/Scrum (fundamentals), Waterfall, AS-IS/TO-BE analysis</w:t>
-            </w:r>
-          </w:p>
-        </w:tc>
-      </w:tr>
-    </w:tbl>
     <w:p>
       <w:pPr>
-        <w:spacing w:before="120" w:after="60" w:line="240" w:lineRule="exact"/>
-        <w:pBdr>
-          <w:bottom w:val="single" w:sz="6" w:space="1" w:color="1F4E79"/>
-        </w:pBdr>
+        <w:spacing w:before="0" w:after="0" w:line="240" w:lineRule="auto"/>
       </w:pPr>
       <w:r>
         <w:rPr>
-          <w:rFonts w:ascii="Calibri" w:hAnsi="Calibri"/>
-          <w:b/>
-          <w:color w:val="1F4E79"/>
-          <w:sz w:val="21"/>
+          <w:rFonts w:ascii="Times New Roman" w:hAnsi="Times New Roman"/>
+          <w:b w:val="0"/>
+          <w:i w:val="0"/>
+          <w:sz w:val="24"/>
         </w:rPr>
-        <w:t>PROJECTS &amp; PORTFOLIO</w:t>
+        <w:t>Analysis &amp; Modeling: BPMN 2.0, UML (Use Case, State Machine, Activity), ERD (Chen, Crow's Foot)</w:t>
       </w:r>
     </w:p>
     <w:p>
       <w:pPr>
-        <w:spacing w:after="40" w:before="0" w:line="230" w:lineRule="exact"/>
+        <w:spacing w:before="0" w:after="0" w:line="240" w:lineRule="auto"/>
       </w:pPr>
       <w:r>
         <w:rPr>
-          <w:rFonts w:ascii="Calibri" w:hAnsi="Calibri"/>
+          <w:rFonts w:ascii="Times New Roman" w:hAnsi="Times New Roman"/>
           <w:b w:val="0"/>
-          <w:sz w:val="18"/>
+          <w:i w:val="0"/>
+          <w:sz w:val="24"/>
         </w:rPr>
-        <w:t xml:space="preserve">GitHub: </w:t>
+        <w:t>Data &amp; SQL: SQL (JOIN, subqueries, CTEs, window functions, aggregation), normalization (1NF–3NF)</w:t>
       </w:r>
-      <w:hyperlink r:id="rId9">
-        <w:r>
-          <w:rPr>
-            <w:color w:val="0563C1"/>
-            <w:u w:val="single"/>
-            <w:rFonts w:ascii="Calibri" w:hAnsi="Calibri"/>
-            <w:sz w:val="18"/>
-          </w:rPr>
-          <w:t>github.com/vladislavmiller2000-bit/System-Analysis</w:t>
-        </w:r>
-      </w:hyperlink>
     </w:p>
     <w:p>
       <w:pPr>
-        <w:spacing w:after="40" w:before="80" w:line="230" w:lineRule="exact"/>
+        <w:spacing w:before="0" w:after="0" w:line="240" w:lineRule="auto"/>
       </w:pPr>
       <w:r>
         <w:rPr>
-          <w:rFonts w:ascii="Calibri" w:hAnsi="Calibri"/>
+          <w:rFonts w:ascii="Times New Roman" w:hAnsi="Times New Roman"/>
+          <w:b w:val="0"/>
+          <w:i w:val="0"/>
+          <w:sz w:val="24"/>
+        </w:rPr>
+        <w:t>Tools: Power BI, MS Excel (pivot tables, formulas, charts), Miro, Draw.io, Figma</w:t>
+      </w:r>
+    </w:p>
+    <w:p>
+      <w:pPr>
+        <w:spacing w:before="0" w:after="0" w:line="240" w:lineRule="auto"/>
+      </w:pPr>
+      <w:r>
+        <w:rPr>
+          <w:rFonts w:ascii="Times New Roman" w:hAnsi="Times New Roman"/>
+          <w:b w:val="0"/>
+          <w:i w:val="0"/>
+          <w:sz w:val="24"/>
+        </w:rPr>
+        <w:t>Documentation: requirements gathering &amp; documentation, SRS, data dictionary, Use Case specifications</w:t>
+      </w:r>
+    </w:p>
+    <w:p>
+      <w:pPr>
+        <w:spacing w:before="0" w:after="0" w:line="240" w:lineRule="auto"/>
+      </w:pPr>
+      <w:r>
+        <w:rPr>
+          <w:rFonts w:ascii="Times New Roman" w:hAnsi="Times New Roman"/>
+          <w:b w:val="0"/>
+          <w:i w:val="0"/>
+          <w:sz w:val="24"/>
+        </w:rPr>
+        <w:t>Methodologies: Agile/Scrum (fundamentals), Waterfall, AS-IS/TO-BE analysis</w:t>
+      </w:r>
+    </w:p>
+    <w:p>
+      <w:pPr>
+        <w:spacing w:before="0" w:after="0" w:line="240" w:lineRule="auto"/>
+      </w:pPr>
+      <w:r>
+        <w:rPr>
+          <w:rFonts w:ascii="Times New Roman" w:hAnsi="Times New Roman"/>
           <w:b/>
-          <w:sz w:val="19"/>
+          <w:i w:val="0"/>
+          <w:sz w:val="24"/>
+          <w:u w:val="single"/>
+        </w:rPr>
+        <w:t>PROJECTS</w:t>
+      </w:r>
+    </w:p>
+    <w:p>
+      <w:pPr>
+        <w:spacing w:before="0" w:after="0" w:line="240" w:lineRule="auto"/>
+      </w:pPr>
+      <w:r>
+        <w:rPr>
+          <w:rFonts w:ascii="Times New Roman" w:hAnsi="Times New Roman"/>
+          <w:b w:val="0"/>
+          <w:i w:val="0"/>
+          <w:sz w:val="24"/>
+        </w:rPr>
+        <w:t>Portfolio: github.com/vladislavmiller2000-bit/System-Analysis</w:t>
+      </w:r>
+    </w:p>
+    <w:p>
+      <w:pPr>
+        <w:spacing w:before="0" w:after="0" w:line="240" w:lineRule="auto"/>
+      </w:pPr>
+      <w:r>
+        <w:rPr>
+          <w:rFonts w:ascii="Times New Roman" w:hAnsi="Times New Roman"/>
+          <w:b/>
+          <w:i w:val="0"/>
+          <w:sz w:val="24"/>
         </w:rPr>
         <w:t>Vita Clinic — Medical Clinic Business Process Analysis</w:t>
       </w:r>
@@ -443,77 +264,93 @@
     <w:p>
       <w:pPr>
         <w:pStyle w:val="ListBullet"/>
-        <w:spacing w:after="10" w:before="0" w:line="230" w:lineRule="exact"/>
+        <w:spacing w:before="0" w:after="0" w:line="240" w:lineRule="auto"/>
+        <w:ind w:left="283" w:hanging="142"/>
       </w:pPr>
       <w:r>
         <w:rPr>
-          <w:rFonts w:ascii="Calibri" w:hAnsi="Calibri"/>
-          <w:sz w:val="18"/>
+          <w:rFonts w:ascii="Times New Roman" w:hAnsi="Times New Roman"/>
+          <w:b w:val="0"/>
+          <w:i w:val="0"/>
+          <w:sz w:val="24"/>
         </w:rPr>
-        <w:t>Conducted AS-IS analysis of patient appointment workflow, identified 4 bottlenecks (data duplication, manual routing, missing validation, receptionist dependency) and proposed solutions based on automation best practices</w:t>
+        <w:t>Conducted AS-IS analysis of patient appointment workflow, identified 4 bottlenecks (data duplication, manual routing, missing validation, receptionist dependency) and proposed solutions based on automation best practices.</w:t>
       </w:r>
     </w:p>
     <w:p>
       <w:pPr>
         <w:pStyle w:val="ListBullet"/>
-        <w:spacing w:after="10" w:before="0" w:line="230" w:lineRule="exact"/>
+        <w:spacing w:before="0" w:after="0" w:line="240" w:lineRule="auto"/>
+        <w:ind w:left="283" w:hanging="142"/>
       </w:pPr>
       <w:r>
         <w:rPr>
-          <w:rFonts w:ascii="Calibri" w:hAnsi="Calibri"/>
-          <w:sz w:val="18"/>
+          <w:rFonts w:ascii="Times New Roman" w:hAnsi="Times New Roman"/>
+          <w:b w:val="0"/>
+          <w:i w:val="0"/>
+          <w:sz w:val="24"/>
         </w:rPr>
-        <w:t>Designed TO-BE model with automated scheduling — reduced processing chain from 5 to 2 steps by eliminating manual receptionist stage and accelerating initial data processing</w:t>
+        <w:t>Designed TO-BE model with automated scheduling: reduced processing chain from 5 to 2 steps by eliminating manual receptionist stage and accelerating initial data processing.</w:t>
       </w:r>
     </w:p>
     <w:p>
       <w:pPr>
         <w:pStyle w:val="ListBullet"/>
-        <w:spacing w:after="10" w:before="0" w:line="230" w:lineRule="exact"/>
+        <w:spacing w:before="0" w:after="0" w:line="240" w:lineRule="auto"/>
+        <w:ind w:left="283" w:hanging="142"/>
       </w:pPr>
       <w:r>
         <w:rPr>
-          <w:rFonts w:ascii="Calibri" w:hAnsi="Calibri"/>
-          <w:sz w:val="18"/>
+          <w:rFonts w:ascii="Times New Roman" w:hAnsi="Times New Roman"/>
+          <w:b w:val="0"/>
+          <w:i w:val="0"/>
+          <w:sz w:val="24"/>
         </w:rPr>
-        <w:t>Created BPMN 2.0 diagrams (AS-IS and TO-BE) and UML State Machine for appointment lifecycle</w:t>
+        <w:t>Created BPMN 2.0 diagrams (AS-IS and TO-BE) and UML State Machine for appointment lifecycle.</w:t>
       </w:r>
     </w:p>
     <w:p>
       <w:pPr>
         <w:pStyle w:val="ListBullet"/>
-        <w:spacing w:after="10" w:before="0" w:line="230" w:lineRule="exact"/>
+        <w:spacing w:before="0" w:after="0" w:line="240" w:lineRule="auto"/>
+        <w:ind w:left="283" w:hanging="142"/>
       </w:pPr>
       <w:r>
         <w:rPr>
-          <w:rFonts w:ascii="Calibri" w:hAnsi="Calibri"/>
-          <w:sz w:val="18"/>
+          <w:rFonts w:ascii="Times New Roman" w:hAnsi="Times New Roman"/>
+          <w:b w:val="0"/>
+          <w:i w:val="0"/>
+          <w:sz w:val="24"/>
         </w:rPr>
-        <w:t>Built interactive mobile app prototype (12 screens) in Figma, designed user journey from authorization to appointment confirmation</w:t>
+        <w:t>Built interactive mobile app prototype (12 screens) in Figma, designed user journey from authorization to appointment confirmation.</w:t>
       </w:r>
     </w:p>
     <w:p>
       <w:pPr>
         <w:pStyle w:val="ListBullet"/>
-        <w:spacing w:after="10" w:before="0" w:line="230" w:lineRule="exact"/>
+        <w:spacing w:before="0" w:after="0" w:line="240" w:lineRule="auto"/>
+        <w:ind w:left="283" w:hanging="142"/>
       </w:pPr>
       <w:r>
         <w:rPr>
-          <w:rFonts w:ascii="Calibri" w:hAnsi="Calibri"/>
-          <w:sz w:val="18"/>
+          <w:rFonts w:ascii="Times New Roman" w:hAnsi="Times New Roman"/>
+          <w:b w:val="0"/>
+          <w:i w:val="0"/>
+          <w:sz w:val="24"/>
         </w:rPr>
-        <w:t>Defined 17 functional and 4 non-functional requirements, documented Use Case specification</w:t>
+        <w:t>Defined 17 functional and 4 non-functional requirements, documented Use Case specification.</w:t>
       </w:r>
     </w:p>
     <w:p>
       <w:pPr>
-        <w:spacing w:after="40" w:before="80" w:line="230" w:lineRule="exact"/>
+        <w:spacing w:before="0" w:after="0" w:line="240" w:lineRule="auto"/>
       </w:pPr>
       <w:r>
         <w:rPr>
-          <w:rFonts w:ascii="Calibri" w:hAnsi="Calibri"/>
+          <w:rFonts w:ascii="Times New Roman" w:hAnsi="Times New Roman"/>
           <w:b/>
-          <w:sz w:val="19"/>
+          <w:i w:val="0"/>
+          <w:sz w:val="24"/>
         </w:rPr>
         <w:t>Nakarabine — E-Commerce Database Design</w:t>
       </w:r>
@@ -521,51 +358,61 @@
     <w:p>
       <w:pPr>
         <w:pStyle w:val="ListBullet"/>
-        <w:spacing w:after="10" w:before="0" w:line="230" w:lineRule="exact"/>
+        <w:spacing w:before="0" w:after="0" w:line="240" w:lineRule="auto"/>
+        <w:ind w:left="283" w:hanging="142"/>
       </w:pPr>
       <w:r>
         <w:rPr>
-          <w:rFonts w:ascii="Calibri" w:hAnsi="Calibri"/>
-          <w:sz w:val="18"/>
+          <w:rFonts w:ascii="Times New Roman" w:hAnsi="Times New Roman"/>
+          <w:b w:val="0"/>
+          <w:i w:val="0"/>
+          <w:sz w:val="24"/>
         </w:rPr>
-        <w:t>Designed logical data model (PK, FK, UNIQUE, NOT NULL, CHECK constraints), defined relationship cardinalities and ensured referential integrity</w:t>
+        <w:t>Designed logical data model (PK, FK, UNIQUE, NOT NULL, CHECK constraints), defined relationship cardinalities and ensured referential integrity.</w:t>
       </w:r>
     </w:p>
     <w:p>
       <w:pPr>
         <w:pStyle w:val="ListBullet"/>
-        <w:spacing w:after="10" w:before="0" w:line="230" w:lineRule="exact"/>
+        <w:spacing w:before="0" w:after="0" w:line="240" w:lineRule="auto"/>
+        <w:ind w:left="283" w:hanging="142"/>
       </w:pPr>
       <w:r>
         <w:rPr>
-          <w:rFonts w:ascii="Calibri" w:hAnsi="Calibri"/>
-          <w:sz w:val="18"/>
+          <w:rFonts w:ascii="Times New Roman" w:hAnsi="Times New Roman"/>
+          <w:b w:val="0"/>
+          <w:i w:val="0"/>
+          <w:sz w:val="24"/>
         </w:rPr>
-        <w:t>Built ERD diagrams in Chen and Crow's Foot notations, performed normalization (1NF through 3NF)</w:t>
+        <w:t>Built ERD diagrams in Chen and Crow's Foot notations, performed normalization (1NF through 3NF).</w:t>
       </w:r>
     </w:p>
     <w:p>
       <w:pPr>
         <w:pStyle w:val="ListBullet"/>
-        <w:spacing w:after="10" w:before="0" w:line="230" w:lineRule="exact"/>
+        <w:spacing w:before="0" w:after="0" w:line="240" w:lineRule="auto"/>
+        <w:ind w:left="283" w:hanging="142"/>
       </w:pPr>
       <w:r>
         <w:rPr>
-          <w:rFonts w:ascii="Calibri" w:hAnsi="Calibri"/>
-          <w:sz w:val="18"/>
+          <w:rFonts w:ascii="Times New Roman" w:hAnsi="Times New Roman"/>
+          <w:b w:val="0"/>
+          <w:i w:val="0"/>
+          <w:sz w:val="24"/>
         </w:rPr>
-        <w:t>Developed data dictionary and terminology glossary for team alignment: attribute descriptions, data types, business rules, allowed values</w:t>
+        <w:t>Developed data dictionary and terminology glossary: attribute descriptions, data types, business rules, allowed values.</w:t>
       </w:r>
     </w:p>
     <w:p>
       <w:pPr>
-        <w:spacing w:after="40" w:before="80" w:line="230" w:lineRule="exact"/>
+        <w:spacing w:before="0" w:after="0" w:line="240" w:lineRule="auto"/>
       </w:pPr>
       <w:r>
         <w:rPr>
-          <w:rFonts w:ascii="Calibri" w:hAnsi="Calibri"/>
+          <w:rFonts w:ascii="Times New Roman" w:hAnsi="Times New Roman"/>
           <w:b/>
-          <w:sz w:val="19"/>
+          <w:i w:val="0"/>
+          <w:sz w:val="24"/>
         </w:rPr>
         <w:t>Restaurant Sales Analysis — SQL Project</w:t>
       </w:r>
@@ -573,81 +420,90 @@
     <w:p>
       <w:pPr>
         <w:pStyle w:val="ListBullet"/>
-        <w:spacing w:after="10" w:before="0" w:line="230" w:lineRule="exact"/>
+        <w:spacing w:before="0" w:after="0" w:line="240" w:lineRule="auto"/>
+        <w:ind w:left="283" w:hanging="142"/>
       </w:pPr>
       <w:r>
         <w:rPr>
-          <w:rFonts w:ascii="Calibri" w:hAnsi="Calibri"/>
-          <w:sz w:val="18"/>
+          <w:rFonts w:ascii="Times New Roman" w:hAnsi="Times New Roman"/>
+          <w:b w:val="0"/>
+          <w:i w:val="0"/>
+          <w:sz w:val="24"/>
         </w:rPr>
-        <w:t>Designed relational schema (DDL: CREATE TABLE, PRIMARY KEY, FOREIGN KEY, constraints) and populated with test data (50 orders, 20 menu items)</w:t>
+        <w:t>Designed relational schema (DDL: CREATE TABLE, PRIMARY KEY, FOREIGN KEY, constraints) and populated with test data (50 orders, 20 menu items).</w:t>
       </w:r>
     </w:p>
     <w:p>
       <w:pPr>
         <w:pStyle w:val="ListBullet"/>
-        <w:spacing w:after="10" w:before="0" w:line="230" w:lineRule="exact"/>
+        <w:spacing w:before="0" w:after="0" w:line="240" w:lineRule="auto"/>
+        <w:ind w:left="283" w:hanging="142"/>
       </w:pPr>
       <w:r>
         <w:rPr>
-          <w:rFonts w:ascii="Calibri" w:hAnsi="Calibri"/>
-          <w:sz w:val="18"/>
+          <w:rFonts w:ascii="Times New Roman" w:hAnsi="Times New Roman"/>
+          <w:b w:val="0"/>
+          <w:i w:val="0"/>
+          <w:sz w:val="24"/>
         </w:rPr>
-        <w:t>Wrote 20+ analytical queries: revenue by period, profit margins, menu ABC analysis</w:t>
+        <w:t>Wrote 20+ analytical queries: revenue by period, profit margins, menu ABC analysis.</w:t>
       </w:r>
     </w:p>
     <w:p>
       <w:pPr>
         <w:pStyle w:val="ListBullet"/>
-        <w:spacing w:after="10" w:before="0" w:line="230" w:lineRule="exact"/>
+        <w:spacing w:before="0" w:after="0" w:line="240" w:lineRule="auto"/>
+        <w:ind w:left="283" w:hanging="142"/>
       </w:pPr>
       <w:r>
         <w:rPr>
-          <w:rFonts w:ascii="Calibri" w:hAnsi="Calibri"/>
-          <w:sz w:val="18"/>
+          <w:rFonts w:ascii="Times New Roman" w:hAnsi="Times New Roman"/>
+          <w:b w:val="0"/>
+          <w:i w:val="0"/>
+          <w:sz w:val="24"/>
         </w:rPr>
-        <w:t>Applied JOIN, CTEs, window functions (LAG, RANK, ROW_NUMBER), subqueries, CASE expressions</w:t>
+        <w:t>Applied JOIN, CTEs, window functions (LAG, RANK, ROW_NUMBER), subqueries, CASE expressions.</w:t>
       </w:r>
     </w:p>
     <w:p>
       <w:pPr>
-        <w:spacing w:before="120" w:after="60" w:line="240" w:lineRule="exact"/>
-        <w:pBdr>
-          <w:bottom w:val="single" w:sz="6" w:space="1" w:color="1F4E79"/>
-        </w:pBdr>
+        <w:spacing w:before="0" w:after="0" w:line="240" w:lineRule="auto"/>
       </w:pPr>
       <w:r>
         <w:rPr>
-          <w:rFonts w:ascii="Calibri" w:hAnsi="Calibri"/>
+          <w:rFonts w:ascii="Times New Roman" w:hAnsi="Times New Roman"/>
           <w:b/>
-          <w:color w:val="1F4E79"/>
-          <w:sz w:val="21"/>
+          <w:i w:val="0"/>
+          <w:sz w:val="24"/>
+          <w:u w:val="single"/>
         </w:rPr>
         <w:t>WORK EXPERIENCE</w:t>
       </w:r>
     </w:p>
     <w:p>
       <w:pPr>
-        <w:spacing w:after="40" w:before="80" w:line="230" w:lineRule="exact"/>
+        <w:spacing w:before="0" w:after="0" w:line="240" w:lineRule="auto"/>
       </w:pPr>
       <w:r>
         <w:rPr>
-          <w:rFonts w:ascii="Calibri" w:hAnsi="Calibri"/>
+          <w:rFonts w:ascii="Times New Roman" w:hAnsi="Times New Roman"/>
           <w:b/>
-          <w:sz w:val="19"/>
+          <w:i w:val="0"/>
+          <w:sz w:val="24"/>
         </w:rPr>
         <w:t>KFC Cinema City — Rishon LeTsiyon, Israel</w:t>
       </w:r>
     </w:p>
     <w:p>
       <w:pPr>
-        <w:spacing w:after="20" w:before="0" w:line="230" w:lineRule="exact"/>
+        <w:spacing w:before="0" w:after="0" w:line="240" w:lineRule="auto"/>
       </w:pPr>
       <w:r>
         <w:rPr>
-          <w:rFonts w:ascii="Calibri" w:hAnsi="Calibri"/>
+          <w:rFonts w:ascii="Times New Roman" w:hAnsi="Times New Roman"/>
           <w:b w:val="0"/>
-          <w:sz w:val="18"/>
+          <w:i/>
+          <w:sz w:val="24"/>
         </w:rPr>
         <w:t>Deputy Director | April 2024 – April 2025</w:t>
       </w:r>
@@ -655,51 +511,61 @@
     <w:p>
       <w:pPr>
         <w:pStyle w:val="ListBullet"/>
-        <w:spacing w:after="10" w:before="0" w:line="230" w:lineRule="exact"/>
+        <w:spacing w:before="0" w:after="0" w:line="240" w:lineRule="auto"/>
+        <w:ind w:left="283" w:hanging="142"/>
       </w:pPr>
       <w:r>
         <w:rPr>
-          <w:rFonts w:ascii="Calibri" w:hAnsi="Calibri"/>
-          <w:sz w:val="18"/>
+          <w:rFonts w:ascii="Times New Roman" w:hAnsi="Times New Roman"/>
+          <w:b w:val="0"/>
+          <w:i w:val="0"/>
+          <w:sz w:val="24"/>
         </w:rPr>
-        <w:t>Built daily analytics system for the restaurant (900+ receipts/day): tracked revenue, average check, hourly load, output — identified lunch-peak underperformance, reallocated resources, contributing to 10% profit increase</w:t>
+        <w:t>Built daily analytics system for the restaurant (900+ receipts/day): tracked revenue, average check, hourly load, output; identified lunch-peak underperformance, reallocated resources, contributing to 10% profit increase.</w:t>
       </w:r>
     </w:p>
     <w:p>
       <w:pPr>
         <w:pStyle w:val="ListBullet"/>
-        <w:spacing w:after="10" w:before="0" w:line="230" w:lineRule="exact"/>
+        <w:spacing w:before="0" w:after="0" w:line="240" w:lineRule="auto"/>
+        <w:ind w:left="283" w:hanging="142"/>
       </w:pPr>
       <w:r>
         <w:rPr>
-          <w:rFonts w:ascii="Calibri" w:hAnsi="Calibri"/>
-          <w:sz w:val="18"/>
+          <w:rFonts w:ascii="Times New Roman" w:hAnsi="Times New Roman"/>
+          <w:b w:val="0"/>
+          <w:i w:val="0"/>
+          <w:sz w:val="24"/>
         </w:rPr>
-        <w:t>Implemented data-driven inventory management: analyzed consumption by category, adjusted procurement volumes — reduced supply costs by 15%</w:t>
+        <w:t>Implemented data-driven inventory management: analyzed consumption by category, adjusted procurement volumes; reduced supply costs by 15%.</w:t>
       </w:r>
     </w:p>
     <w:p>
       <w:pPr>
         <w:pStyle w:val="ListBullet"/>
-        <w:spacing w:after="10" w:before="0" w:line="230" w:lineRule="exact"/>
+        <w:spacing w:before="0" w:after="0" w:line="240" w:lineRule="auto"/>
+        <w:ind w:left="283" w:hanging="142"/>
       </w:pPr>
       <w:r>
         <w:rPr>
-          <w:rFonts w:ascii="Calibri" w:hAnsi="Calibri"/>
-          <w:sz w:val="18"/>
+          <w:rFonts w:ascii="Times New Roman" w:hAnsi="Times New Roman"/>
+          <w:b w:val="0"/>
+          <w:i w:val="0"/>
+          <w:sz w:val="24"/>
         </w:rPr>
-        <w:t>Coordinated a team of 20+ employees, standardized operational procedures and developed quality control checklists</w:t>
+        <w:t>Coordinated a team of 20+ employees, standardized operational procedures and developed quality control checklists.</w:t>
       </w:r>
     </w:p>
     <w:p>
       <w:pPr>
-        <w:spacing w:after="20" w:before="0" w:line="230" w:lineRule="exact"/>
+        <w:spacing w:before="0" w:after="0" w:line="240" w:lineRule="auto"/>
       </w:pPr>
       <w:r>
         <w:rPr>
-          <w:rFonts w:ascii="Calibri" w:hAnsi="Calibri"/>
+          <w:rFonts w:ascii="Times New Roman" w:hAnsi="Times New Roman"/>
           <w:b w:val="0"/>
-          <w:sz w:val="18"/>
+          <w:i/>
+          <w:sz w:val="24"/>
         </w:rPr>
         <w:t>Shift Manager | November 2023 – April 2024</w:t>
       </w:r>
@@ -707,38 +573,43 @@
     <w:p>
       <w:pPr>
         <w:pStyle w:val="ListBullet"/>
-        <w:spacing w:after="10" w:before="0" w:line="230" w:lineRule="exact"/>
+        <w:spacing w:before="0" w:after="0" w:line="240" w:lineRule="auto"/>
+        <w:ind w:left="283" w:hanging="142"/>
       </w:pPr>
       <w:r>
         <w:rPr>
-          <w:rFonts w:ascii="Calibri" w:hAnsi="Calibri"/>
-          <w:sz w:val="18"/>
+          <w:rFonts w:ascii="Times New Roman" w:hAnsi="Times New Roman"/>
+          <w:b w:val="0"/>
+          <w:i w:val="0"/>
+          <w:sz w:val="24"/>
         </w:rPr>
-        <w:t>Managed shift operations (15 employees): SLA control for service speed, quality metrics monitoring, real-time incident resolution</w:t>
+        <w:t>Managed shift operations (15 employees): SLA control for service speed, quality metrics monitoring, real-time incident resolution.</w:t>
       </w:r>
     </w:p>
     <w:p>
       <w:pPr>
-        <w:spacing w:after="40" w:before="80" w:line="230" w:lineRule="exact"/>
+        <w:spacing w:before="0" w:after="0" w:line="240" w:lineRule="auto"/>
       </w:pPr>
       <w:r>
         <w:rPr>
-          <w:rFonts w:ascii="Calibri" w:hAnsi="Calibri"/>
+          <w:rFonts w:ascii="Times New Roman" w:hAnsi="Times New Roman"/>
           <w:b/>
-          <w:sz w:val="19"/>
+          <w:i w:val="0"/>
+          <w:sz w:val="24"/>
         </w:rPr>
         <w:t>Intern — Burger King Corporation, Moscow</w:t>
       </w:r>
     </w:p>
     <w:p>
       <w:pPr>
-        <w:spacing w:after="20" w:before="0" w:line="230" w:lineRule="exact"/>
+        <w:spacing w:before="0" w:after="0" w:line="240" w:lineRule="auto"/>
       </w:pPr>
       <w:r>
         <w:rPr>
-          <w:rFonts w:ascii="Calibri" w:hAnsi="Calibri"/>
+          <w:rFonts w:ascii="Times New Roman" w:hAnsi="Times New Roman"/>
           <w:b w:val="0"/>
-          <w:sz w:val="18"/>
+          <w:i/>
+          <w:sz w:val="24"/>
         </w:rPr>
         <w:t>Marketing Research Department | Summer 2022</w:t>
       </w:r>
@@ -746,51 +617,61 @@
     <w:p>
       <w:pPr>
         <w:pStyle w:val="ListBullet"/>
-        <w:spacing w:after="10" w:before="0" w:line="230" w:lineRule="exact"/>
+        <w:spacing w:before="0" w:after="0" w:line="240" w:lineRule="auto"/>
+        <w:ind w:left="283" w:hanging="142"/>
       </w:pPr>
       <w:r>
         <w:rPr>
-          <w:rFonts w:ascii="Calibri" w:hAnsi="Calibri"/>
-          <w:sz w:val="18"/>
+          <w:rFonts w:ascii="Times New Roman" w:hAnsi="Times New Roman"/>
+          <w:b w:val="0"/>
+          <w:i w:val="0"/>
+          <w:sz w:val="24"/>
         </w:rPr>
-        <w:t>Built sales analytics dashboards for 50+ restaurants in Excel (pivot tables, INDEX/MATCH, conditional formatting)</w:t>
+        <w:t>Built sales analytics dashboards for 50+ restaurants in Excel (pivot tables, INDEX/MATCH, conditional formatting).</w:t>
       </w:r>
     </w:p>
     <w:p>
       <w:pPr>
         <w:pStyle w:val="ListBullet"/>
-        <w:spacing w:after="10" w:before="0" w:line="230" w:lineRule="exact"/>
+        <w:spacing w:before="0" w:after="0" w:line="240" w:lineRule="auto"/>
+        <w:ind w:left="283" w:hanging="142"/>
       </w:pPr>
       <w:r>
         <w:rPr>
-          <w:rFonts w:ascii="Calibri" w:hAnsi="Calibri"/>
-          <w:sz w:val="18"/>
+          <w:rFonts w:ascii="Times New Roman" w:hAnsi="Times New Roman"/>
+          <w:b w:val="0"/>
+          <w:i w:val="0"/>
+          <w:sz w:val="24"/>
         </w:rPr>
-        <w:t>Automated categorization of 10,000+ receipts and compiled restaurant revenue rankings — identified 5 growth opportunities for regional managers</w:t>
+        <w:t>Automated categorization of 10,000+ receipts and compiled restaurant revenue rankings; identified 5 growth opportunities for regional managers.</w:t>
       </w:r>
     </w:p>
     <w:p>
       <w:pPr>
         <w:pStyle w:val="ListBullet"/>
-        <w:spacing w:after="10" w:before="0" w:line="230" w:lineRule="exact"/>
+        <w:spacing w:before="0" w:after="0" w:line="240" w:lineRule="auto"/>
+        <w:ind w:left="283" w:hanging="142"/>
       </w:pPr>
       <w:r>
         <w:rPr>
-          <w:rFonts w:ascii="Calibri" w:hAnsi="Calibri"/>
-          <w:sz w:val="18"/>
+          <w:rFonts w:ascii="Times New Roman" w:hAnsi="Times New Roman"/>
+          <w:b w:val="0"/>
+          <w:i w:val="0"/>
+          <w:sz w:val="24"/>
         </w:rPr>
-        <w:t>Prepared KPI visualizations (conversion, average check, trends) for weekly management presentations</w:t>
+        <w:t>Prepared KPI visualizations (conversion, average check, trends) for weekly management presentations.</w:t>
       </w:r>
     </w:p>
     <w:p>
       <w:pPr>
-        <w:spacing w:after="20" w:before="0" w:line="230" w:lineRule="exact"/>
+        <w:spacing w:before="0" w:after="0" w:line="240" w:lineRule="auto"/>
       </w:pPr>
       <w:r>
         <w:rPr>
-          <w:rFonts w:ascii="Calibri" w:hAnsi="Calibri"/>
+          <w:rFonts w:ascii="Times New Roman" w:hAnsi="Times New Roman"/>
           <w:b w:val="0"/>
-          <w:sz w:val="18"/>
+          <w:i/>
+          <w:sz w:val="24"/>
         </w:rPr>
         <w:t>Business Analytics Department | Summer 2019</w:t>
       </w:r>
@@ -798,51 +679,59 @@
     <w:p>
       <w:pPr>
         <w:pStyle w:val="ListBullet"/>
-        <w:spacing w:after="10" w:before="0" w:line="230" w:lineRule="exact"/>
+        <w:spacing w:before="0" w:after="0" w:line="240" w:lineRule="auto"/>
+        <w:ind w:left="283" w:hanging="142"/>
       </w:pPr>
       <w:r>
         <w:rPr>
-          <w:rFonts w:ascii="Calibri" w:hAnsi="Calibri"/>
-          <w:sz w:val="18"/>
+          <w:rFonts w:ascii="Times New Roman" w:hAnsi="Times New Roman"/>
+          <w:b w:val="0"/>
+          <w:i w:val="0"/>
+          <w:sz w:val="24"/>
         </w:rPr>
-        <w:t>Collected and structured financial data from multiple sources, prepared pivot tables for quarterly reports</w:t>
+        <w:t>Collected and structured financial data from multiple sources, prepared pivot tables for quarterly reports.</w:t>
       </w:r>
     </w:p>
     <w:p>
       <w:pPr>
         <w:pStyle w:val="ListBullet"/>
-        <w:spacing w:after="10" w:before="0" w:line="230" w:lineRule="exact"/>
+        <w:spacing w:before="0" w:after="0" w:line="240" w:lineRule="auto"/>
+        <w:ind w:left="283" w:hanging="142"/>
       </w:pPr>
       <w:r>
         <w:rPr>
-          <w:rFonts w:ascii="Calibri" w:hAnsi="Calibri"/>
-          <w:sz w:val="18"/>
+          <w:rFonts w:ascii="Times New Roman" w:hAnsi="Times New Roman"/>
+          <w:b w:val="0"/>
+          <w:i w:val="0"/>
+          <w:sz w:val="24"/>
         </w:rPr>
-        <w:t>Assisted in building sales forecast models based on historical data</w:t>
+        <w:t>Assisted in building sales forecast models based on historical data.</w:t>
       </w:r>
     </w:p>
     <w:p>
       <w:pPr>
-        <w:spacing w:after="40" w:before="80" w:line="230" w:lineRule="exact"/>
+        <w:spacing w:before="0" w:after="0" w:line="240" w:lineRule="auto"/>
       </w:pPr>
       <w:r>
         <w:rPr>
-          <w:rFonts w:ascii="Calibri" w:hAnsi="Calibri"/>
+          <w:rFonts w:ascii="Times New Roman" w:hAnsi="Times New Roman"/>
           <w:b/>
-          <w:sz w:val="19"/>
+          <w:i w:val="0"/>
+          <w:sz w:val="24"/>
         </w:rPr>
         <w:t>Intern — Knight Frank, Moscow</w:t>
       </w:r>
     </w:p>
     <w:p>
       <w:pPr>
-        <w:spacing w:after="20" w:before="0" w:line="230" w:lineRule="exact"/>
+        <w:spacing w:before="0" w:after="0" w:line="240" w:lineRule="auto"/>
       </w:pPr>
       <w:r>
         <w:rPr>
-          <w:rFonts w:ascii="Calibri" w:hAnsi="Calibri"/>
+          <w:rFonts w:ascii="Times New Roman" w:hAnsi="Times New Roman"/>
           <w:b w:val="0"/>
-          <w:sz w:val="18"/>
+          <w:i/>
+          <w:sz w:val="24"/>
         </w:rPr>
         <w:t>Residential Real Estate Marketing Department | Spring 2022</w:t>
       </w:r>
@@ -850,161 +739,167 @@
     <w:p>
       <w:pPr>
         <w:pStyle w:val="ListBullet"/>
-        <w:spacing w:after="10" w:before="0" w:line="230" w:lineRule="exact"/>
+        <w:spacing w:before="0" w:after="0" w:line="240" w:lineRule="auto"/>
+        <w:ind w:left="283" w:hanging="142"/>
       </w:pPr>
       <w:r>
         <w:rPr>
-          <w:rFonts w:ascii="Calibri" w:hAnsi="Calibri"/>
-          <w:sz w:val="18"/>
+          <w:rFonts w:ascii="Times New Roman" w:hAnsi="Times New Roman"/>
+          <w:b w:val="0"/>
+          <w:i w:val="0"/>
+          <w:sz w:val="24"/>
         </w:rPr>
-        <w:t>Conducted competitive analysis of 30+ premium residential properties: price per m², location, infrastructure — prepared comparative report for investment decision-making</w:t>
+        <w:t>Conducted competitive analysis of 30+ premium residential properties: price per m², location, infrastructure; prepared comparative report for investment decision-making.</w:t>
       </w:r>
     </w:p>
     <w:p>
       <w:pPr>
         <w:pStyle w:val="ListBullet"/>
-        <w:spacing w:after="10" w:before="0" w:line="230" w:lineRule="exact"/>
+        <w:spacing w:before="0" w:after="0" w:line="240" w:lineRule="auto"/>
+        <w:ind w:left="283" w:hanging="142"/>
       </w:pPr>
       <w:r>
         <w:rPr>
-          <w:rFonts w:ascii="Calibri" w:hAnsi="Calibri"/>
-          <w:sz w:val="18"/>
+          <w:rFonts w:ascii="Times New Roman" w:hAnsi="Times New Roman"/>
+          <w:b w:val="0"/>
+          <w:i w:val="0"/>
+          <w:sz w:val="24"/>
         </w:rPr>
-        <w:t>Participated in property valuation using comparative approach, prepared analytical briefs for the international office</w:t>
+        <w:t>Participated in property valuation using comparative approach, prepared analytical briefs for the international office.</w:t>
       </w:r>
     </w:p>
     <w:p>
       <w:pPr>
-        <w:spacing w:before="120" w:after="60" w:line="240" w:lineRule="exact"/>
-        <w:pBdr>
-          <w:bottom w:val="single" w:sz="6" w:space="1" w:color="1F4E79"/>
-        </w:pBdr>
+        <w:spacing w:before="0" w:after="0" w:line="240" w:lineRule="auto"/>
       </w:pPr>
       <w:r>
         <w:rPr>
-          <w:rFonts w:ascii="Calibri" w:hAnsi="Calibri"/>
+          <w:rFonts w:ascii="Times New Roman" w:hAnsi="Times New Roman"/>
           <w:b/>
-          <w:color w:val="1F4E79"/>
-          <w:sz w:val="21"/>
+          <w:i w:val="0"/>
+          <w:sz w:val="24"/>
+          <w:u w:val="single"/>
         </w:rPr>
         <w:t>EDUCATION</w:t>
       </w:r>
     </w:p>
     <w:p>
       <w:pPr>
-        <w:spacing w:after="20" w:before="0" w:line="230" w:lineRule="exact"/>
+        <w:spacing w:before="0" w:after="0" w:line="240" w:lineRule="auto"/>
       </w:pPr>
       <w:r>
         <w:rPr>
-          <w:rFonts w:ascii="Calibri" w:hAnsi="Calibri"/>
+          <w:rFonts w:ascii="Times New Roman" w:hAnsi="Times New Roman"/>
           <w:b/>
-          <w:sz w:val="18"/>
+          <w:i w:val="0"/>
+          <w:sz w:val="24"/>
         </w:rPr>
         <w:t>Touro University New York | 2018 – 2023</w:t>
       </w:r>
     </w:p>
     <w:p>
       <w:pPr>
-        <w:spacing w:after="40" w:before="0" w:line="230" w:lineRule="exact"/>
+        <w:spacing w:before="0" w:after="0" w:line="240" w:lineRule="auto"/>
       </w:pPr>
       <w:r>
         <w:rPr>
-          <w:rFonts w:ascii="Calibri" w:hAnsi="Calibri"/>
+          <w:rFonts w:ascii="Times New Roman" w:hAnsi="Times New Roman"/>
           <w:b w:val="0"/>
-          <w:sz w:val="18"/>
+          <w:i w:val="0"/>
+          <w:sz w:val="24"/>
         </w:rPr>
         <w:t>Bachelor of Science, Business Management</w:t>
       </w:r>
     </w:p>
     <w:p>
       <w:pPr>
-        <w:spacing w:after="40" w:before="20" w:line="230" w:lineRule="exact"/>
+        <w:spacing w:before="0" w:after="0" w:line="240" w:lineRule="auto"/>
       </w:pPr>
       <w:r>
         <w:rPr>
-          <w:rFonts w:ascii="Calibri" w:hAnsi="Calibri"/>
+          <w:rFonts w:ascii="Times New Roman" w:hAnsi="Times New Roman"/>
           <w:b w:val="0"/>
-          <w:sz w:val="17"/>
+          <w:i w:val="0"/>
+          <w:sz w:val="24"/>
         </w:rPr>
         <w:t>Senior Honors Project: Case Study of Virgin Galactic within the Aerospace Industry</w:t>
       </w:r>
     </w:p>
     <w:p>
       <w:pPr>
-        <w:spacing w:before="120" w:after="60" w:line="240" w:lineRule="exact"/>
-        <w:pBdr>
-          <w:bottom w:val="single" w:sz="6" w:space="1" w:color="1F4E79"/>
-        </w:pBdr>
+        <w:spacing w:before="0" w:after="0" w:line="240" w:lineRule="auto"/>
       </w:pPr>
       <w:r>
         <w:rPr>
-          <w:rFonts w:ascii="Calibri" w:hAnsi="Calibri"/>
+          <w:rFonts w:ascii="Times New Roman" w:hAnsi="Times New Roman"/>
           <w:b/>
-          <w:color w:val="1F4E79"/>
-          <w:sz w:val="21"/>
+          <w:i w:val="0"/>
+          <w:sz w:val="24"/>
+          <w:u w:val="single"/>
         </w:rPr>
         <w:t>PROFESSIONAL DEVELOPMENT</w:t>
       </w:r>
     </w:p>
     <w:p>
       <w:pPr>
-        <w:spacing w:after="20" w:before="0" w:line="230" w:lineRule="exact"/>
+        <w:spacing w:before="0" w:after="0" w:line="240" w:lineRule="auto"/>
       </w:pPr>
       <w:r>
         <w:rPr>
-          <w:rFonts w:ascii="Calibri" w:hAnsi="Calibri"/>
-          <w:b/>
-          <w:sz w:val="18"/>
+          <w:rFonts w:ascii="Times New Roman" w:hAnsi="Times New Roman"/>
+          <w:b w:val="0"/>
+          <w:i/>
+          <w:sz w:val="24"/>
         </w:rPr>
         <w:t>Yandex Practicum — Systems Analyst | 2025 – 2026</w:t>
       </w:r>
     </w:p>
     <w:p>
       <w:pPr>
-        <w:spacing w:after="40" w:before="0" w:line="230" w:lineRule="exact"/>
+        <w:spacing w:before="0" w:after="0" w:line="240" w:lineRule="auto"/>
       </w:pPr>
       <w:r>
         <w:rPr>
-          <w:rFonts w:ascii="Calibri" w:hAnsi="Calibri"/>
+          <w:rFonts w:ascii="Times New Roman" w:hAnsi="Times New Roman"/>
           <w:b w:val="0"/>
-          <w:sz w:val="18"/>
+          <w:i w:val="0"/>
+          <w:sz w:val="24"/>
         </w:rPr>
         <w:t>Requirements analysis, UML, BPMN, data modeling, SQL, Power BI, collaboration with development and QA teams.</w:t>
       </w:r>
     </w:p>
     <w:p>
       <w:pPr>
-        <w:spacing w:before="120" w:after="60" w:line="240" w:lineRule="exact"/>
-        <w:pBdr>
-          <w:bottom w:val="single" w:sz="6" w:space="1" w:color="1F4E79"/>
-        </w:pBdr>
+        <w:spacing w:before="0" w:after="0" w:line="240" w:lineRule="auto"/>
       </w:pPr>
       <w:r>
         <w:rPr>
-          <w:rFonts w:ascii="Calibri" w:hAnsi="Calibri"/>
+          <w:rFonts w:ascii="Times New Roman" w:hAnsi="Times New Roman"/>
           <w:b/>
-          <w:color w:val="1F4E79"/>
-          <w:sz w:val="21"/>
+          <w:i w:val="0"/>
+          <w:sz w:val="24"/>
+          <w:u w:val="single"/>
         </w:rPr>
         <w:t>LANGUAGES</w:t>
       </w:r>
     </w:p>
     <w:p>
       <w:pPr>
-        <w:spacing w:after="40" w:before="0" w:line="230" w:lineRule="exact"/>
+        <w:spacing w:before="0" w:after="0" w:line="240" w:lineRule="auto"/>
       </w:pPr>
       <w:r>
         <w:rPr>
-          <w:rFonts w:ascii="Calibri" w:hAnsi="Calibri"/>
+          <w:rFonts w:ascii="Times New Roman" w:hAnsi="Times New Roman"/>
           <w:b w:val="0"/>
-          <w:sz w:val="18"/>
+          <w:i w:val="0"/>
+          <w:sz w:val="24"/>
         </w:rPr>
         <w:t>Russian (native) | English (fluent) | Spanish (basic) | Hebrew (basic)</w:t>
       </w:r>
     </w:p>
     <w:sectPr>
       <w:pgSz w:w="12240" w:h="15840"/>
-      <w:pgMar w:top="567" w:right="850" w:bottom="482" w:left="850" w:header="720" w:footer="720" w:gutter="0"/>
+      <w:pgMar w:top="680" w:right="850" w:bottom="680" w:left="850" w:header="720" w:footer="720" w:gutter="0"/>
       <w:cols w:space="720"/>
       <w:docGrid w:linePitch="360"/>
     </w:sectPr>
@@ -1375,12 +1270,9 @@
     <w:name w:val="Normal"/>
     <w:qFormat/>
     <w:rsid w:val="00FC693F"/>
-    <w:pPr>
-      <w:spacing w:after="0" w:before="0"/>
-    </w:pPr>
     <w:rPr>
-      <w:rFonts w:ascii="Calibri" w:hAnsi="Calibri"/>
-      <w:sz w:val="18"/>
+      <w:rFonts w:ascii="Times New Roman" w:hAnsi="Times New Roman"/>
+      <w:sz w:val="24"/>
     </w:rPr>
   </w:style>
   <w:style w:type="paragraph" w:styleId="Header">

</xml_diff>

<commit_message>
Sync Word resumes (user-formatted) and update RU markdown to match
</commit_message>
<xml_diff>
--- a/Resume/Resume_Vladislav_Orekhov-Miller_EN.docx
+++ b/Resume/Resume_Vladislav_Orekhov-Miller_EN.docx
@@ -4,14 +4,14 @@
   <w:body>
     <w:p>
       <w:pPr>
-        <w:spacing w:before="0" w:after="0" w:line="240" w:lineRule="auto"/>
+        <w:spacing w:after="40" w:before="0"/>
         <w:jc w:val="center"/>
       </w:pPr>
       <w:r>
         <w:rPr>
-          <w:rFonts w:ascii="Times New Roman" w:hAnsi="Times New Roman"/>
+          <w:rFonts w:ascii="Calibri" w:hAnsi="Calibri"/>
           <w:b/>
-          <w:i w:val="0"/>
+          <w:color w:val="1F4E79"/>
           <w:sz w:val="28"/>
         </w:rPr>
         <w:t>VLADISLAV OREKHOV-MILLER</w:t>
@@ -19,244 +19,423 @@
     </w:p>
     <w:p>
       <w:pPr>
-        <w:spacing w:before="0" w:after="0" w:line="240" w:lineRule="auto"/>
+        <w:spacing w:after="20"/>
         <w:jc w:val="center"/>
       </w:pPr>
       <w:r>
         <w:rPr>
-          <w:rFonts w:ascii="Times New Roman" w:hAnsi="Times New Roman"/>
-          <w:b w:val="0"/>
-          <w:i w:val="0"/>
-          <w:sz w:val="24"/>
+          <w:rFonts w:ascii="Calibri" w:hAnsi="Calibri"/>
+          <w:sz w:val="18"/>
         </w:rPr>
         <w:t>+7 (925) 472-90-54 | vladislav.miller2000@gmail.com | Moscow, Russia</w:t>
       </w:r>
     </w:p>
     <w:p>
       <w:pPr>
-        <w:spacing w:before="0" w:after="0" w:line="240" w:lineRule="auto"/>
+        <w:spacing w:after="0"/>
         <w:jc w:val="center"/>
       </w:pPr>
       <w:r>
         <w:rPr>
-          <w:rFonts w:ascii="Times New Roman" w:hAnsi="Times New Roman"/>
-          <w:b w:val="0"/>
-          <w:i w:val="0"/>
-          <w:sz w:val="24"/>
+          <w:rFonts w:ascii="Calibri" w:hAnsi="Calibri"/>
+          <w:sz w:val="18"/>
         </w:rPr>
-        <w:t>GitHub: github.com/vladislavmiller2000-bit/System-Analysis</w:t>
+        <w:t xml:space="preserve">GitHub: </w:t>
       </w:r>
+      <w:hyperlink r:id="rId9">
+        <w:r>
+          <w:rPr>
+            <w:color w:val="0563C1"/>
+            <w:u w:val="single"/>
+            <w:rFonts w:ascii="Calibri" w:hAnsi="Calibri"/>
+            <w:sz w:val="18"/>
+          </w:rPr>
+          <w:t>github.com/vladislavmiller2000-bit/System-Analysis</w:t>
+        </w:r>
+      </w:hyperlink>
     </w:p>
     <w:p>
       <w:pPr>
-        <w:spacing w:before="0" w:after="0" w:line="240" w:lineRule="auto"/>
+        <w:spacing w:before="160" w:after="80" w:line="240" w:lineRule="exact"/>
+        <w:pBdr>
+          <w:bottom w:val="single" w:sz="6" w:space="1" w:color="1F4E79"/>
+        </w:pBdr>
       </w:pPr>
       <w:r>
         <w:rPr>
-          <w:rFonts w:ascii="Times New Roman" w:hAnsi="Times New Roman"/>
+          <w:rFonts w:ascii="Calibri" w:hAnsi="Calibri"/>
           <w:b/>
-          <w:i w:val="0"/>
-          <w:sz w:val="24"/>
-          <w:u w:val="single"/>
+          <w:color w:val="1F4E79"/>
+          <w:sz w:val="21"/>
         </w:rPr>
         <w:t>OBJECTIVE</w:t>
       </w:r>
     </w:p>
     <w:p>
       <w:pPr>
-        <w:spacing w:before="0" w:after="0" w:line="240" w:lineRule="auto"/>
+        <w:spacing w:after="20" w:before="0" w:line="230" w:lineRule="exact"/>
       </w:pPr>
       <w:r>
         <w:rPr>
-          <w:rFonts w:ascii="Times New Roman" w:hAnsi="Times New Roman"/>
+          <w:rFonts w:ascii="Calibri" w:hAnsi="Calibri"/>
           <w:b/>
-          <w:i w:val="0"/>
-          <w:sz w:val="24"/>
+          <w:sz w:val="18"/>
         </w:rPr>
         <w:t>Junior System Analyst / Junior Business Analyst</w:t>
       </w:r>
     </w:p>
     <w:p>
       <w:pPr>
-        <w:spacing w:before="0" w:after="0" w:line="240" w:lineRule="auto"/>
+        <w:spacing w:after="40" w:before="0" w:line="230" w:lineRule="exact"/>
       </w:pPr>
       <w:r>
         <w:rPr>
-          <w:rFonts w:ascii="Times New Roman" w:hAnsi="Times New Roman"/>
+          <w:rFonts w:ascii="Calibri" w:hAnsi="Calibri"/>
           <w:b w:val="0"/>
-          <w:i w:val="0"/>
-          <w:sz w:val="24"/>
+          <w:sz w:val="18"/>
         </w:rPr>
         <w:t>Seeking a system or business analyst position with opportunities for professional growth. Open to internships or entry-level roles with mentorship.</w:t>
       </w:r>
     </w:p>
     <w:p>
       <w:pPr>
-        <w:spacing w:before="0" w:after="0" w:line="240" w:lineRule="auto"/>
+        <w:spacing w:before="160" w:after="80" w:line="240" w:lineRule="exact"/>
+        <w:pBdr>
+          <w:bottom w:val="single" w:sz="6" w:space="1" w:color="1F4E79"/>
+        </w:pBdr>
       </w:pPr>
       <w:r>
         <w:rPr>
-          <w:rFonts w:ascii="Times New Roman" w:hAnsi="Times New Roman"/>
+          <w:rFonts w:ascii="Calibri" w:hAnsi="Calibri"/>
           <w:b/>
-          <w:i w:val="0"/>
-          <w:sz w:val="24"/>
-          <w:u w:val="single"/>
+          <w:color w:val="1F4E79"/>
+          <w:sz w:val="21"/>
         </w:rPr>
         <w:t>SUMMARY</w:t>
       </w:r>
     </w:p>
     <w:p>
       <w:pPr>
-        <w:spacing w:before="0" w:after="0" w:line="240" w:lineRule="auto"/>
+        <w:spacing w:after="40" w:before="0" w:line="230" w:lineRule="exact"/>
       </w:pPr>
       <w:r>
         <w:rPr>
-          <w:rFonts w:ascii="Times New Roman" w:hAnsi="Times New Roman"/>
+          <w:rFonts w:ascii="Calibri" w:hAnsi="Calibri"/>
           <w:b w:val="0"/>
-          <w:i w:val="0"/>
-          <w:sz w:val="24"/>
+          <w:sz w:val="18"/>
         </w:rPr>
         <w:t>Systems analyst with hands-on experience in business process modeling, database design, and analytical SQL. Completed portfolio projects covering the full analyst workflow — from requirements gathering and diagramming (BPMN, UML, ERD) to data normalization and KPI analysis. Additional commercial experience with sales analytics, forecasting, and data visualization at Burger King and Knight Frank.</w:t>
       </w:r>
     </w:p>
     <w:p>
       <w:pPr>
-        <w:spacing w:before="0" w:after="0" w:line="240" w:lineRule="auto"/>
+        <w:spacing w:after="40" w:before="0" w:line="230" w:lineRule="exact"/>
       </w:pPr>
       <w:r>
         <w:rPr>
-          <w:rFonts w:ascii="Times New Roman" w:hAnsi="Times New Roman"/>
+          <w:rFonts w:ascii="Calibri" w:hAnsi="Calibri"/>
           <w:b w:val="0"/>
-          <w:i w:val="0"/>
-          <w:sz w:val="24"/>
+          <w:sz w:val="18"/>
         </w:rPr>
         <w:t>Fluent in Russian and English, experienced working in international teams across Israel and Russia. Structured thinker, results-oriented, quick to learn new domains.</w:t>
       </w:r>
     </w:p>
     <w:p>
       <w:pPr>
-        <w:spacing w:before="0" w:after="0" w:line="240" w:lineRule="auto"/>
+        <w:spacing w:before="160" w:after="80" w:line="240" w:lineRule="exact"/>
+        <w:pBdr>
+          <w:bottom w:val="single" w:sz="6" w:space="1" w:color="1F4E79"/>
+        </w:pBdr>
       </w:pPr>
       <w:r>
         <w:rPr>
-          <w:rFonts w:ascii="Times New Roman" w:hAnsi="Times New Roman"/>
+          <w:rFonts w:ascii="Calibri" w:hAnsi="Calibri"/>
           <w:b/>
-          <w:i w:val="0"/>
-          <w:sz w:val="24"/>
-          <w:u w:val="single"/>
+          <w:color w:val="1F4E79"/>
+          <w:sz w:val="21"/>
         </w:rPr>
         <w:t>KEY SKILLS</w:t>
       </w:r>
     </w:p>
+    <w:tbl>
+      <w:tblPr>
+        <w:tblW w:type="auto" w:w="0"/>
+        <w:jc w:val="center"/>
+        <w:tblLook w:firstColumn="1" w:firstRow="1" w:lastColumn="0" w:lastRow="0" w:noHBand="0" w:noVBand="1" w:val="04A0"/>
+      </w:tblPr>
+      <w:tblGrid>
+        <w:gridCol w:w="5270"/>
+        <w:gridCol w:w="5270"/>
+      </w:tblGrid>
+      <w:tr>
+        <w:tc>
+          <w:tcPr>
+            <w:tcW w:type="dxa" w:w="5270"/>
+          </w:tcPr>
+          <w:p>
+            <w:pPr>
+              <w:spacing w:after="20" w:before="20"/>
+            </w:pPr>
+            <w:r>
+              <w:rPr>
+                <w:rFonts w:ascii="Calibri" w:hAnsi="Calibri"/>
+                <w:b/>
+                <w:sz w:val="17"/>
+              </w:rPr>
+              <w:t>Area</w:t>
+            </w:r>
+          </w:p>
+        </w:tc>
+        <w:tc>
+          <w:tcPr>
+            <w:tcW w:type="dxa" w:w="5270"/>
+          </w:tcPr>
+          <w:p>
+            <w:pPr>
+              <w:spacing w:after="20" w:before="20"/>
+            </w:pPr>
+            <w:r>
+              <w:rPr>
+                <w:rFonts w:ascii="Calibri" w:hAnsi="Calibri"/>
+                <w:b/>
+                <w:sz w:val="17"/>
+              </w:rPr>
+              <w:t>Skills</w:t>
+            </w:r>
+          </w:p>
+        </w:tc>
+      </w:tr>
+      <w:tr>
+        <w:tc>
+          <w:tcPr>
+            <w:tcW w:type="dxa" w:w="5270"/>
+          </w:tcPr>
+          <w:p>
+            <w:pPr>
+              <w:spacing w:after="20" w:before="20"/>
+            </w:pPr>
+            <w:r>
+              <w:rPr>
+                <w:rFonts w:ascii="Calibri" w:hAnsi="Calibri"/>
+                <w:sz w:val="17"/>
+              </w:rPr>
+              <w:t>Analysis &amp; Modeling</w:t>
+            </w:r>
+          </w:p>
+        </w:tc>
+        <w:tc>
+          <w:tcPr>
+            <w:tcW w:type="dxa" w:w="5270"/>
+          </w:tcPr>
+          <w:p>
+            <w:pPr>
+              <w:spacing w:after="20" w:before="20"/>
+            </w:pPr>
+            <w:r>
+              <w:rPr>
+                <w:rFonts w:ascii="Calibri" w:hAnsi="Calibri"/>
+                <w:sz w:val="17"/>
+              </w:rPr>
+              <w:t>BPMN 2.0, UML (Use Case, State Machine, Activity), ERD (Chen, Crow's Foot)</w:t>
+            </w:r>
+          </w:p>
+        </w:tc>
+      </w:tr>
+      <w:tr>
+        <w:tc>
+          <w:tcPr>
+            <w:tcW w:type="dxa" w:w="5270"/>
+          </w:tcPr>
+          <w:p>
+            <w:pPr>
+              <w:spacing w:after="20" w:before="20"/>
+            </w:pPr>
+            <w:r>
+              <w:rPr>
+                <w:rFonts w:ascii="Calibri" w:hAnsi="Calibri"/>
+                <w:sz w:val="17"/>
+              </w:rPr>
+              <w:t>Data &amp; SQL</w:t>
+            </w:r>
+          </w:p>
+        </w:tc>
+        <w:tc>
+          <w:tcPr>
+            <w:tcW w:type="dxa" w:w="5270"/>
+          </w:tcPr>
+          <w:p>
+            <w:pPr>
+              <w:spacing w:after="20" w:before="20"/>
+            </w:pPr>
+            <w:r>
+              <w:rPr>
+                <w:rFonts w:ascii="Calibri" w:hAnsi="Calibri"/>
+                <w:sz w:val="17"/>
+              </w:rPr>
+              <w:t>SQL (JOIN, subqueries, CTEs, window functions, aggregation), normalization (1NF-3NF)</w:t>
+            </w:r>
+          </w:p>
+        </w:tc>
+      </w:tr>
+      <w:tr>
+        <w:tc>
+          <w:tcPr>
+            <w:tcW w:type="dxa" w:w="5270"/>
+          </w:tcPr>
+          <w:p>
+            <w:pPr>
+              <w:spacing w:after="20" w:before="20"/>
+            </w:pPr>
+            <w:r>
+              <w:rPr>
+                <w:rFonts w:ascii="Calibri" w:hAnsi="Calibri"/>
+                <w:sz w:val="17"/>
+              </w:rPr>
+              <w:t>Tools</w:t>
+            </w:r>
+          </w:p>
+        </w:tc>
+        <w:tc>
+          <w:tcPr>
+            <w:tcW w:type="dxa" w:w="5270"/>
+          </w:tcPr>
+          <w:p>
+            <w:pPr>
+              <w:spacing w:after="20" w:before="20"/>
+            </w:pPr>
+            <w:r>
+              <w:rPr>
+                <w:rFonts w:ascii="Calibri" w:hAnsi="Calibri"/>
+                <w:sz w:val="17"/>
+              </w:rPr>
+              <w:t>Power BI, MS Excel (pivot tables, formulas, charts), Miro, Draw.io, Figma</w:t>
+            </w:r>
+          </w:p>
+        </w:tc>
+      </w:tr>
+      <w:tr>
+        <w:tc>
+          <w:tcPr>
+            <w:tcW w:type="dxa" w:w="5270"/>
+          </w:tcPr>
+          <w:p>
+            <w:pPr>
+              <w:spacing w:after="20" w:before="20"/>
+            </w:pPr>
+            <w:r>
+              <w:rPr>
+                <w:rFonts w:ascii="Calibri" w:hAnsi="Calibri"/>
+                <w:sz w:val="17"/>
+              </w:rPr>
+              <w:t>Documentation</w:t>
+            </w:r>
+          </w:p>
+        </w:tc>
+        <w:tc>
+          <w:tcPr>
+            <w:tcW w:type="dxa" w:w="5270"/>
+          </w:tcPr>
+          <w:p>
+            <w:pPr>
+              <w:spacing w:after="20" w:before="20"/>
+            </w:pPr>
+            <w:r>
+              <w:rPr>
+                <w:rFonts w:ascii="Calibri" w:hAnsi="Calibri"/>
+                <w:sz w:val="17"/>
+              </w:rPr>
+              <w:t>Requirements gathering &amp; documentation, SRS, data dictionary, Use Case specs</w:t>
+            </w:r>
+          </w:p>
+        </w:tc>
+      </w:tr>
+      <w:tr>
+        <w:tc>
+          <w:tcPr>
+            <w:tcW w:type="dxa" w:w="5270"/>
+          </w:tcPr>
+          <w:p>
+            <w:pPr>
+              <w:spacing w:after="20" w:before="20"/>
+            </w:pPr>
+            <w:r>
+              <w:rPr>
+                <w:rFonts w:ascii="Calibri" w:hAnsi="Calibri"/>
+                <w:sz w:val="17"/>
+              </w:rPr>
+              <w:t>Methodologies</w:t>
+            </w:r>
+          </w:p>
+        </w:tc>
+        <w:tc>
+          <w:tcPr>
+            <w:tcW w:type="dxa" w:w="5270"/>
+          </w:tcPr>
+          <w:p>
+            <w:pPr>
+              <w:spacing w:after="20" w:before="20"/>
+            </w:pPr>
+            <w:r>
+              <w:rPr>
+                <w:rFonts w:ascii="Calibri" w:hAnsi="Calibri"/>
+                <w:sz w:val="17"/>
+              </w:rPr>
+              <w:t>Agile/Scrum (fundamentals), Waterfall, AS-IS/TO-BE analysis</w:t>
+            </w:r>
+          </w:p>
+        </w:tc>
+      </w:tr>
+    </w:tbl>
     <w:p>
       <w:pPr>
-        <w:spacing w:before="0" w:after="0" w:line="240" w:lineRule="auto"/>
+        <w:spacing w:before="160" w:after="80" w:line="240" w:lineRule="exact"/>
+        <w:pBdr>
+          <w:bottom w:val="single" w:sz="6" w:space="1" w:color="1F4E79"/>
+        </w:pBdr>
       </w:pPr>
       <w:r>
         <w:rPr>
-          <w:rFonts w:ascii="Times New Roman" w:hAnsi="Times New Roman"/>
-          <w:b w:val="0"/>
-          <w:i w:val="0"/>
-          <w:sz w:val="24"/>
+          <w:rFonts w:ascii="Calibri" w:hAnsi="Calibri"/>
+          <w:b/>
+          <w:color w:val="1F4E79"/>
+          <w:sz w:val="21"/>
         </w:rPr>
-        <w:t>Analysis &amp; Modeling: BPMN 2.0, UML (Use Case, State Machine, Activity), ERD (Chen, Crow's Foot)</w:t>
+        <w:t>PROJECTS &amp; PORTFOLIO</w:t>
       </w:r>
     </w:p>
     <w:p>
       <w:pPr>
-        <w:spacing w:before="0" w:after="0" w:line="240" w:lineRule="auto"/>
+        <w:spacing w:after="40" w:before="0" w:line="230" w:lineRule="exact"/>
       </w:pPr>
       <w:r>
         <w:rPr>
-          <w:rFonts w:ascii="Times New Roman" w:hAnsi="Times New Roman"/>
+          <w:rFonts w:ascii="Calibri" w:hAnsi="Calibri"/>
           <w:b w:val="0"/>
-          <w:i w:val="0"/>
-          <w:sz w:val="24"/>
+          <w:sz w:val="18"/>
         </w:rPr>
-        <w:t>Data &amp; SQL: SQL (JOIN, subqueries, CTEs, window functions, aggregation), normalization (1NF–3NF)</w:t>
+        <w:t xml:space="preserve">GitHub: </w:t>
       </w:r>
+      <w:hyperlink r:id="rId9">
+        <w:r>
+          <w:rPr>
+            <w:color w:val="0563C1"/>
+            <w:u w:val="single"/>
+            <w:rFonts w:ascii="Calibri" w:hAnsi="Calibri"/>
+            <w:sz w:val="18"/>
+          </w:rPr>
+          <w:t>github.com/vladislavmiller2000-bit/System-Analysis</w:t>
+        </w:r>
+      </w:hyperlink>
     </w:p>
     <w:p>
       <w:pPr>
-        <w:spacing w:before="0" w:after="0" w:line="240" w:lineRule="auto"/>
+        <w:spacing w:after="40" w:before="120" w:line="230" w:lineRule="exact"/>
       </w:pPr>
       <w:r>
         <w:rPr>
-          <w:rFonts w:ascii="Times New Roman" w:hAnsi="Times New Roman"/>
-          <w:b w:val="0"/>
-          <w:i w:val="0"/>
-          <w:sz w:val="24"/>
-        </w:rPr>
-        <w:t>Tools: Power BI, MS Excel (pivot tables, formulas, charts), Miro, Draw.io, Figma</w:t>
-      </w:r>
-    </w:p>
-    <w:p>
-      <w:pPr>
-        <w:spacing w:before="0" w:after="0" w:line="240" w:lineRule="auto"/>
-      </w:pPr>
-      <w:r>
-        <w:rPr>
-          <w:rFonts w:ascii="Times New Roman" w:hAnsi="Times New Roman"/>
-          <w:b w:val="0"/>
-          <w:i w:val="0"/>
-          <w:sz w:val="24"/>
-        </w:rPr>
-        <w:t>Documentation: requirements gathering &amp; documentation, SRS, data dictionary, Use Case specifications</w:t>
-      </w:r>
-    </w:p>
-    <w:p>
-      <w:pPr>
-        <w:spacing w:before="0" w:after="0" w:line="240" w:lineRule="auto"/>
-      </w:pPr>
-      <w:r>
-        <w:rPr>
-          <w:rFonts w:ascii="Times New Roman" w:hAnsi="Times New Roman"/>
-          <w:b w:val="0"/>
-          <w:i w:val="0"/>
-          <w:sz w:val="24"/>
-        </w:rPr>
-        <w:t>Methodologies: Agile/Scrum (fundamentals), Waterfall, AS-IS/TO-BE analysis</w:t>
-      </w:r>
-    </w:p>
-    <w:p>
-      <w:pPr>
-        <w:spacing w:before="0" w:after="0" w:line="240" w:lineRule="auto"/>
-      </w:pPr>
-      <w:r>
-        <w:rPr>
-          <w:rFonts w:ascii="Times New Roman" w:hAnsi="Times New Roman"/>
+          <w:rFonts w:ascii="Calibri" w:hAnsi="Calibri"/>
           <w:b/>
-          <w:i w:val="0"/>
-          <w:sz w:val="24"/>
-          <w:u w:val="single"/>
-        </w:rPr>
-        <w:t>PROJECTS</w:t>
-      </w:r>
-    </w:p>
-    <w:p>
-      <w:pPr>
-        <w:spacing w:before="0" w:after="0" w:line="240" w:lineRule="auto"/>
-      </w:pPr>
-      <w:r>
-        <w:rPr>
-          <w:rFonts w:ascii="Times New Roman" w:hAnsi="Times New Roman"/>
-          <w:b w:val="0"/>
-          <w:i w:val="0"/>
-          <w:sz w:val="24"/>
-        </w:rPr>
-        <w:t>Portfolio: github.com/vladislavmiller2000-bit/System-Analysis</w:t>
-      </w:r>
-    </w:p>
-    <w:p>
-      <w:pPr>
-        <w:spacing w:before="0" w:after="0" w:line="240" w:lineRule="auto"/>
-      </w:pPr>
-      <w:r>
-        <w:rPr>
-          <w:rFonts w:ascii="Times New Roman" w:hAnsi="Times New Roman"/>
-          <w:b/>
-          <w:i w:val="0"/>
-          <w:sz w:val="24"/>
+          <w:sz w:val="19"/>
         </w:rPr>
         <w:t>Vita Clinic — Medical Clinic Business Process Analysis</w:t>
       </w:r>
@@ -264,93 +443,77 @@
     <w:p>
       <w:pPr>
         <w:pStyle w:val="ListBullet"/>
-        <w:spacing w:before="0" w:after="0" w:line="240" w:lineRule="auto"/>
-        <w:ind w:left="283" w:hanging="142"/>
+        <w:spacing w:after="20" w:before="0" w:line="230" w:lineRule="exact"/>
       </w:pPr>
       <w:r>
         <w:rPr>
-          <w:rFonts w:ascii="Times New Roman" w:hAnsi="Times New Roman"/>
-          <w:b w:val="0"/>
-          <w:i w:val="0"/>
-          <w:sz w:val="24"/>
+          <w:rFonts w:ascii="Calibri" w:hAnsi="Calibri"/>
+          <w:sz w:val="18"/>
         </w:rPr>
-        <w:t>Conducted AS-IS analysis of patient appointment workflow, identified 4 bottlenecks (data duplication, manual routing, missing validation, receptionist dependency) and proposed solutions based on automation best practices.</w:t>
+        <w:t>Conducted AS-IS analysis of patient appointment workflow, identified 4 bottlenecks (data duplication, manual routing, missing validation, receptionist dependency) and proposed solutions based on automation best practices</w:t>
       </w:r>
     </w:p>
     <w:p>
       <w:pPr>
         <w:pStyle w:val="ListBullet"/>
-        <w:spacing w:before="0" w:after="0" w:line="240" w:lineRule="auto"/>
-        <w:ind w:left="283" w:hanging="142"/>
+        <w:spacing w:after="20" w:before="0" w:line="230" w:lineRule="exact"/>
       </w:pPr>
       <w:r>
         <w:rPr>
-          <w:rFonts w:ascii="Times New Roman" w:hAnsi="Times New Roman"/>
-          <w:b w:val="0"/>
-          <w:i w:val="0"/>
-          <w:sz w:val="24"/>
+          <w:rFonts w:ascii="Calibri" w:hAnsi="Calibri"/>
+          <w:sz w:val="18"/>
         </w:rPr>
-        <w:t>Designed TO-BE model with automated scheduling: reduced processing chain from 5 to 2 steps by eliminating manual receptionist stage and accelerating initial data processing.</w:t>
+        <w:t>Designed TO-BE model with automated scheduling — reduced processing chain from 5 to 2 steps by eliminating manual receptionist stage and accelerating initial data processing</w:t>
       </w:r>
     </w:p>
     <w:p>
       <w:pPr>
         <w:pStyle w:val="ListBullet"/>
-        <w:spacing w:before="0" w:after="0" w:line="240" w:lineRule="auto"/>
-        <w:ind w:left="283" w:hanging="142"/>
+        <w:spacing w:after="20" w:before="0" w:line="230" w:lineRule="exact"/>
       </w:pPr>
       <w:r>
         <w:rPr>
-          <w:rFonts w:ascii="Times New Roman" w:hAnsi="Times New Roman"/>
-          <w:b w:val="0"/>
-          <w:i w:val="0"/>
-          <w:sz w:val="24"/>
+          <w:rFonts w:ascii="Calibri" w:hAnsi="Calibri"/>
+          <w:sz w:val="18"/>
         </w:rPr>
-        <w:t>Created BPMN 2.0 diagrams (AS-IS and TO-BE) and UML State Machine for appointment lifecycle.</w:t>
+        <w:t>Created BPMN 2.0 diagrams (AS-IS and TO-BE) and UML State Machine for appointment lifecycle</w:t>
       </w:r>
     </w:p>
     <w:p>
       <w:pPr>
         <w:pStyle w:val="ListBullet"/>
-        <w:spacing w:before="0" w:after="0" w:line="240" w:lineRule="auto"/>
-        <w:ind w:left="283" w:hanging="142"/>
+        <w:spacing w:after="20" w:before="0" w:line="230" w:lineRule="exact"/>
       </w:pPr>
       <w:r>
         <w:rPr>
-          <w:rFonts w:ascii="Times New Roman" w:hAnsi="Times New Roman"/>
-          <w:b w:val="0"/>
-          <w:i w:val="0"/>
-          <w:sz w:val="24"/>
+          <w:rFonts w:ascii="Calibri" w:hAnsi="Calibri"/>
+          <w:sz w:val="18"/>
         </w:rPr>
-        <w:t>Built interactive mobile app prototype (12 screens) in Figma, designed user journey from authorization to appointment confirmation.</w:t>
+        <w:t>Built interactive mobile app prototype (12 screens) in Figma, designed user journey from authorization to appointment confirmation</w:t>
       </w:r>
     </w:p>
     <w:p>
       <w:pPr>
         <w:pStyle w:val="ListBullet"/>
-        <w:spacing w:before="0" w:after="0" w:line="240" w:lineRule="auto"/>
-        <w:ind w:left="283" w:hanging="142"/>
+        <w:spacing w:after="20" w:before="0" w:line="230" w:lineRule="exact"/>
       </w:pPr>
       <w:r>
         <w:rPr>
-          <w:rFonts w:ascii="Times New Roman" w:hAnsi="Times New Roman"/>
-          <w:b w:val="0"/>
-          <w:i w:val="0"/>
-          <w:sz w:val="24"/>
+          <w:rFonts w:ascii="Calibri" w:hAnsi="Calibri"/>
+          <w:sz w:val="18"/>
         </w:rPr>
-        <w:t>Defined 17 functional and 4 non-functional requirements, documented Use Case specification.</w:t>
+        <w:t>Defined 17 functional and 4 non-functional requirements, documented Use Case specification</w:t>
       </w:r>
     </w:p>
     <w:p>
       <w:pPr>
-        <w:spacing w:before="0" w:after="0" w:line="240" w:lineRule="auto"/>
+        <w:spacing w:after="40" w:before="120" w:line="230" w:lineRule="exact"/>
       </w:pPr>
       <w:r>
         <w:rPr>
-          <w:rFonts w:ascii="Times New Roman" w:hAnsi="Times New Roman"/>
+          <w:rFonts w:ascii="Calibri" w:hAnsi="Calibri"/>
           <w:b/>
-          <w:i w:val="0"/>
-          <w:sz w:val="24"/>
+          <w:sz w:val="19"/>
         </w:rPr>
         <w:t>Nakarabine — E-Commerce Database Design</w:t>
       </w:r>
@@ -358,61 +521,51 @@
     <w:p>
       <w:pPr>
         <w:pStyle w:val="ListBullet"/>
-        <w:spacing w:before="0" w:after="0" w:line="240" w:lineRule="auto"/>
-        <w:ind w:left="283" w:hanging="142"/>
+        <w:spacing w:after="20" w:before="0" w:line="230" w:lineRule="exact"/>
       </w:pPr>
       <w:r>
         <w:rPr>
-          <w:rFonts w:ascii="Times New Roman" w:hAnsi="Times New Roman"/>
-          <w:b w:val="0"/>
-          <w:i w:val="0"/>
-          <w:sz w:val="24"/>
+          <w:rFonts w:ascii="Calibri" w:hAnsi="Calibri"/>
+          <w:sz w:val="18"/>
         </w:rPr>
-        <w:t>Designed logical data model (PK, FK, UNIQUE, NOT NULL, CHECK constraints), defined relationship cardinalities and ensured referential integrity.</w:t>
+        <w:t>Designed logical data model (PK, FK, UNIQUE, NOT NULL, CHECK constraints), defined relationship cardinalities and ensured referential integrity</w:t>
       </w:r>
     </w:p>
     <w:p>
       <w:pPr>
         <w:pStyle w:val="ListBullet"/>
-        <w:spacing w:before="0" w:after="0" w:line="240" w:lineRule="auto"/>
-        <w:ind w:left="283" w:hanging="142"/>
+        <w:spacing w:after="20" w:before="0" w:line="230" w:lineRule="exact"/>
       </w:pPr>
       <w:r>
         <w:rPr>
-          <w:rFonts w:ascii="Times New Roman" w:hAnsi="Times New Roman"/>
-          <w:b w:val="0"/>
-          <w:i w:val="0"/>
-          <w:sz w:val="24"/>
+          <w:rFonts w:ascii="Calibri" w:hAnsi="Calibri"/>
+          <w:sz w:val="18"/>
         </w:rPr>
-        <w:t>Built ERD diagrams in Chen and Crow's Foot notations, performed normalization (1NF through 3NF).</w:t>
+        <w:t>Built ERD diagrams in Chen and Crow's Foot notations, performed normalization (1NF through 3NF)</w:t>
       </w:r>
     </w:p>
     <w:p>
       <w:pPr>
         <w:pStyle w:val="ListBullet"/>
-        <w:spacing w:before="0" w:after="0" w:line="240" w:lineRule="auto"/>
-        <w:ind w:left="283" w:hanging="142"/>
+        <w:spacing w:after="20" w:before="0" w:line="230" w:lineRule="exact"/>
       </w:pPr>
       <w:r>
         <w:rPr>
-          <w:rFonts w:ascii="Times New Roman" w:hAnsi="Times New Roman"/>
-          <w:b w:val="0"/>
-          <w:i w:val="0"/>
-          <w:sz w:val="24"/>
+          <w:rFonts w:ascii="Calibri" w:hAnsi="Calibri"/>
+          <w:sz w:val="18"/>
         </w:rPr>
-        <w:t>Developed data dictionary and terminology glossary: attribute descriptions, data types, business rules, allowed values.</w:t>
+        <w:t>Developed data dictionary and terminology glossary for team alignment: attribute descriptions, data types, business rules, allowed values</w:t>
       </w:r>
     </w:p>
     <w:p>
       <w:pPr>
-        <w:spacing w:before="0" w:after="0" w:line="240" w:lineRule="auto"/>
+        <w:spacing w:after="40" w:before="120" w:line="230" w:lineRule="exact"/>
       </w:pPr>
       <w:r>
         <w:rPr>
-          <w:rFonts w:ascii="Times New Roman" w:hAnsi="Times New Roman"/>
+          <w:rFonts w:ascii="Calibri" w:hAnsi="Calibri"/>
           <w:b/>
-          <w:i w:val="0"/>
-          <w:sz w:val="24"/>
+          <w:sz w:val="19"/>
         </w:rPr>
         <w:t>Restaurant Sales Analysis — SQL Project</w:t>
       </w:r>
@@ -420,90 +573,81 @@
     <w:p>
       <w:pPr>
         <w:pStyle w:val="ListBullet"/>
-        <w:spacing w:before="0" w:after="0" w:line="240" w:lineRule="auto"/>
-        <w:ind w:left="283" w:hanging="142"/>
+        <w:spacing w:after="20" w:before="0" w:line="230" w:lineRule="exact"/>
       </w:pPr>
       <w:r>
         <w:rPr>
-          <w:rFonts w:ascii="Times New Roman" w:hAnsi="Times New Roman"/>
-          <w:b w:val="0"/>
-          <w:i w:val="0"/>
-          <w:sz w:val="24"/>
+          <w:rFonts w:ascii="Calibri" w:hAnsi="Calibri"/>
+          <w:sz w:val="18"/>
         </w:rPr>
-        <w:t>Designed relational schema (DDL: CREATE TABLE, PRIMARY KEY, FOREIGN KEY, constraints) and populated with test data (50 orders, 20 menu items).</w:t>
+        <w:t>Designed relational schema (DDL: CREATE TABLE, PRIMARY KEY, FOREIGN KEY, constraints) and populated with test data (50 orders, 20 menu items)</w:t>
       </w:r>
     </w:p>
     <w:p>
       <w:pPr>
         <w:pStyle w:val="ListBullet"/>
-        <w:spacing w:before="0" w:after="0" w:line="240" w:lineRule="auto"/>
-        <w:ind w:left="283" w:hanging="142"/>
+        <w:spacing w:after="20" w:before="0" w:line="230" w:lineRule="exact"/>
       </w:pPr>
       <w:r>
         <w:rPr>
-          <w:rFonts w:ascii="Times New Roman" w:hAnsi="Times New Roman"/>
-          <w:b w:val="0"/>
-          <w:i w:val="0"/>
-          <w:sz w:val="24"/>
+          <w:rFonts w:ascii="Calibri" w:hAnsi="Calibri"/>
+          <w:sz w:val="18"/>
         </w:rPr>
-        <w:t>Wrote 20+ analytical queries: revenue by period, profit margins, menu ABC analysis.</w:t>
+        <w:t>Wrote 20+ analytical queries: revenue by period, profit margins, menu ABC analysis</w:t>
       </w:r>
     </w:p>
     <w:p>
       <w:pPr>
         <w:pStyle w:val="ListBullet"/>
-        <w:spacing w:before="0" w:after="0" w:line="240" w:lineRule="auto"/>
-        <w:ind w:left="283" w:hanging="142"/>
+        <w:spacing w:after="20" w:before="0" w:line="230" w:lineRule="exact"/>
       </w:pPr>
       <w:r>
         <w:rPr>
-          <w:rFonts w:ascii="Times New Roman" w:hAnsi="Times New Roman"/>
-          <w:b w:val="0"/>
-          <w:i w:val="0"/>
-          <w:sz w:val="24"/>
+          <w:rFonts w:ascii="Calibri" w:hAnsi="Calibri"/>
+          <w:sz w:val="18"/>
         </w:rPr>
-        <w:t>Applied JOIN, CTEs, window functions (LAG, RANK, ROW_NUMBER), subqueries, CASE expressions.</w:t>
+        <w:t>Applied JOIN, CTEs, window functions (LAG, RANK, ROW_NUMBER), subqueries, CASE expressions</w:t>
       </w:r>
     </w:p>
     <w:p>
       <w:pPr>
-        <w:spacing w:before="0" w:after="0" w:line="240" w:lineRule="auto"/>
+        <w:spacing w:before="160" w:after="80" w:line="240" w:lineRule="exact"/>
+        <w:pBdr>
+          <w:bottom w:val="single" w:sz="6" w:space="1" w:color="1F4E79"/>
+        </w:pBdr>
       </w:pPr>
       <w:r>
         <w:rPr>
-          <w:rFonts w:ascii="Times New Roman" w:hAnsi="Times New Roman"/>
+          <w:rFonts w:ascii="Calibri" w:hAnsi="Calibri"/>
           <w:b/>
-          <w:i w:val="0"/>
-          <w:sz w:val="24"/>
-          <w:u w:val="single"/>
+          <w:color w:val="1F4E79"/>
+          <w:sz w:val="21"/>
         </w:rPr>
         <w:t>WORK EXPERIENCE</w:t>
       </w:r>
     </w:p>
     <w:p>
       <w:pPr>
-        <w:spacing w:before="0" w:after="0" w:line="240" w:lineRule="auto"/>
+        <w:spacing w:after="40" w:before="120" w:line="230" w:lineRule="exact"/>
       </w:pPr>
       <w:r>
         <w:rPr>
-          <w:rFonts w:ascii="Times New Roman" w:hAnsi="Times New Roman"/>
+          <w:rFonts w:ascii="Calibri" w:hAnsi="Calibri"/>
           <w:b/>
-          <w:i w:val="0"/>
-          <w:sz w:val="24"/>
+          <w:sz w:val="19"/>
         </w:rPr>
         <w:t>KFC Cinema City — Rishon LeTsiyon, Israel</w:t>
       </w:r>
     </w:p>
     <w:p>
       <w:pPr>
-        <w:spacing w:before="0" w:after="0" w:line="240" w:lineRule="auto"/>
+        <w:spacing w:after="40" w:before="0" w:line="230" w:lineRule="exact"/>
       </w:pPr>
       <w:r>
         <w:rPr>
-          <w:rFonts w:ascii="Times New Roman" w:hAnsi="Times New Roman"/>
+          <w:rFonts w:ascii="Calibri" w:hAnsi="Calibri"/>
           <w:b w:val="0"/>
-          <w:i/>
-          <w:sz w:val="24"/>
+          <w:sz w:val="18"/>
         </w:rPr>
         <w:t>Deputy Director | April 2024 – April 2025</w:t>
       </w:r>
@@ -511,61 +655,51 @@
     <w:p>
       <w:pPr>
         <w:pStyle w:val="ListBullet"/>
-        <w:spacing w:before="0" w:after="0" w:line="240" w:lineRule="auto"/>
-        <w:ind w:left="283" w:hanging="142"/>
+        <w:spacing w:after="20" w:before="0" w:line="230" w:lineRule="exact"/>
       </w:pPr>
       <w:r>
         <w:rPr>
-          <w:rFonts w:ascii="Times New Roman" w:hAnsi="Times New Roman"/>
-          <w:b w:val="0"/>
-          <w:i w:val="0"/>
-          <w:sz w:val="24"/>
+          <w:rFonts w:ascii="Calibri" w:hAnsi="Calibri"/>
+          <w:sz w:val="18"/>
         </w:rPr>
-        <w:t>Built daily analytics system for the restaurant (900+ receipts/day): tracked revenue, average check, hourly load, output; identified lunch-peak underperformance, reallocated resources, contributing to 10% profit increase.</w:t>
+        <w:t>Built daily analytics system for the restaurant (900+ receipts/day): tracked revenue, average check, hourly load, output — identified lunch-peak underperformance, reallocated resources, contributing to 10% profit increase</w:t>
       </w:r>
     </w:p>
     <w:p>
       <w:pPr>
         <w:pStyle w:val="ListBullet"/>
-        <w:spacing w:before="0" w:after="0" w:line="240" w:lineRule="auto"/>
-        <w:ind w:left="283" w:hanging="142"/>
+        <w:spacing w:after="20" w:before="0" w:line="230" w:lineRule="exact"/>
       </w:pPr>
       <w:r>
         <w:rPr>
-          <w:rFonts w:ascii="Times New Roman" w:hAnsi="Times New Roman"/>
-          <w:b w:val="0"/>
-          <w:i w:val="0"/>
-          <w:sz w:val="24"/>
+          <w:rFonts w:ascii="Calibri" w:hAnsi="Calibri"/>
+          <w:sz w:val="18"/>
         </w:rPr>
-        <w:t>Implemented data-driven inventory management: analyzed consumption by category, adjusted procurement volumes; reduced supply costs by 15%.</w:t>
+        <w:t>Implemented data-driven inventory management: analyzed consumption by category, adjusted procurement volumes — reduced supply costs by 15%</w:t>
       </w:r>
     </w:p>
     <w:p>
       <w:pPr>
         <w:pStyle w:val="ListBullet"/>
-        <w:spacing w:before="0" w:after="0" w:line="240" w:lineRule="auto"/>
-        <w:ind w:left="283" w:hanging="142"/>
+        <w:spacing w:after="20" w:before="0" w:line="230" w:lineRule="exact"/>
       </w:pPr>
       <w:r>
         <w:rPr>
-          <w:rFonts w:ascii="Times New Roman" w:hAnsi="Times New Roman"/>
-          <w:b w:val="0"/>
-          <w:i w:val="0"/>
-          <w:sz w:val="24"/>
+          <w:rFonts w:ascii="Calibri" w:hAnsi="Calibri"/>
+          <w:sz w:val="18"/>
         </w:rPr>
-        <w:t>Coordinated a team of 20+ employees, standardized operational procedures and developed quality control checklists.</w:t>
+        <w:t>Coordinated a team of 20+ employees, standardized operational procedures and developed quality control checklists</w:t>
       </w:r>
     </w:p>
     <w:p>
       <w:pPr>
-        <w:spacing w:before="0" w:after="0" w:line="240" w:lineRule="auto"/>
+        <w:spacing w:after="40" w:before="0" w:line="230" w:lineRule="exact"/>
       </w:pPr>
       <w:r>
         <w:rPr>
-          <w:rFonts w:ascii="Times New Roman" w:hAnsi="Times New Roman"/>
+          <w:rFonts w:ascii="Calibri" w:hAnsi="Calibri"/>
           <w:b w:val="0"/>
-          <w:i/>
-          <w:sz w:val="24"/>
+          <w:sz w:val="18"/>
         </w:rPr>
         <w:t>Shift Manager | November 2023 – April 2024</w:t>
       </w:r>
@@ -573,43 +707,38 @@
     <w:p>
       <w:pPr>
         <w:pStyle w:val="ListBullet"/>
-        <w:spacing w:before="0" w:after="0" w:line="240" w:lineRule="auto"/>
-        <w:ind w:left="283" w:hanging="142"/>
+        <w:spacing w:after="20" w:before="0" w:line="230" w:lineRule="exact"/>
       </w:pPr>
       <w:r>
         <w:rPr>
-          <w:rFonts w:ascii="Times New Roman" w:hAnsi="Times New Roman"/>
-          <w:b w:val="0"/>
-          <w:i w:val="0"/>
-          <w:sz w:val="24"/>
+          <w:rFonts w:ascii="Calibri" w:hAnsi="Calibri"/>
+          <w:sz w:val="18"/>
         </w:rPr>
-        <w:t>Managed shift operations (15 employees): SLA control for service speed, quality metrics monitoring, real-time incident resolution.</w:t>
+        <w:t>Managed shift operations (15 employees): SLA control for service speed, quality metrics monitoring, real-time incident resolution</w:t>
       </w:r>
     </w:p>
     <w:p>
       <w:pPr>
-        <w:spacing w:before="0" w:after="0" w:line="240" w:lineRule="auto"/>
+        <w:spacing w:after="40" w:before="120" w:line="230" w:lineRule="exact"/>
       </w:pPr>
       <w:r>
         <w:rPr>
-          <w:rFonts w:ascii="Times New Roman" w:hAnsi="Times New Roman"/>
+          <w:rFonts w:ascii="Calibri" w:hAnsi="Calibri"/>
           <w:b/>
-          <w:i w:val="0"/>
-          <w:sz w:val="24"/>
+          <w:sz w:val="19"/>
         </w:rPr>
         <w:t>Intern — Burger King Corporation, Moscow</w:t>
       </w:r>
     </w:p>
     <w:p>
       <w:pPr>
-        <w:spacing w:before="0" w:after="0" w:line="240" w:lineRule="auto"/>
+        <w:spacing w:after="40" w:before="0" w:line="230" w:lineRule="exact"/>
       </w:pPr>
       <w:r>
         <w:rPr>
-          <w:rFonts w:ascii="Times New Roman" w:hAnsi="Times New Roman"/>
+          <w:rFonts w:ascii="Calibri" w:hAnsi="Calibri"/>
           <w:b w:val="0"/>
-          <w:i/>
-          <w:sz w:val="24"/>
+          <w:sz w:val="18"/>
         </w:rPr>
         <w:t>Marketing Research Department | Summer 2022</w:t>
       </w:r>
@@ -617,61 +746,51 @@
     <w:p>
       <w:pPr>
         <w:pStyle w:val="ListBullet"/>
-        <w:spacing w:before="0" w:after="0" w:line="240" w:lineRule="auto"/>
-        <w:ind w:left="283" w:hanging="142"/>
+        <w:spacing w:after="20" w:before="0" w:line="230" w:lineRule="exact"/>
       </w:pPr>
       <w:r>
         <w:rPr>
-          <w:rFonts w:ascii="Times New Roman" w:hAnsi="Times New Roman"/>
-          <w:b w:val="0"/>
-          <w:i w:val="0"/>
-          <w:sz w:val="24"/>
+          <w:rFonts w:ascii="Calibri" w:hAnsi="Calibri"/>
+          <w:sz w:val="18"/>
         </w:rPr>
-        <w:t>Built sales analytics dashboards for 50+ restaurants in Excel (pivot tables, INDEX/MATCH, conditional formatting).</w:t>
+        <w:t>Built sales analytics dashboards for 50+ restaurants in Excel (pivot tables, INDEX/MATCH, conditional formatting)</w:t>
       </w:r>
     </w:p>
     <w:p>
       <w:pPr>
         <w:pStyle w:val="ListBullet"/>
-        <w:spacing w:before="0" w:after="0" w:line="240" w:lineRule="auto"/>
-        <w:ind w:left="283" w:hanging="142"/>
+        <w:spacing w:after="20" w:before="0" w:line="230" w:lineRule="exact"/>
       </w:pPr>
       <w:r>
         <w:rPr>
-          <w:rFonts w:ascii="Times New Roman" w:hAnsi="Times New Roman"/>
-          <w:b w:val="0"/>
-          <w:i w:val="0"/>
-          <w:sz w:val="24"/>
+          <w:rFonts w:ascii="Calibri" w:hAnsi="Calibri"/>
+          <w:sz w:val="18"/>
         </w:rPr>
-        <w:t>Automated categorization of 10,000+ receipts and compiled restaurant revenue rankings; identified 5 growth opportunities for regional managers.</w:t>
+        <w:t>Automated categorization of 10,000+ receipts and compiled restaurant revenue rankings — identified 5 growth opportunities for regional managers</w:t>
       </w:r>
     </w:p>
     <w:p>
       <w:pPr>
         <w:pStyle w:val="ListBullet"/>
-        <w:spacing w:before="0" w:after="0" w:line="240" w:lineRule="auto"/>
-        <w:ind w:left="283" w:hanging="142"/>
+        <w:spacing w:after="20" w:before="0" w:line="230" w:lineRule="exact"/>
       </w:pPr>
       <w:r>
         <w:rPr>
-          <w:rFonts w:ascii="Times New Roman" w:hAnsi="Times New Roman"/>
-          <w:b w:val="0"/>
-          <w:i w:val="0"/>
-          <w:sz w:val="24"/>
+          <w:rFonts w:ascii="Calibri" w:hAnsi="Calibri"/>
+          <w:sz w:val="18"/>
         </w:rPr>
-        <w:t>Prepared KPI visualizations (conversion, average check, trends) for weekly management presentations.</w:t>
+        <w:t>Prepared KPI visualizations (conversion, average check, trends) for weekly management presentations</w:t>
       </w:r>
     </w:p>
     <w:p>
       <w:pPr>
-        <w:spacing w:before="0" w:after="0" w:line="240" w:lineRule="auto"/>
+        <w:spacing w:after="40" w:before="0" w:line="230" w:lineRule="exact"/>
       </w:pPr>
       <w:r>
         <w:rPr>
-          <w:rFonts w:ascii="Times New Roman" w:hAnsi="Times New Roman"/>
+          <w:rFonts w:ascii="Calibri" w:hAnsi="Calibri"/>
           <w:b w:val="0"/>
-          <w:i/>
-          <w:sz w:val="24"/>
+          <w:sz w:val="18"/>
         </w:rPr>
         <w:t>Business Analytics Department | Summer 2019</w:t>
       </w:r>
@@ -679,59 +798,51 @@
     <w:p>
       <w:pPr>
         <w:pStyle w:val="ListBullet"/>
-        <w:spacing w:before="0" w:after="0" w:line="240" w:lineRule="auto"/>
-        <w:ind w:left="283" w:hanging="142"/>
+        <w:spacing w:after="20" w:before="0" w:line="230" w:lineRule="exact"/>
       </w:pPr>
       <w:r>
         <w:rPr>
-          <w:rFonts w:ascii="Times New Roman" w:hAnsi="Times New Roman"/>
-          <w:b w:val="0"/>
-          <w:i w:val="0"/>
-          <w:sz w:val="24"/>
+          <w:rFonts w:ascii="Calibri" w:hAnsi="Calibri"/>
+          <w:sz w:val="18"/>
         </w:rPr>
-        <w:t>Collected and structured financial data from multiple sources, prepared pivot tables for quarterly reports.</w:t>
+        <w:t>Collected and structured financial data from multiple sources, prepared pivot tables for quarterly reports</w:t>
       </w:r>
     </w:p>
     <w:p>
       <w:pPr>
         <w:pStyle w:val="ListBullet"/>
-        <w:spacing w:before="0" w:after="0" w:line="240" w:lineRule="auto"/>
-        <w:ind w:left="283" w:hanging="142"/>
+        <w:spacing w:after="20" w:before="0" w:line="230" w:lineRule="exact"/>
       </w:pPr>
       <w:r>
         <w:rPr>
-          <w:rFonts w:ascii="Times New Roman" w:hAnsi="Times New Roman"/>
-          <w:b w:val="0"/>
-          <w:i w:val="0"/>
-          <w:sz w:val="24"/>
+          <w:rFonts w:ascii="Calibri" w:hAnsi="Calibri"/>
+          <w:sz w:val="18"/>
         </w:rPr>
-        <w:t>Assisted in building sales forecast models based on historical data.</w:t>
+        <w:t>Assisted in building sales forecast models based on historical data</w:t>
       </w:r>
     </w:p>
     <w:p>
       <w:pPr>
-        <w:spacing w:before="0" w:after="0" w:line="240" w:lineRule="auto"/>
+        <w:spacing w:after="40" w:before="120" w:line="230" w:lineRule="exact"/>
       </w:pPr>
       <w:r>
         <w:rPr>
-          <w:rFonts w:ascii="Times New Roman" w:hAnsi="Times New Roman"/>
+          <w:rFonts w:ascii="Calibri" w:hAnsi="Calibri"/>
           <w:b/>
-          <w:i w:val="0"/>
-          <w:sz w:val="24"/>
+          <w:sz w:val="19"/>
         </w:rPr>
         <w:t>Intern — Knight Frank, Moscow</w:t>
       </w:r>
     </w:p>
     <w:p>
       <w:pPr>
-        <w:spacing w:before="0" w:after="0" w:line="240" w:lineRule="auto"/>
+        <w:spacing w:after="40" w:before="0" w:line="230" w:lineRule="exact"/>
       </w:pPr>
       <w:r>
         <w:rPr>
-          <w:rFonts w:ascii="Times New Roman" w:hAnsi="Times New Roman"/>
+          <w:rFonts w:ascii="Calibri" w:hAnsi="Calibri"/>
           <w:b w:val="0"/>
-          <w:i/>
-          <w:sz w:val="24"/>
+          <w:sz w:val="18"/>
         </w:rPr>
         <w:t>Residential Real Estate Marketing Department | Spring 2022</w:t>
       </w:r>
@@ -739,167 +850,148 @@
     <w:p>
       <w:pPr>
         <w:pStyle w:val="ListBullet"/>
-        <w:spacing w:before="0" w:after="0" w:line="240" w:lineRule="auto"/>
-        <w:ind w:left="283" w:hanging="142"/>
+        <w:spacing w:after="20" w:before="0" w:line="230" w:lineRule="exact"/>
       </w:pPr>
       <w:r>
         <w:rPr>
-          <w:rFonts w:ascii="Times New Roman" w:hAnsi="Times New Roman"/>
-          <w:b w:val="0"/>
-          <w:i w:val="0"/>
-          <w:sz w:val="24"/>
+          <w:rFonts w:ascii="Calibri" w:hAnsi="Calibri"/>
+          <w:sz w:val="18"/>
         </w:rPr>
-        <w:t>Conducted competitive analysis of 30+ premium residential properties: price per m², location, infrastructure; prepared comparative report for investment decision-making.</w:t>
+        <w:t>Conducted competitive analysis of 30+ premium residential properties: price per m², location, infrastructure — prepared comparative report for investment decision-making</w:t>
       </w:r>
     </w:p>
     <w:p>
       <w:pPr>
         <w:pStyle w:val="ListBullet"/>
-        <w:spacing w:before="0" w:after="0" w:line="240" w:lineRule="auto"/>
-        <w:ind w:left="283" w:hanging="142"/>
+        <w:spacing w:after="20" w:before="0" w:line="230" w:lineRule="exact"/>
       </w:pPr>
       <w:r>
         <w:rPr>
-          <w:rFonts w:ascii="Times New Roman" w:hAnsi="Times New Roman"/>
-          <w:b w:val="0"/>
-          <w:i w:val="0"/>
-          <w:sz w:val="24"/>
+          <w:rFonts w:ascii="Calibri" w:hAnsi="Calibri"/>
+          <w:sz w:val="18"/>
         </w:rPr>
-        <w:t>Participated in property valuation using comparative approach, prepared analytical briefs for the international office.</w:t>
+        <w:t>Participated in property valuation using comparative approach, prepared analytical briefs for the international office</w:t>
       </w:r>
     </w:p>
     <w:p>
       <w:pPr>
-        <w:spacing w:before="0" w:after="0" w:line="240" w:lineRule="auto"/>
+        <w:spacing w:before="160" w:after="80" w:line="240" w:lineRule="exact"/>
+        <w:pBdr>
+          <w:bottom w:val="single" w:sz="6" w:space="1" w:color="1F4E79"/>
+        </w:pBdr>
       </w:pPr>
       <w:r>
         <w:rPr>
-          <w:rFonts w:ascii="Times New Roman" w:hAnsi="Times New Roman"/>
+          <w:rFonts w:ascii="Calibri" w:hAnsi="Calibri"/>
           <w:b/>
-          <w:i w:val="0"/>
-          <w:sz w:val="24"/>
-          <w:u w:val="single"/>
+          <w:color w:val="1F4E79"/>
+          <w:sz w:val="21"/>
         </w:rPr>
         <w:t>EDUCATION</w:t>
       </w:r>
     </w:p>
     <w:p>
       <w:pPr>
-        <w:spacing w:before="0" w:after="0" w:line="240" w:lineRule="auto"/>
+        <w:spacing w:after="20" w:before="0" w:line="230" w:lineRule="exact"/>
       </w:pPr>
       <w:r>
         <w:rPr>
-          <w:rFonts w:ascii="Times New Roman" w:hAnsi="Times New Roman"/>
+          <w:rFonts w:ascii="Calibri" w:hAnsi="Calibri"/>
           <w:b/>
-          <w:i w:val="0"/>
-          <w:sz w:val="24"/>
+          <w:sz w:val="18"/>
         </w:rPr>
-        <w:t>Touro University New York | 2018 – 2023</w:t>
+        <w:t>Financial University under the Government of the Russian Federation, Moscow | 2018 – 2022</w:t>
       </w:r>
     </w:p>
     <w:p>
       <w:pPr>
-        <w:spacing w:before="0" w:after="0" w:line="240" w:lineRule="auto"/>
+        <w:spacing w:after="40" w:before="0" w:line="230" w:lineRule="exact"/>
       </w:pPr>
       <w:r>
         <w:rPr>
-          <w:rFonts w:ascii="Times New Roman" w:hAnsi="Times New Roman"/>
+          <w:rFonts w:ascii="Calibri" w:hAnsi="Calibri"/>
           <w:b w:val="0"/>
-          <w:i w:val="0"/>
-          <w:sz w:val="24"/>
+          <w:sz w:val="18"/>
         </w:rPr>
-        <w:t>Bachelor of Science, Business Management</w:t>
+        <w:t>Bachelor of Economics, International Finance</w:t>
       </w:r>
     </w:p>
     <w:p>
       <w:pPr>
-        <w:spacing w:before="0" w:after="0" w:line="240" w:lineRule="auto"/>
+        <w:spacing w:before="160" w:after="80" w:line="240" w:lineRule="exact"/>
+        <w:pBdr>
+          <w:bottom w:val="single" w:sz="6" w:space="1" w:color="1F4E79"/>
+        </w:pBdr>
       </w:pPr>
       <w:r>
         <w:rPr>
-          <w:rFonts w:ascii="Times New Roman" w:hAnsi="Times New Roman"/>
-          <w:b w:val="0"/>
-          <w:i w:val="0"/>
-          <w:sz w:val="24"/>
-        </w:rPr>
-        <w:t>Senior Honors Project: Case Study of Virgin Galactic within the Aerospace Industry</w:t>
-      </w:r>
-    </w:p>
-    <w:p>
-      <w:pPr>
-        <w:spacing w:before="0" w:after="0" w:line="240" w:lineRule="auto"/>
-      </w:pPr>
-      <w:r>
-        <w:rPr>
-          <w:rFonts w:ascii="Times New Roman" w:hAnsi="Times New Roman"/>
+          <w:rFonts w:ascii="Calibri" w:hAnsi="Calibri"/>
           <w:b/>
-          <w:i w:val="0"/>
-          <w:sz w:val="24"/>
-          <w:u w:val="single"/>
+          <w:color w:val="1F4E79"/>
+          <w:sz w:val="21"/>
         </w:rPr>
         <w:t>PROFESSIONAL DEVELOPMENT</w:t>
       </w:r>
     </w:p>
     <w:p>
       <w:pPr>
-        <w:spacing w:before="0" w:after="0" w:line="240" w:lineRule="auto"/>
+        <w:spacing w:after="20" w:before="0" w:line="230" w:lineRule="exact"/>
       </w:pPr>
       <w:r>
         <w:rPr>
-          <w:rFonts w:ascii="Times New Roman" w:hAnsi="Times New Roman"/>
-          <w:b w:val="0"/>
-          <w:i/>
-          <w:sz w:val="24"/>
+          <w:rFonts w:ascii="Calibri" w:hAnsi="Calibri"/>
+          <w:b/>
+          <w:sz w:val="18"/>
         </w:rPr>
         <w:t>Yandex Practicum — Systems Analyst | 2025 – 2026</w:t>
       </w:r>
     </w:p>
     <w:p>
       <w:pPr>
-        <w:spacing w:before="0" w:after="0" w:line="240" w:lineRule="auto"/>
+        <w:spacing w:after="40" w:before="0" w:line="230" w:lineRule="exact"/>
       </w:pPr>
       <w:r>
         <w:rPr>
-          <w:rFonts w:ascii="Times New Roman" w:hAnsi="Times New Roman"/>
+          <w:rFonts w:ascii="Calibri" w:hAnsi="Calibri"/>
           <w:b w:val="0"/>
-          <w:i w:val="0"/>
-          <w:sz w:val="24"/>
+          <w:sz w:val="18"/>
         </w:rPr>
         <w:t>Requirements analysis, UML, BPMN, data modeling, SQL, Power BI, collaboration with development and QA teams.</w:t>
       </w:r>
     </w:p>
     <w:p>
       <w:pPr>
-        <w:spacing w:before="0" w:after="0" w:line="240" w:lineRule="auto"/>
+        <w:spacing w:before="160" w:after="80" w:line="240" w:lineRule="exact"/>
+        <w:pBdr>
+          <w:bottom w:val="single" w:sz="6" w:space="1" w:color="1F4E79"/>
+        </w:pBdr>
       </w:pPr>
       <w:r>
         <w:rPr>
-          <w:rFonts w:ascii="Times New Roman" w:hAnsi="Times New Roman"/>
+          <w:rFonts w:ascii="Calibri" w:hAnsi="Calibri"/>
           <w:b/>
-          <w:i w:val="0"/>
-          <w:sz w:val="24"/>
-          <w:u w:val="single"/>
+          <w:color w:val="1F4E79"/>
+          <w:sz w:val="21"/>
         </w:rPr>
         <w:t>LANGUAGES</w:t>
       </w:r>
     </w:p>
     <w:p>
       <w:pPr>
-        <w:spacing w:before="0" w:after="0" w:line="240" w:lineRule="auto"/>
+        <w:spacing w:after="40" w:before="0" w:line="230" w:lineRule="exact"/>
       </w:pPr>
       <w:r>
         <w:rPr>
-          <w:rFonts w:ascii="Times New Roman" w:hAnsi="Times New Roman"/>
+          <w:rFonts w:ascii="Calibri" w:hAnsi="Calibri"/>
           <w:b w:val="0"/>
-          <w:i w:val="0"/>
-          <w:sz w:val="24"/>
+          <w:sz w:val="18"/>
         </w:rPr>
         <w:t>Russian (native) | English (fluent) | Spanish (basic) | Hebrew (basic)</w:t>
       </w:r>
     </w:p>
     <w:sectPr>
       <w:pgSz w:w="12240" w:h="15840"/>
-      <w:pgMar w:top="680" w:right="850" w:bottom="680" w:left="850" w:header="720" w:footer="720" w:gutter="0"/>
+      <w:pgMar w:top="680" w:right="850" w:bottom="567" w:left="850" w:header="720" w:footer="720" w:gutter="0"/>
       <w:cols w:space="720"/>
       <w:docGrid w:linePitch="360"/>
     </w:sectPr>
@@ -1270,9 +1362,12 @@
     <w:name w:val="Normal"/>
     <w:qFormat/>
     <w:rsid w:val="00FC693F"/>
+    <w:pPr>
+      <w:spacing w:after="0" w:before="0"/>
+    </w:pPr>
     <w:rPr>
-      <w:rFonts w:ascii="Times New Roman" w:hAnsi="Times New Roman"/>
-      <w:sz w:val="24"/>
+      <w:rFonts w:ascii="Calibri" w:hAnsi="Calibri"/>
+      <w:sz w:val="18"/>
     </w:rPr>
   </w:style>
   <w:style w:type="paragraph" w:styleId="Header">

</xml_diff>

<commit_message>
Fix EN Word resume: Touro University education, Senior Honors Project, italic role lines
</commit_message>
<xml_diff>
--- a/Resume/Resume_Vladislav_Orekhov-Miller_EN.docx
+++ b/Resume/Resume_Vladislav_Orekhov-Miller_EN.docx
@@ -647,6 +647,7 @@
         <w:rPr>
           <w:rFonts w:ascii="Calibri" w:hAnsi="Calibri"/>
           <w:b w:val="0"/>
+          <w:i/>
           <w:sz w:val="18"/>
         </w:rPr>
         <w:t>Deputy Director | April 2024 – April 2025</w:t>
@@ -699,6 +700,7 @@
         <w:rPr>
           <w:rFonts w:ascii="Calibri" w:hAnsi="Calibri"/>
           <w:b w:val="0"/>
+          <w:i/>
           <w:sz w:val="18"/>
         </w:rPr>
         <w:t>Shift Manager | November 2023 – April 2024</w:t>
@@ -738,6 +740,7 @@
         <w:rPr>
           <w:rFonts w:ascii="Calibri" w:hAnsi="Calibri"/>
           <w:b w:val="0"/>
+          <w:i/>
           <w:sz w:val="18"/>
         </w:rPr>
         <w:t>Marketing Research Department | Summer 2022</w:t>
@@ -790,6 +793,7 @@
         <w:rPr>
           <w:rFonts w:ascii="Calibri" w:hAnsi="Calibri"/>
           <w:b w:val="0"/>
+          <w:i/>
           <w:sz w:val="18"/>
         </w:rPr>
         <w:t>Business Analytics Department | Summer 2019</w:t>
@@ -842,6 +846,7 @@
         <w:rPr>
           <w:rFonts w:ascii="Calibri" w:hAnsi="Calibri"/>
           <w:b w:val="0"/>
+          <w:i/>
           <w:sz w:val="18"/>
         </w:rPr>
         <w:t>Residential Real Estate Marketing Department | Spring 2022</w:t>
@@ -900,7 +905,7 @@
           <w:b/>
           <w:sz w:val="18"/>
         </w:rPr>
-        <w:t>Financial University under the Government of the Russian Federation, Moscow | 2018 – 2022</w:t>
+        <w:t>Touro University New York | 2018 – 2023</w:t>
       </w:r>
     </w:p>
     <w:p>
@@ -913,7 +918,20 @@
           <w:b w:val="0"/>
           <w:sz w:val="18"/>
         </w:rPr>
-        <w:t>Bachelor of Economics, International Finance</w:t>
+        <w:t>Bachelor of Science, Business Management</w:t>
+      </w:r>
+    </w:p>
+    <w:p>
+      <w:pPr>
+        <w:spacing w:after="40" w:before="0" w:line="230" w:lineRule="exact"/>
+      </w:pPr>
+      <w:r>
+        <w:rPr>
+          <w:rFonts w:ascii="Calibri" w:hAnsi="Calibri"/>
+          <w:b w:val="0"/>
+          <w:sz w:val="18"/>
+        </w:rPr>
+        <w:t xml:space="preserve">Senior Honors Project: Case Study of Virgin Galactic within the Aerospace Industry</w:t>
       </w:r>
     </w:p>
     <w:p>

</xml_diff>